<commit_message>
Aligne la source sur la version de l'offre envoyée au client le 15 septembre 2026
Le PDF transmis au client avait été retouché dans Word après génération.
La source est réalignée pour que le dépôt reflète ce que le client a reçu :
contact renseigné, référence OTF-EGUITRA-2026-36 (la page de garde du PDF
portait encore -01), forfait annuel à 9 000 000 GNF pour les deux
propositions, validité à 30 jours dans la synthèse (60 ailleurs), section
Équipe et synthèse financière retirées, bloc de signature complété.

Le PDF envoyé est conservé dans docs/offre/envoyes/ comme référence, et
package.json fixe la dépendance docx.

Co-Authored-By: Claude Fable 5.1 <noreply@anthropic.com>
Claude-Session: https://claude.ai/code/session_015yYNiyH8hjzTq5nD22kCrg
</commit_message>
<xml_diff>
--- a/docs/offre/Offre_technique_financiere_EGUITRA.docx
+++ b/docs/offre/Offre_technique_financiere_EGUITRA.docx
@@ -140,7 +140,7 @@
           <w:sz w:val="20"/>
           <w:szCs w:val="20"/>
         </w:rPr>
-        <w:t xml:space="preserve">Référence OTF-EGUITRA-2026-01</w:t>
+        <w:t xml:space="preserve">Référence OTF-EGUITRA-2026-36</w:t>
       </w:r>
     </w:p>
     <w:p>
@@ -168,7 +168,7 @@
           <w:sz w:val="20"/>
           <w:szCs w:val="20"/>
         </w:rPr>
-        <w:t xml:space="preserve">E-VOLUTION XP, Transformation Numérique. Contact : [Téléphone et e-mail E-VOLUTION XP]</w:t>
+        <w:t xml:space="preserve">E-VOLUTION XP, Transformation Numérique. Contact : +224 628 86 22 55 / emkouyate@e-volutionxp.com</w:t>
       </w:r>
     </w:p>
     <w:p>
@@ -862,7 +862,7 @@
                 <w:sz w:val="19"/>
                 <w:szCs w:val="19"/>
               </w:rPr>
-              <w:t xml:space="preserve">18 000 000 GNF HT par an</w:t>
+              <w:t xml:space="preserve">9 000 000 GNF HT par an</w:t>
             </w:r>
           </w:p>
         </w:tc>
@@ -895,7 +895,7 @@
                 <w:sz w:val="19"/>
                 <w:szCs w:val="19"/>
               </w:rPr>
-              <w:t xml:space="preserve">15 000 000 GNF HT par an</w:t>
+              <w:t xml:space="preserve">9 000 000 GNF HT par an</w:t>
             </w:r>
           </w:p>
         </w:tc>
@@ -1129,7 +1129,7 @@
           <w:sz w:val="21"/>
           <w:szCs w:val="21"/>
         </w:rPr>
-        <w:t xml:space="preserve">Notre recommandation est la proposition 1. Pour 12 000 000 GNF de plus, le groupe obtient un noyau comptable utilisé par des dizaines de milliers d'entreprises, le multi-sociétés, le rapprochement bancaire, les circuits d'approbation à plusieurs niveaux et une évolutivité sans nouveau développement. Les deux propositions sont détaillées et chiffrées ; le choix appartient à la direction.</w:t>
+        <w:t xml:space="preserve">Notre recommandation est la proposition 1. Pour 12 000 000 GNF de plus, le groupe obtient un noyau ERP utilisé par des dizaines de milliers d'entreprises, le multi-sociétés, le rapprochement bancaire, les circuits d'approbation à plusieurs niveaux et une évolutivité sans nouveau développement. Les deux propositions sont détaillées et chiffrées ; le choix appartient à la direction.</w:t>
       </w:r>
     </w:p>
     <w:p>
@@ -1142,7 +1142,7 @@
           <w:sz w:val="22"/>
           <w:szCs w:val="22"/>
         </w:rPr>
-        <w:t xml:space="preserve">Validité de l'offre : 60 jours à compter du 15 septembre 2026. Tous les montants sont exprimés en francs guinéens, hors taxes.</w:t>
+        <w:t xml:space="preserve">Validité de l'offre : 30 jours à compter du 15 septembre 2026. Tous les montants sont exprimés en francs guinéens.</w:t>
       </w:r>
     </w:p>
     <w:p>
@@ -8697,7 +8697,7 @@
                 <w:sz w:val="19"/>
                 <w:szCs w:val="19"/>
               </w:rPr>
-              <w:t xml:space="preserve">18 000 000 GNF HT</w:t>
+              <w:t xml:space="preserve">9 000 000 GNF HT</w:t>
             </w:r>
           </w:p>
         </w:tc>
@@ -8731,7 +8731,7 @@
                 <w:sz w:val="19"/>
                 <w:szCs w:val="19"/>
               </w:rPr>
-              <w:t xml:space="preserve">15 000 000 GNF HT</w:t>
+              <w:t xml:space="preserve">9 000 000 GNF HT</w:t>
             </w:r>
           </w:p>
         </w:tc>
@@ -11158,465 +11158,7 @@
           <w:sz w:val="26"/>
           <w:szCs w:val="26"/>
         </w:rPr>
-        <w:t xml:space="preserve">7.5 Équipe E-VOLUTION XP</w:t>
-      </w:r>
-    </w:p>
-    <w:tbl>
-      <w:tblPr>
-        <w:tblW w:type="dxa" w:w="9638"/>
-        <w:tblBorders>
-          <w:top w:val="single" w:color="auto" w:sz="4"/>
-          <w:left w:val="single" w:color="auto" w:sz="4"/>
-          <w:bottom w:val="single" w:color="auto" w:sz="4"/>
-          <w:right w:val="single" w:color="auto" w:sz="4"/>
-          <w:insideH w:val="single" w:color="auto" w:sz="4"/>
-          <w:insideV w:val="single" w:color="auto" w:sz="4"/>
-        </w:tblBorders>
-      </w:tblPr>
-      <w:tblGrid>
-        <w:gridCol w:w="3200"/>
-        <w:gridCol w:w="6438"/>
-      </w:tblGrid>
-      <w:tr>
-        <w:trPr>
-          <w:tblHeader/>
-        </w:trPr>
-        <w:tc>
-          <w:tcPr>
-            <w:tcW w:type="dxa" w:w="3200"/>
-            <w:tcBorders>
-              <w:top w:val="single" w:color="C9CFD8" w:sz="4"/>
-              <w:left w:val="single" w:color="C9CFD8" w:sz="4"/>
-              <w:bottom w:val="single" w:color="C9CFD8" w:sz="4"/>
-              <w:right w:val="single" w:color="C9CFD8" w:sz="4"/>
-            </w:tcBorders>
-            <w:shd w:fill="1C1E6B" w:color="auto" w:val="clear"/>
-            <w:tcMar>
-              <w:top w:type="dxa" w:w="60"/>
-              <w:left w:type="dxa" w:w="100"/>
-              <w:bottom w:type="dxa" w:w="60"/>
-              <w:right w:type="dxa" w:w="100"/>
-            </w:tcMar>
-            <w:vAlign w:val="center"/>
-          </w:tcPr>
-          <w:p>
-            <w:pPr>
-              <w:spacing w:after="0"/>
-            </w:pPr>
-            <w:r>
-              <w:rPr>
-                <w:rFonts w:ascii="Calibri" w:cs="Calibri" w:eastAsia="Calibri" w:hAnsi="Calibri"/>
-                <w:b/>
-                <w:bCs/>
-                <w:color w:val="FFFFFF"/>
-                <w:sz w:val="19"/>
-                <w:szCs w:val="19"/>
-              </w:rPr>
-              <w:t xml:space="preserve">Rôle</w:t>
-            </w:r>
-          </w:p>
-        </w:tc>
-        <w:tc>
-          <w:tcPr>
-            <w:tcW w:type="dxa" w:w="6438"/>
-            <w:tcBorders>
-              <w:top w:val="single" w:color="C9CFD8" w:sz="4"/>
-              <w:left w:val="single" w:color="C9CFD8" w:sz="4"/>
-              <w:bottom w:val="single" w:color="C9CFD8" w:sz="4"/>
-              <w:right w:val="single" w:color="C9CFD8" w:sz="4"/>
-            </w:tcBorders>
-            <w:shd w:fill="1C1E6B" w:color="auto" w:val="clear"/>
-            <w:tcMar>
-              <w:top w:type="dxa" w:w="60"/>
-              <w:left w:type="dxa" w:w="100"/>
-              <w:bottom w:type="dxa" w:w="60"/>
-              <w:right w:type="dxa" w:w="100"/>
-            </w:tcMar>
-            <w:vAlign w:val="center"/>
-          </w:tcPr>
-          <w:p>
-            <w:pPr>
-              <w:spacing w:after="0"/>
-            </w:pPr>
-            <w:r>
-              <w:rPr>
-                <w:rFonts w:ascii="Calibri" w:cs="Calibri" w:eastAsia="Calibri" w:hAnsi="Calibri"/>
-                <w:b/>
-                <w:bCs/>
-                <w:color w:val="FFFFFF"/>
-                <w:sz w:val="19"/>
-                <w:szCs w:val="19"/>
-              </w:rPr>
-              <w:t xml:space="preserve">Mission</w:t>
-            </w:r>
-          </w:p>
-        </w:tc>
-      </w:tr>
-      <w:tr>
-        <w:tc>
-          <w:tcPr>
-            <w:tcW w:type="dxa" w:w="3200"/>
-            <w:tcBorders>
-              <w:top w:val="single" w:color="C9CFD8" w:sz="4"/>
-              <w:left w:val="single" w:color="C9CFD8" w:sz="4"/>
-              <w:bottom w:val="single" w:color="C9CFD8" w:sz="4"/>
-              <w:right w:val="single" w:color="C9CFD8" w:sz="4"/>
-            </w:tcBorders>
-            <w:tcMar>
-              <w:top w:type="dxa" w:w="60"/>
-              <w:left w:type="dxa" w:w="100"/>
-              <w:bottom w:type="dxa" w:w="60"/>
-              <w:right w:type="dxa" w:w="100"/>
-            </w:tcMar>
-            <w:vAlign w:val="center"/>
-          </w:tcPr>
-          <w:p>
-            <w:pPr>
-              <w:spacing w:after="0"/>
-            </w:pPr>
-            <w:r>
-              <w:rPr>
-                <w:rFonts w:ascii="Calibri" w:cs="Calibri" w:eastAsia="Calibri" w:hAnsi="Calibri"/>
-                <w:b w:val="false"/>
-                <w:bCs w:val="false"/>
-                <w:sz w:val="19"/>
-                <w:szCs w:val="19"/>
-              </w:rPr>
-              <w:t xml:space="preserve">Directeur de projet et architecte</w:t>
-            </w:r>
-          </w:p>
-        </w:tc>
-        <w:tc>
-          <w:tcPr>
-            <w:tcW w:type="dxa" w:w="6438"/>
-            <w:tcBorders>
-              <w:top w:val="single" w:color="C9CFD8" w:sz="4"/>
-              <w:left w:val="single" w:color="C9CFD8" w:sz="4"/>
-              <w:bottom w:val="single" w:color="C9CFD8" w:sz="4"/>
-              <w:right w:val="single" w:color="C9CFD8" w:sz="4"/>
-            </w:tcBorders>
-            <w:tcMar>
-              <w:top w:type="dxa" w:w="60"/>
-              <w:left w:type="dxa" w:w="100"/>
-              <w:bottom w:type="dxa" w:w="60"/>
-              <w:right w:type="dxa" w:w="100"/>
-            </w:tcMar>
-            <w:vAlign w:val="center"/>
-          </w:tcPr>
-          <w:p>
-            <w:pPr>
-              <w:spacing w:after="0"/>
-            </w:pPr>
-            <w:r>
-              <w:rPr>
-                <w:rFonts w:ascii="Calibri" w:cs="Calibri" w:eastAsia="Calibri" w:hAnsi="Calibri"/>
-                <w:b w:val="false"/>
-                <w:bCs w:val="false"/>
-                <w:sz w:val="19"/>
-                <w:szCs w:val="19"/>
-              </w:rPr>
-              <w:t xml:space="preserve">Interlocuteur unique, conception, arbitrages, qualité des livraisons.</w:t>
-            </w:r>
-          </w:p>
-        </w:tc>
-      </w:tr>
-      <w:tr>
-        <w:tc>
-          <w:tcPr>
-            <w:tcW w:type="dxa" w:w="3200"/>
-            <w:tcBorders>
-              <w:top w:val="single" w:color="C9CFD8" w:sz="4"/>
-              <w:left w:val="single" w:color="C9CFD8" w:sz="4"/>
-              <w:bottom w:val="single" w:color="C9CFD8" w:sz="4"/>
-              <w:right w:val="single" w:color="C9CFD8" w:sz="4"/>
-            </w:tcBorders>
-            <w:shd w:fill="F2F4F7" w:color="auto" w:val="clear"/>
-            <w:tcMar>
-              <w:top w:type="dxa" w:w="60"/>
-              <w:left w:type="dxa" w:w="100"/>
-              <w:bottom w:type="dxa" w:w="60"/>
-              <w:right w:type="dxa" w:w="100"/>
-            </w:tcMar>
-            <w:vAlign w:val="center"/>
-          </w:tcPr>
-          <w:p>
-            <w:pPr>
-              <w:spacing w:after="0"/>
-            </w:pPr>
-            <w:r>
-              <w:rPr>
-                <w:rFonts w:ascii="Calibri" w:cs="Calibri" w:eastAsia="Calibri" w:hAnsi="Calibri"/>
-                <w:b w:val="false"/>
-                <w:bCs w:val="false"/>
-                <w:sz w:val="19"/>
-                <w:szCs w:val="19"/>
-              </w:rPr>
-              <w:t xml:space="preserve">Consultant fonctionnel finance</w:t>
-            </w:r>
-          </w:p>
-        </w:tc>
-        <w:tc>
-          <w:tcPr>
-            <w:tcW w:type="dxa" w:w="6438"/>
-            <w:tcBorders>
-              <w:top w:val="single" w:color="C9CFD8" w:sz="4"/>
-              <w:left w:val="single" w:color="C9CFD8" w:sz="4"/>
-              <w:bottom w:val="single" w:color="C9CFD8" w:sz="4"/>
-              <w:right w:val="single" w:color="C9CFD8" w:sz="4"/>
-            </w:tcBorders>
-            <w:shd w:fill="F2F4F7" w:color="auto" w:val="clear"/>
-            <w:tcMar>
-              <w:top w:type="dxa" w:w="60"/>
-              <w:left w:type="dxa" w:w="100"/>
-              <w:bottom w:type="dxa" w:w="60"/>
-              <w:right w:type="dxa" w:w="100"/>
-            </w:tcMar>
-            <w:vAlign w:val="center"/>
-          </w:tcPr>
-          <w:p>
-            <w:pPr>
-              <w:spacing w:after="0"/>
-            </w:pPr>
-            <w:r>
-              <w:rPr>
-                <w:rFonts w:ascii="Calibri" w:cs="Calibri" w:eastAsia="Calibri" w:hAnsi="Calibri"/>
-                <w:b w:val="false"/>
-                <w:bCs w:val="false"/>
-                <w:sz w:val="19"/>
-                <w:szCs w:val="19"/>
-              </w:rPr>
-              <w:t xml:space="preserve">Paramétrage SYSCOHADA, analytique, états financiers, reprise des données, formation.</w:t>
-            </w:r>
-          </w:p>
-        </w:tc>
-      </w:tr>
-      <w:tr>
-        <w:tc>
-          <w:tcPr>
-            <w:tcW w:type="dxa" w:w="3200"/>
-            <w:tcBorders>
-              <w:top w:val="single" w:color="C9CFD8" w:sz="4"/>
-              <w:left w:val="single" w:color="C9CFD8" w:sz="4"/>
-              <w:bottom w:val="single" w:color="C9CFD8" w:sz="4"/>
-              <w:right w:val="single" w:color="C9CFD8" w:sz="4"/>
-            </w:tcBorders>
-            <w:tcMar>
-              <w:top w:type="dxa" w:w="60"/>
-              <w:left w:type="dxa" w:w="100"/>
-              <w:bottom w:type="dxa" w:w="60"/>
-              <w:right w:type="dxa" w:w="100"/>
-            </w:tcMar>
-            <w:vAlign w:val="center"/>
-          </w:tcPr>
-          <w:p>
-            <w:pPr>
-              <w:spacing w:after="0"/>
-            </w:pPr>
-            <w:r>
-              <w:rPr>
-                <w:rFonts w:ascii="Calibri" w:cs="Calibri" w:eastAsia="Calibri" w:hAnsi="Calibri"/>
-                <w:b w:val="false"/>
-                <w:bCs w:val="false"/>
-                <w:sz w:val="19"/>
-                <w:szCs w:val="19"/>
-              </w:rPr>
-              <w:t xml:space="preserve">Développeurs</w:t>
-            </w:r>
-          </w:p>
-        </w:tc>
-        <w:tc>
-          <w:tcPr>
-            <w:tcW w:type="dxa" w:w="6438"/>
-            <w:tcBorders>
-              <w:top w:val="single" w:color="C9CFD8" w:sz="4"/>
-              <w:left w:val="single" w:color="C9CFD8" w:sz="4"/>
-              <w:bottom w:val="single" w:color="C9CFD8" w:sz="4"/>
-              <w:right w:val="single" w:color="C9CFD8" w:sz="4"/>
-            </w:tcBorders>
-            <w:tcMar>
-              <w:top w:type="dxa" w:w="60"/>
-              <w:left w:type="dxa" w:w="100"/>
-              <w:bottom w:type="dxa" w:w="60"/>
-              <w:right w:type="dxa" w:w="100"/>
-            </w:tcMar>
-            <w:vAlign w:val="center"/>
-          </w:tcPr>
-          <w:p>
-            <w:pPr>
-              <w:spacing w:after="0"/>
-            </w:pPr>
-            <w:r>
-              <w:rPr>
-                <w:rFonts w:ascii="Calibri" w:cs="Calibri" w:eastAsia="Calibri" w:hAnsi="Calibri"/>
-                <w:b w:val="false"/>
-                <w:bCs w:val="false"/>
-                <w:sz w:val="19"/>
-                <w:szCs w:val="19"/>
-              </w:rPr>
-              <w:t xml:space="preserve">Noyau et API dans la proposition 1, moteur comptable dans la proposition 2 ; applications EGUITRA Finance et AxisPro Suite, application mobile, portail.</w:t>
-            </w:r>
-          </w:p>
-        </w:tc>
-      </w:tr>
-      <w:tr>
-        <w:tc>
-          <w:tcPr>
-            <w:tcW w:type="dxa" w:w="3200"/>
-            <w:tcBorders>
-              <w:top w:val="single" w:color="C9CFD8" w:sz="4"/>
-              <w:left w:val="single" w:color="C9CFD8" w:sz="4"/>
-              <w:bottom w:val="single" w:color="C9CFD8" w:sz="4"/>
-              <w:right w:val="single" w:color="C9CFD8" w:sz="4"/>
-            </w:tcBorders>
-            <w:shd w:fill="F2F4F7" w:color="auto" w:val="clear"/>
-            <w:tcMar>
-              <w:top w:type="dxa" w:w="60"/>
-              <w:left w:type="dxa" w:w="100"/>
-              <w:bottom w:type="dxa" w:w="60"/>
-              <w:right w:type="dxa" w:w="100"/>
-            </w:tcMar>
-            <w:vAlign w:val="center"/>
-          </w:tcPr>
-          <w:p>
-            <w:pPr>
-              <w:spacing w:after="0"/>
-            </w:pPr>
-            <w:r>
-              <w:rPr>
-                <w:rFonts w:ascii="Calibri" w:cs="Calibri" w:eastAsia="Calibri" w:hAnsi="Calibri"/>
-                <w:b w:val="false"/>
-                <w:bCs w:val="false"/>
-                <w:sz w:val="19"/>
-                <w:szCs w:val="19"/>
-              </w:rPr>
-              <w:t xml:space="preserve">Ingénieur exploitation</w:t>
-            </w:r>
-          </w:p>
-        </w:tc>
-        <w:tc>
-          <w:tcPr>
-            <w:tcW w:type="dxa" w:w="6438"/>
-            <w:tcBorders>
-              <w:top w:val="single" w:color="C9CFD8" w:sz="4"/>
-              <w:left w:val="single" w:color="C9CFD8" w:sz="4"/>
-              <w:bottom w:val="single" w:color="C9CFD8" w:sz="4"/>
-              <w:right w:val="single" w:color="C9CFD8" w:sz="4"/>
-            </w:tcBorders>
-            <w:shd w:fill="F2F4F7" w:color="auto" w:val="clear"/>
-            <w:tcMar>
-              <w:top w:type="dxa" w:w="60"/>
-              <w:left w:type="dxa" w:w="100"/>
-              <w:bottom w:type="dxa" w:w="60"/>
-              <w:right w:type="dxa" w:w="100"/>
-            </w:tcMar>
-            <w:vAlign w:val="center"/>
-          </w:tcPr>
-          <w:p>
-            <w:pPr>
-              <w:spacing w:after="0"/>
-            </w:pPr>
-            <w:r>
-              <w:rPr>
-                <w:rFonts w:ascii="Calibri" w:cs="Calibri" w:eastAsia="Calibri" w:hAnsi="Calibri"/>
-                <w:b w:val="false"/>
-                <w:bCs w:val="false"/>
-                <w:sz w:val="19"/>
-                <w:szCs w:val="19"/>
-              </w:rPr>
-              <w:t xml:space="preserve">VPS, sécurité, sauvegardes, supervision, support.</w:t>
-            </w:r>
-          </w:p>
-        </w:tc>
-      </w:tr>
-      <w:tr>
-        <w:tc>
-          <w:tcPr>
-            <w:tcW w:type="dxa" w:w="3200"/>
-            <w:tcBorders>
-              <w:top w:val="single" w:color="C9CFD8" w:sz="4"/>
-              <w:left w:val="single" w:color="C9CFD8" w:sz="4"/>
-              <w:bottom w:val="single" w:color="C9CFD8" w:sz="4"/>
-              <w:right w:val="single" w:color="C9CFD8" w:sz="4"/>
-            </w:tcBorders>
-            <w:tcMar>
-              <w:top w:type="dxa" w:w="60"/>
-              <w:left w:type="dxa" w:w="100"/>
-              <w:bottom w:type="dxa" w:w="60"/>
-              <w:right w:type="dxa" w:w="100"/>
-            </w:tcMar>
-            <w:vAlign w:val="center"/>
-          </w:tcPr>
-          <w:p>
-            <w:pPr>
-              <w:spacing w:after="0"/>
-            </w:pPr>
-            <w:r>
-              <w:rPr>
-                <w:rFonts w:ascii="Calibri" w:cs="Calibri" w:eastAsia="Calibri" w:hAnsi="Calibri"/>
-                <w:b w:val="false"/>
-                <w:bCs w:val="false"/>
-                <w:sz w:val="19"/>
-                <w:szCs w:val="19"/>
-              </w:rPr>
-              <w:t xml:space="preserve">Expert-comptable partenaire</w:t>
-            </w:r>
-          </w:p>
-        </w:tc>
-        <w:tc>
-          <w:tcPr>
-            <w:tcW w:type="dxa" w:w="6438"/>
-            <w:tcBorders>
-              <w:top w:val="single" w:color="C9CFD8" w:sz="4"/>
-              <w:left w:val="single" w:color="C9CFD8" w:sz="4"/>
-              <w:bottom w:val="single" w:color="C9CFD8" w:sz="4"/>
-              <w:right w:val="single" w:color="C9CFD8" w:sz="4"/>
-            </w:tcBorders>
-            <w:tcMar>
-              <w:top w:type="dxa" w:w="60"/>
-              <w:left w:type="dxa" w:w="100"/>
-              <w:bottom w:type="dxa" w:w="60"/>
-              <w:right w:type="dxa" w:w="100"/>
-            </w:tcMar>
-            <w:vAlign w:val="center"/>
-          </w:tcPr>
-          <w:p>
-            <w:pPr>
-              <w:spacing w:after="0"/>
-            </w:pPr>
-            <w:r>
-              <w:rPr>
-                <w:rFonts w:ascii="Calibri" w:cs="Calibri" w:eastAsia="Calibri" w:hAnsi="Calibri"/>
-                <w:b w:val="false"/>
-                <w:bCs w:val="false"/>
-                <w:sz w:val="19"/>
-                <w:szCs w:val="19"/>
-              </w:rPr>
-              <w:t xml:space="preserve">Validation du plan de comptes, des états financiers et des déclarations fiscales guinéennes.</w:t>
-            </w:r>
-          </w:p>
-        </w:tc>
-      </w:tr>
-    </w:tbl>
-    <w:p>
-      <w:pPr>
-        <w:spacing w:after="160"/>
-      </w:pPr>
-    </w:p>
-    <w:p>
-      <w:pPr>
-        <w:pStyle w:val="Heading2"/>
-        <w:spacing w:after="120" w:before="280"/>
-      </w:pPr>
-      <w:r>
-        <w:rPr>
-          <w:rFonts w:ascii="Calibri" w:cs="Calibri" w:eastAsia="Calibri" w:hAnsi="Calibri"/>
-          <w:b/>
-          <w:bCs/>
-          <w:color w:val="1C1E6B"/>
-          <w:sz w:val="26"/>
-          <w:szCs w:val="26"/>
-        </w:rPr>
-        <w:t xml:space="preserve">7.6 Prérequis côté client</w:t>
+        <w:t xml:space="preserve">7.5 Prérequis côté client</w:t>
       </w:r>
     </w:p>
     <w:p>
@@ -14275,7 +13817,7 @@
                 <w:sz w:val="19"/>
                 <w:szCs w:val="19"/>
               </w:rPr>
-              <w:t xml:space="preserve">18 000 000 GNF HT, facturé par semestre d'avance</w:t>
+              <w:t xml:space="preserve">9 000 000 GNF HT, facturé par semestre d'avance</w:t>
             </w:r>
           </w:p>
         </w:tc>
@@ -14345,7 +13887,7 @@
                 <w:sz w:val="19"/>
                 <w:szCs w:val="19"/>
               </w:rPr>
-              <w:t xml:space="preserve">15 000 000 GNF HT, facturé par semestre d'avance</w:t>
+              <w:t xml:space="preserve">9 000 000 GNF HT, facturé par semestre d'avance</w:t>
             </w:r>
           </w:p>
         </w:tc>
@@ -14958,450 +14500,62 @@
           <w:sz w:val="26"/>
           <w:szCs w:val="26"/>
         </w:rPr>
-        <w:t xml:space="preserve">8.5 Synthèse financière</w:t>
+        <w:t xml:space="preserve">8.5 Conditions de paiement</w:t>
       </w:r>
     </w:p>
-    <w:tbl>
-      <w:tblPr>
-        <w:tblW w:type="dxa" w:w="9638"/>
-        <w:tblBorders>
-          <w:top w:val="single" w:color="auto" w:sz="4"/>
-          <w:left w:val="single" w:color="auto" w:sz="4"/>
-          <w:bottom w:val="single" w:color="auto" w:sz="4"/>
-          <w:right w:val="single" w:color="auto" w:sz="4"/>
-          <w:insideH w:val="single" w:color="auto" w:sz="4"/>
-          <w:insideV w:val="single" w:color="auto" w:sz="4"/>
-        </w:tblBorders>
-      </w:tblPr>
-      <w:tblGrid>
-        <w:gridCol w:w="3838"/>
-        <w:gridCol w:w="2900"/>
-        <w:gridCol w:w="2900"/>
-      </w:tblGrid>
-      <w:tr>
-        <w:trPr>
-          <w:tblHeader/>
-        </w:trPr>
-        <w:tc>
-          <w:tcPr>
-            <w:tcW w:type="dxa" w:w="3838"/>
-            <w:tcBorders>
-              <w:top w:val="single" w:color="C9CFD8" w:sz="4"/>
-              <w:left w:val="single" w:color="C9CFD8" w:sz="4"/>
-              <w:bottom w:val="single" w:color="C9CFD8" w:sz="4"/>
-              <w:right w:val="single" w:color="C9CFD8" w:sz="4"/>
-            </w:tcBorders>
-            <w:shd w:fill="1C1E6B" w:color="auto" w:val="clear"/>
-            <w:tcMar>
-              <w:top w:type="dxa" w:w="60"/>
-              <w:left w:type="dxa" w:w="100"/>
-              <w:bottom w:type="dxa" w:w="60"/>
-              <w:right w:type="dxa" w:w="100"/>
-            </w:tcMar>
-            <w:vAlign w:val="center"/>
-          </w:tcPr>
-          <w:p>
-            <w:pPr>
-              <w:spacing w:after="0"/>
-            </w:pPr>
-            <w:r>
-              <w:rPr>
-                <w:rFonts w:ascii="Calibri" w:cs="Calibri" w:eastAsia="Calibri" w:hAnsi="Calibri"/>
-                <w:b/>
-                <w:bCs/>
-                <w:color w:val="FFFFFF"/>
-                <w:sz w:val="19"/>
-                <w:szCs w:val="19"/>
-              </w:rPr>
-              <w:t xml:space="preserve"/>
-            </w:r>
-          </w:p>
-        </w:tc>
-        <w:tc>
-          <w:tcPr>
-            <w:tcW w:type="dxa" w:w="2900"/>
-            <w:tcBorders>
-              <w:top w:val="single" w:color="C9CFD8" w:sz="4"/>
-              <w:left w:val="single" w:color="C9CFD8" w:sz="4"/>
-              <w:bottom w:val="single" w:color="C9CFD8" w:sz="4"/>
-              <w:right w:val="single" w:color="C9CFD8" w:sz="4"/>
-            </w:tcBorders>
-            <w:shd w:fill="1C1E6B" w:color="auto" w:val="clear"/>
-            <w:tcMar>
-              <w:top w:type="dxa" w:w="60"/>
-              <w:left w:type="dxa" w:w="100"/>
-              <w:bottom w:type="dxa" w:w="60"/>
-              <w:right w:type="dxa" w:w="100"/>
-            </w:tcMar>
-            <w:vAlign w:val="center"/>
-          </w:tcPr>
-          <w:p>
-            <w:pPr>
-              <w:spacing w:after="0"/>
-            </w:pPr>
-            <w:r>
-              <w:rPr>
-                <w:rFonts w:ascii="Calibri" w:cs="Calibri" w:eastAsia="Calibri" w:hAnsi="Calibri"/>
-                <w:b/>
-                <w:bCs/>
-                <w:color w:val="FFFFFF"/>
-                <w:sz w:val="19"/>
-                <w:szCs w:val="19"/>
-              </w:rPr>
-              <w:t xml:space="preserve">Proposition 1</w:t>
-            </w:r>
-          </w:p>
-        </w:tc>
-        <w:tc>
-          <w:tcPr>
-            <w:tcW w:type="dxa" w:w="2900"/>
-            <w:tcBorders>
-              <w:top w:val="single" w:color="C9CFD8" w:sz="4"/>
-              <w:left w:val="single" w:color="C9CFD8" w:sz="4"/>
-              <w:bottom w:val="single" w:color="C9CFD8" w:sz="4"/>
-              <w:right w:val="single" w:color="C9CFD8" w:sz="4"/>
-            </w:tcBorders>
-            <w:shd w:fill="1C1E6B" w:color="auto" w:val="clear"/>
-            <w:tcMar>
-              <w:top w:type="dxa" w:w="60"/>
-              <w:left w:type="dxa" w:w="100"/>
-              <w:bottom w:type="dxa" w:w="60"/>
-              <w:right w:type="dxa" w:w="100"/>
-            </w:tcMar>
-            <w:vAlign w:val="center"/>
-          </w:tcPr>
-          <w:p>
-            <w:pPr>
-              <w:spacing w:after="0"/>
-            </w:pPr>
-            <w:r>
-              <w:rPr>
-                <w:rFonts w:ascii="Calibri" w:cs="Calibri" w:eastAsia="Calibri" w:hAnsi="Calibri"/>
-                <w:b/>
-                <w:bCs/>
-                <w:color w:val="FFFFFF"/>
-                <w:sz w:val="19"/>
-                <w:szCs w:val="19"/>
-              </w:rPr>
-              <w:t xml:space="preserve">Proposition 2</w:t>
-            </w:r>
-          </w:p>
-        </w:tc>
-      </w:tr>
-      <w:tr>
-        <w:tc>
-          <w:tcPr>
-            <w:tcW w:type="dxa" w:w="3838"/>
-            <w:tcBorders>
-              <w:top w:val="single" w:color="C9CFD8" w:sz="4"/>
-              <w:left w:val="single" w:color="C9CFD8" w:sz="4"/>
-              <w:bottom w:val="single" w:color="C9CFD8" w:sz="4"/>
-              <w:right w:val="single" w:color="C9CFD8" w:sz="4"/>
-            </w:tcBorders>
-            <w:shd w:fill="E6F4F4" w:color="auto" w:val="clear"/>
-            <w:tcMar>
-              <w:top w:type="dxa" w:w="60"/>
-              <w:left w:type="dxa" w:w="100"/>
-              <w:bottom w:type="dxa" w:w="60"/>
-              <w:right w:type="dxa" w:w="100"/>
-            </w:tcMar>
-            <w:vAlign w:val="center"/>
-          </w:tcPr>
-          <w:p>
-            <w:pPr>
-              <w:spacing w:after="0"/>
-            </w:pPr>
-            <w:r>
-              <w:rPr>
-                <w:rFonts w:ascii="Calibri" w:cs="Calibri" w:eastAsia="Calibri" w:hAnsi="Calibri"/>
-                <w:b/>
-                <w:bCs/>
-                <w:sz w:val="19"/>
-                <w:szCs w:val="19"/>
-              </w:rPr>
-              <w:t xml:space="preserve">Réalisation et hébergement, première année</w:t>
-            </w:r>
-          </w:p>
-        </w:tc>
-        <w:tc>
-          <w:tcPr>
-            <w:tcW w:type="dxa" w:w="2900"/>
-            <w:tcBorders>
-              <w:top w:val="single" w:color="C9CFD8" w:sz="4"/>
-              <w:left w:val="single" w:color="C9CFD8" w:sz="4"/>
-              <w:bottom w:val="single" w:color="C9CFD8" w:sz="4"/>
-              <w:right w:val="single" w:color="C9CFD8" w:sz="4"/>
-            </w:tcBorders>
-            <w:shd w:fill="E6F4F4" w:color="auto" w:val="clear"/>
-            <w:tcMar>
-              <w:top w:type="dxa" w:w="60"/>
-              <w:left w:type="dxa" w:w="100"/>
-              <w:bottom w:type="dxa" w:w="60"/>
-              <w:right w:type="dxa" w:w="100"/>
-            </w:tcMar>
-            <w:vAlign w:val="center"/>
-          </w:tcPr>
-          <w:p>
-            <w:pPr>
-              <w:spacing w:after="0"/>
-            </w:pPr>
-            <w:r>
-              <w:rPr>
-                <w:rFonts w:ascii="Calibri" w:cs="Calibri" w:eastAsia="Calibri" w:hAnsi="Calibri"/>
-                <w:b/>
-                <w:bCs/>
-                <w:sz w:val="19"/>
-                <w:szCs w:val="19"/>
-              </w:rPr>
-              <w:t xml:space="preserve">92 000 000 GNF HT</w:t>
-            </w:r>
-          </w:p>
-        </w:tc>
-        <w:tc>
-          <w:tcPr>
-            <w:tcW w:type="dxa" w:w="2900"/>
-            <w:tcBorders>
-              <w:top w:val="single" w:color="C9CFD8" w:sz="4"/>
-              <w:left w:val="single" w:color="C9CFD8" w:sz="4"/>
-              <w:bottom w:val="single" w:color="C9CFD8" w:sz="4"/>
-              <w:right w:val="single" w:color="C9CFD8" w:sz="4"/>
-            </w:tcBorders>
-            <w:shd w:fill="E6F4F4" w:color="auto" w:val="clear"/>
-            <w:tcMar>
-              <w:top w:type="dxa" w:w="60"/>
-              <w:left w:type="dxa" w:w="100"/>
-              <w:bottom w:type="dxa" w:w="60"/>
-              <w:right w:type="dxa" w:w="100"/>
-            </w:tcMar>
-            <w:vAlign w:val="center"/>
-          </w:tcPr>
-          <w:p>
-            <w:pPr>
-              <w:spacing w:after="0"/>
-            </w:pPr>
-            <w:r>
-              <w:rPr>
-                <w:rFonts w:ascii="Calibri" w:cs="Calibri" w:eastAsia="Calibri" w:hAnsi="Calibri"/>
-                <w:b/>
-                <w:bCs/>
-                <w:sz w:val="19"/>
-                <w:szCs w:val="19"/>
-              </w:rPr>
-              <w:t xml:space="preserve">80 000 000 GNF HT</w:t>
-            </w:r>
-          </w:p>
-        </w:tc>
-      </w:tr>
-      <w:tr>
-        <w:tc>
-          <w:tcPr>
-            <w:tcW w:type="dxa" w:w="3838"/>
-            <w:tcBorders>
-              <w:top w:val="single" w:color="C9CFD8" w:sz="4"/>
-              <w:left w:val="single" w:color="C9CFD8" w:sz="4"/>
-              <w:bottom w:val="single" w:color="C9CFD8" w:sz="4"/>
-              <w:right w:val="single" w:color="C9CFD8" w:sz="4"/>
-            </w:tcBorders>
-            <w:shd w:fill="F2F4F7" w:color="auto" w:val="clear"/>
-            <w:tcMar>
-              <w:top w:type="dxa" w:w="60"/>
-              <w:left w:type="dxa" w:w="100"/>
-              <w:bottom w:type="dxa" w:w="60"/>
-              <w:right w:type="dxa" w:w="100"/>
-            </w:tcMar>
-            <w:vAlign w:val="center"/>
-          </w:tcPr>
-          <w:p>
-            <w:pPr>
-              <w:spacing w:after="0"/>
-            </w:pPr>
-            <w:r>
-              <w:rPr>
-                <w:rFonts w:ascii="Calibri" w:cs="Calibri" w:eastAsia="Calibri" w:hAnsi="Calibri"/>
-                <w:b w:val="false"/>
-                <w:bCs w:val="false"/>
-                <w:sz w:val="19"/>
-                <w:szCs w:val="19"/>
-              </w:rPr>
-              <w:t xml:space="preserve">Hébergement, maintenance et support, par an à partir de la deuxième année</w:t>
-            </w:r>
-          </w:p>
-        </w:tc>
-        <w:tc>
-          <w:tcPr>
-            <w:tcW w:type="dxa" w:w="2900"/>
-            <w:tcBorders>
-              <w:top w:val="single" w:color="C9CFD8" w:sz="4"/>
-              <w:left w:val="single" w:color="C9CFD8" w:sz="4"/>
-              <w:bottom w:val="single" w:color="C9CFD8" w:sz="4"/>
-              <w:right w:val="single" w:color="C9CFD8" w:sz="4"/>
-            </w:tcBorders>
-            <w:shd w:fill="F2F4F7" w:color="auto" w:val="clear"/>
-            <w:tcMar>
-              <w:top w:type="dxa" w:w="60"/>
-              <w:left w:type="dxa" w:w="100"/>
-              <w:bottom w:type="dxa" w:w="60"/>
-              <w:right w:type="dxa" w:w="100"/>
-            </w:tcMar>
-            <w:vAlign w:val="center"/>
-          </w:tcPr>
-          <w:p>
-            <w:pPr>
-              <w:spacing w:after="0"/>
-            </w:pPr>
-            <w:r>
-              <w:rPr>
-                <w:rFonts w:ascii="Calibri" w:cs="Calibri" w:eastAsia="Calibri" w:hAnsi="Calibri"/>
-                <w:b w:val="false"/>
-                <w:bCs w:val="false"/>
-                <w:sz w:val="19"/>
-                <w:szCs w:val="19"/>
-              </w:rPr>
-              <w:t xml:space="preserve">18 000 000 GNF HT</w:t>
-            </w:r>
-          </w:p>
-        </w:tc>
-        <w:tc>
-          <w:tcPr>
-            <w:tcW w:type="dxa" w:w="2900"/>
-            <w:tcBorders>
-              <w:top w:val="single" w:color="C9CFD8" w:sz="4"/>
-              <w:left w:val="single" w:color="C9CFD8" w:sz="4"/>
-              <w:bottom w:val="single" w:color="C9CFD8" w:sz="4"/>
-              <w:right w:val="single" w:color="C9CFD8" w:sz="4"/>
-            </w:tcBorders>
-            <w:shd w:fill="F2F4F7" w:color="auto" w:val="clear"/>
-            <w:tcMar>
-              <w:top w:type="dxa" w:w="60"/>
-              <w:left w:type="dxa" w:w="100"/>
-              <w:bottom w:type="dxa" w:w="60"/>
-              <w:right w:type="dxa" w:w="100"/>
-            </w:tcMar>
-            <w:vAlign w:val="center"/>
-          </w:tcPr>
-          <w:p>
-            <w:pPr>
-              <w:spacing w:after="0"/>
-            </w:pPr>
-            <w:r>
-              <w:rPr>
-                <w:rFonts w:ascii="Calibri" w:cs="Calibri" w:eastAsia="Calibri" w:hAnsi="Calibri"/>
-                <w:b w:val="false"/>
-                <w:bCs w:val="false"/>
-                <w:sz w:val="19"/>
-                <w:szCs w:val="19"/>
-              </w:rPr>
-              <w:t xml:space="preserve">15 000 000 GNF HT</w:t>
-            </w:r>
-          </w:p>
-        </w:tc>
-      </w:tr>
-      <w:tr>
-        <w:tc>
-          <w:tcPr>
-            <w:tcW w:type="dxa" w:w="3838"/>
-            <w:tcBorders>
-              <w:top w:val="single" w:color="C9CFD8" w:sz="4"/>
-              <w:left w:val="single" w:color="C9CFD8" w:sz="4"/>
-              <w:bottom w:val="single" w:color="C9CFD8" w:sz="4"/>
-              <w:right w:val="single" w:color="C9CFD8" w:sz="4"/>
-            </w:tcBorders>
-            <w:tcMar>
-              <w:top w:type="dxa" w:w="60"/>
-              <w:left w:type="dxa" w:w="100"/>
-              <w:bottom w:type="dxa" w:w="60"/>
-              <w:right w:type="dxa" w:w="100"/>
-            </w:tcMar>
-            <w:vAlign w:val="center"/>
-          </w:tcPr>
-          <w:p>
-            <w:pPr>
-              <w:spacing w:after="0"/>
-            </w:pPr>
-            <w:r>
-              <w:rPr>
-                <w:rFonts w:ascii="Calibri" w:cs="Calibri" w:eastAsia="Calibri" w:hAnsi="Calibri"/>
-                <w:b w:val="false"/>
-                <w:bCs w:val="false"/>
-                <w:sz w:val="19"/>
-                <w:szCs w:val="19"/>
-              </w:rPr>
-              <w:t xml:space="preserve">Coût cumulé sur trois ans</w:t>
-            </w:r>
-          </w:p>
-        </w:tc>
-        <w:tc>
-          <w:tcPr>
-            <w:tcW w:type="dxa" w:w="2900"/>
-            <w:tcBorders>
-              <w:top w:val="single" w:color="C9CFD8" w:sz="4"/>
-              <w:left w:val="single" w:color="C9CFD8" w:sz="4"/>
-              <w:bottom w:val="single" w:color="C9CFD8" w:sz="4"/>
-              <w:right w:val="single" w:color="C9CFD8" w:sz="4"/>
-            </w:tcBorders>
-            <w:tcMar>
-              <w:top w:type="dxa" w:w="60"/>
-              <w:left w:type="dxa" w:w="100"/>
-              <w:bottom w:type="dxa" w:w="60"/>
-              <w:right w:type="dxa" w:w="100"/>
-            </w:tcMar>
-            <w:vAlign w:val="center"/>
-          </w:tcPr>
-          <w:p>
-            <w:pPr>
-              <w:spacing w:after="0"/>
-            </w:pPr>
-            <w:r>
-              <w:rPr>
-                <w:rFonts w:ascii="Calibri" w:cs="Calibri" w:eastAsia="Calibri" w:hAnsi="Calibri"/>
-                <w:b w:val="false"/>
-                <w:bCs w:val="false"/>
-                <w:sz w:val="19"/>
-                <w:szCs w:val="19"/>
-              </w:rPr>
-              <w:t xml:space="preserve">128 000 000 GNF HT</w:t>
-            </w:r>
-          </w:p>
-        </w:tc>
-        <w:tc>
-          <w:tcPr>
-            <w:tcW w:type="dxa" w:w="2900"/>
-            <w:tcBorders>
-              <w:top w:val="single" w:color="C9CFD8" w:sz="4"/>
-              <w:left w:val="single" w:color="C9CFD8" w:sz="4"/>
-              <w:bottom w:val="single" w:color="C9CFD8" w:sz="4"/>
-              <w:right w:val="single" w:color="C9CFD8" w:sz="4"/>
-            </w:tcBorders>
-            <w:tcMar>
-              <w:top w:type="dxa" w:w="60"/>
-              <w:left w:type="dxa" w:w="100"/>
-              <w:bottom w:type="dxa" w:w="60"/>
-              <w:right w:type="dxa" w:w="100"/>
-            </w:tcMar>
-            <w:vAlign w:val="center"/>
-          </w:tcPr>
-          <w:p>
-            <w:pPr>
-              <w:spacing w:after="0"/>
-            </w:pPr>
-            <w:r>
-              <w:rPr>
-                <w:rFonts w:ascii="Calibri" w:cs="Calibri" w:eastAsia="Calibri" w:hAnsi="Calibri"/>
-                <w:b w:val="false"/>
-                <w:bCs w:val="false"/>
-                <w:sz w:val="19"/>
-                <w:szCs w:val="19"/>
-              </w:rPr>
-              <w:t xml:space="preserve">110 000 000 GNF HT</w:t>
-            </w:r>
-          </w:p>
-        </w:tc>
-      </w:tr>
-    </w:tbl>
-    <w:p>
-      <w:pPr>
-        <w:spacing w:after="160"/>
-      </w:pPr>
+    <w:p>
+      <w:pPr>
+        <w:pStyle w:val="ListParagraph"/>
+        <w:numPr>
+          <w:ilvl w:val="0"/>
+          <w:numId w:val="2"/>
+        </w:numPr>
+        <w:spacing w:after="80"/>
+      </w:pPr>
+      <w:r>
+        <w:rPr>
+          <w:rFonts w:ascii="Calibri" w:cs="Calibri" w:eastAsia="Calibri" w:hAnsi="Calibri"/>
+          <w:sz w:val="22"/>
+          <w:szCs w:val="22"/>
+        </w:rPr>
+        <w:t xml:space="preserve">50 % à la commande, 30 % à la recette en semaine 4, 20 % au procès-verbal de mise en production.</w:t>
+      </w:r>
+    </w:p>
+    <w:p>
+      <w:pPr>
+        <w:pStyle w:val="ListParagraph"/>
+        <w:numPr>
+          <w:ilvl w:val="0"/>
+          <w:numId w:val="2"/>
+        </w:numPr>
+        <w:spacing w:after="80"/>
+      </w:pPr>
+      <w:r>
+        <w:rPr>
+          <w:rFonts w:ascii="Calibri" w:cs="Calibri" w:eastAsia="Calibri" w:hAnsi="Calibri"/>
+          <w:sz w:val="22"/>
+          <w:szCs w:val="22"/>
+        </w:rPr>
+        <w:t xml:space="preserve">Forfait annuel d'hébergement, maintenance et support : par semestre d'avance, à compter du treizième mois.</w:t>
+      </w:r>
+    </w:p>
+    <w:p>
+      <w:pPr>
+        <w:pStyle w:val="ListParagraph"/>
+        <w:numPr>
+          <w:ilvl w:val="0"/>
+          <w:numId w:val="2"/>
+        </w:numPr>
+        <w:spacing w:after="80"/>
+      </w:pPr>
+      <w:r>
+        <w:rPr>
+          <w:rFonts w:ascii="Calibri" w:cs="Calibri" w:eastAsia="Calibri" w:hAnsi="Calibri"/>
+          <w:sz w:val="22"/>
+          <w:szCs w:val="22"/>
+        </w:rPr>
+        <w:t xml:space="preserve">Règlement à 30 jours date de facture, par virement bancaire.</w:t>
+      </w:r>
     </w:p>
     <w:p>
       <w:pPr>
@@ -15417,78 +14571,7 @@
           <w:sz w:val="26"/>
           <w:szCs w:val="26"/>
         </w:rPr>
-        <w:t xml:space="preserve">8.6 Conditions de paiement</w:t>
-      </w:r>
-    </w:p>
-    <w:p>
-      <w:pPr>
-        <w:pStyle w:val="ListParagraph"/>
-        <w:numPr>
-          <w:ilvl w:val="0"/>
-          <w:numId w:val="2"/>
-        </w:numPr>
-        <w:spacing w:after="80"/>
-      </w:pPr>
-      <w:r>
-        <w:rPr>
-          <w:rFonts w:ascii="Calibri" w:cs="Calibri" w:eastAsia="Calibri" w:hAnsi="Calibri"/>
-          <w:sz w:val="22"/>
-          <w:szCs w:val="22"/>
-        </w:rPr>
-        <w:t xml:space="preserve">50 % à la commande, 30 % à la recette en semaine 4, 20 % au procès-verbal de mise en production.</w:t>
-      </w:r>
-    </w:p>
-    <w:p>
-      <w:pPr>
-        <w:pStyle w:val="ListParagraph"/>
-        <w:numPr>
-          <w:ilvl w:val="0"/>
-          <w:numId w:val="2"/>
-        </w:numPr>
-        <w:spacing w:after="80"/>
-      </w:pPr>
-      <w:r>
-        <w:rPr>
-          <w:rFonts w:ascii="Calibri" w:cs="Calibri" w:eastAsia="Calibri" w:hAnsi="Calibri"/>
-          <w:sz w:val="22"/>
-          <w:szCs w:val="22"/>
-        </w:rPr>
-        <w:t xml:space="preserve">Forfait annuel d'hébergement, maintenance et support : par semestre d'avance, à compter du treizième mois.</w:t>
-      </w:r>
-    </w:p>
-    <w:p>
-      <w:pPr>
-        <w:pStyle w:val="ListParagraph"/>
-        <w:numPr>
-          <w:ilvl w:val="0"/>
-          <w:numId w:val="2"/>
-        </w:numPr>
-        <w:spacing w:after="80"/>
-      </w:pPr>
-      <w:r>
-        <w:rPr>
-          <w:rFonts w:ascii="Calibri" w:cs="Calibri" w:eastAsia="Calibri" w:hAnsi="Calibri"/>
-          <w:sz w:val="22"/>
-          <w:szCs w:val="22"/>
-        </w:rPr>
-        <w:t xml:space="preserve">Règlement à 30 jours date de facture, par virement bancaire.</w:t>
-      </w:r>
-    </w:p>
-    <w:p>
-      <w:pPr>
-        <w:pStyle w:val="Heading2"/>
-        <w:spacing w:after="120" w:before="280"/>
-      </w:pPr>
-      <w:r>
-        <w:rPr>
-          <w:rFonts w:ascii="Calibri" w:cs="Calibri" w:eastAsia="Calibri" w:hAnsi="Calibri"/>
-          <w:b/>
-          <w:bCs/>
-          <w:color w:val="1C1E6B"/>
-          <w:sz w:val="26"/>
-          <w:szCs w:val="26"/>
-        </w:rPr>
-        <w:t xml:space="preserve">8.7 Engagements contractuels</w:t>
+        <w:t xml:space="preserve">8.6 Engagements contractuels</w:t>
       </w:r>
     </w:p>
     <w:p>
@@ -16226,7 +15309,7 @@
           <w:sz w:val="22"/>
           <w:szCs w:val="22"/>
         </w:rPr>
-        <w:t xml:space="preserve">Pour E-VOLUTION XP :</w:t>
+        <w:t xml:space="preserve">Pour E-volution Experience</w:t>
       </w:r>
     </w:p>
     <w:p>
@@ -16239,7 +15322,7 @@
           <w:sz w:val="22"/>
           <w:szCs w:val="22"/>
         </w:rPr>
-        <w:t xml:space="preserve">Nom, qualité, date et signature</w:t>
+        <w:t xml:space="preserve">Madigbè KOUYATÉ</w:t>
       </w:r>
     </w:p>
     <w:p>
@@ -16252,7 +15335,7 @@
           <w:sz w:val="22"/>
           <w:szCs w:val="22"/>
         </w:rPr>
-        <w:t xml:space="preserve">Pour EGUITRA GROUP SARLU et MB AxisPro Consulting, bon pour accord sur la proposition retenue :</w:t>
+        <w:t xml:space="preserve">Gérant</w:t>
       </w:r>
     </w:p>
     <w:p>
@@ -16265,7 +15348,7 @@
           <w:sz w:val="22"/>
           <w:szCs w:val="22"/>
         </w:rPr>
-        <w:t xml:space="preserve">Proposition retenue :  1    2</w:t>
+        <w:t xml:space="preserve">Signature : ________________</w:t>
       </w:r>
     </w:p>
     <w:p>
@@ -16278,12 +15361,90 @@
           <w:sz w:val="22"/>
           <w:szCs w:val="22"/>
         </w:rPr>
-        <w:t xml:space="preserve">Nom, qualité, date, signature et cachet</w:t>
+        <w:t xml:space="preserve"/>
       </w:r>
     </w:p>
+    <w:p>
+      <w:pPr>
+        <w:spacing w:after="140" w:before="0"/>
+      </w:pPr>
+      <w:r>
+        <w:rPr>
+          <w:rFonts w:ascii="Calibri" w:cs="Calibri" w:eastAsia="Calibri" w:hAnsi="Calibri"/>
+          <w:sz w:val="22"/>
+          <w:szCs w:val="22"/>
+        </w:rPr>
+        <w:t xml:space="preserve">Pour EGUITRA GROUP SARLU et MB AxisPro Consulting</w:t>
+      </w:r>
+    </w:p>
+    <w:p>
+      <w:pPr>
+        <w:spacing w:after="140" w:before="0"/>
+      </w:pPr>
+      <w:r>
+        <w:rPr>
+          <w:rFonts w:ascii="Calibri" w:cs="Calibri" w:eastAsia="Calibri" w:hAnsi="Calibri"/>
+          <w:sz w:val="22"/>
+          <w:szCs w:val="22"/>
+        </w:rPr>
+        <w:t xml:space="preserve">Date : ________________</w:t>
+      </w:r>
+    </w:p>
+    <w:p>
+      <w:pPr>
+        <w:spacing w:after="140" w:before="0"/>
+      </w:pPr>
+      <w:r>
+        <w:rPr>
+          <w:rFonts w:ascii="Calibri" w:cs="Calibri" w:eastAsia="Calibri" w:hAnsi="Calibri"/>
+          <w:sz w:val="22"/>
+          <w:szCs w:val="22"/>
+        </w:rPr>
+        <w:t xml:space="preserve">Proposition retenue :        1                  2</w:t>
+      </w:r>
+    </w:p>
+    <w:p>
+      <w:pPr>
+        <w:spacing w:after="140" w:before="0"/>
+      </w:pPr>
+      <w:r>
+        <w:rPr>
+          <w:rFonts w:ascii="Calibri" w:cs="Calibri" w:eastAsia="Calibri" w:hAnsi="Calibri"/>
+          <w:sz w:val="22"/>
+          <w:szCs w:val="22"/>
+        </w:rPr>
+        <w:t xml:space="preserve">Signature et cachet : ________________</w:t>
+      </w:r>
+    </w:p>
+    <w:p>
+      <w:pPr>
+        <w:spacing w:after="140" w:before="0"/>
+      </w:pPr>
+      <w:r>
+        <w:rPr>
+          <w:rFonts w:ascii="Calibri" w:cs="Calibri" w:eastAsia="Calibri" w:hAnsi="Calibri"/>
+          <w:sz w:val="22"/>
+          <w:szCs w:val="22"/>
+        </w:rPr>
+        <w:t xml:space="preserve">Mention manuscrite obligatoire :</w:t>
+      </w:r>
+    </w:p>
+    <w:p>
+      <w:pPr>
+        <w:spacing w:after="140" w:before="0"/>
+      </w:pPr>
+      <w:r>
+        <w:rPr>
+          <w:rFonts w:ascii="Calibri" w:cs="Calibri" w:eastAsia="Calibri" w:hAnsi="Calibri"/>
+          <w:sz w:val="22"/>
+          <w:szCs w:val="22"/>
+        </w:rPr>
+        <w:t xml:space="preserve">« Lu et approuvé. Bon pour accord »</w:t>
+      </w:r>
+    </w:p>
     <w:sectPr>
-      <w:headerReference w:type="default" r:id="rId7"/>
-      <w:footerReference w:type="default" r:id="rId8"/>
+      <w:headerReference w:type="default" r:id="rId6"/>
+      <w:footerReference w:type="default" r:id="rId7"/>
       <w:pgSz w:w="11906" w:h="16838" w:orient="portrait"/>
       <w:pgMar w:top="1134" w:right="1134" w:bottom="1134" w:left="1134" w:header="708" w:footer="708" w:gutter="0"/>
       <w:pgNumType/>
@@ -16291,10 +15452,6 @@
     </w:sectPr>
   </w:body>
 </w:document>
-</file>
-
-<file path=word/comments.xml><?xml version="1.0" encoding="utf-8"?>
-<w:comments xmlns:cx="http://schemas.microsoft.com/office/drawing/2014/chartex" xmlns:cx1="http://schemas.microsoft.com/office/drawing/2015/9/8/chartex" xmlns:cx2="http://schemas.microsoft.com/office/drawing/2015/10/21/chartex" xmlns:cx3="http://schemas.microsoft.com/office/drawing/2016/5/9/chartex" xmlns:cx4="http://schemas.microsoft.com/office/drawing/2016/5/10/chartex" xmlns:cx5="http://schemas.microsoft.com/office/drawing/2016/5/11/chartex" xmlns:cx6="http://schemas.microsoft.com/office/drawing/2016/5/12/chartex" xmlns:cx7="http://schemas.microsoft.com/office/drawing/2016/5/13/chartex" xmlns:cx8="http://schemas.microsoft.com/office/drawing/2016/5/14/chartex" xmlns:mc="http://schemas.openxmlformats.org/markup-compatibility/2006" xmlns:aink="http://schemas.microsoft.com/office/drawing/2016/ink" xmlns:am3d="http://schemas.microsoft.com/office/drawing/2017/model3d" xmlns:o="urn:schemas-microsoft-com:office:office" xmlns:r="http://schemas.openxmlformats.org/officeDocument/2006/relationships" xmlns:m="http://schemas.openxmlformats.org/officeDocument/2006/math" xmlns:v="urn:schemas-microsoft-com:vml" xmlns:wp14="http://schemas.microsoft.com/office/word/2010/wordprocessingDrawing" xmlns:wp="http://schemas.openxmlformats.org/drawingml/2006/wordprocessingDrawing" xmlns:w10="urn:schemas-microsoft-com:office:word" xmlns:w="http://schemas.openxmlformats.org/wordprocessingml/2006/main" xmlns:w14="http://schemas.microsoft.com/office/word/2010/wordml" xmlns:w15="http://schemas.microsoft.com/office/word/2012/wordml" xmlns:w16cex="http://schemas.microsoft.com/office/word/2018/wordml/cex" xmlns:w16cid="http://schemas.microsoft.com/office/word/2016/wordml/cid" xmlns:w16="http://schemas.microsoft.com/office/word/2018/wordml" xmlns:w16sdtdh="http://schemas.microsoft.com/office/word/2020/wordml/sdtdatahash" xmlns:w16se="http://schemas.microsoft.com/office/word/2015/wordml/symex" xmlns:wpg="http://schemas.microsoft.com/office/word/2010/wordprocessingGroup" xmlns:wpi="http://schemas.microsoft.com/office/word/2010/wordprocessingInk" xmlns:wne="http://schemas.microsoft.com/office/word/2006/wordml" xmlns:wps="http://schemas.microsoft.com/office/word/2010/wordprocessingShape"/>
 </file>
 
 <file path=word/endnotes.xml><?xml version="1.0" encoding="utf-8"?>
@@ -16347,7 +15504,7 @@
         <w:sz w:val="16"/>
         <w:szCs w:val="16"/>
       </w:rPr>
-      <w:t xml:space="preserve">E-VOLUTION XP, Transformation Numérique. Réf. OTF-EGUITRA-2026-01, confidentiel. Page </w:t>
+      <w:t xml:space="preserve">E-VOLUTION XP, Transformation Numérique. Réf. OTF-EGUITRA-2026-36, confidentiel. Page </w:t>
     </w:r>
     <w:r>
       <w:rPr>
@@ -16416,7 +15573,7 @@
         <wp:inline distT="0" distB="0" distL="0" distR="0">
           <wp:extent cx="666750" cy="390525"/>
           <wp:effectExtent t="0" r="0" b="0" l="0"/>
-          <wp:docPr id="1" name="logo" descr="Logo E-VOLUTION XP" title="E-VOLUTION XP"/>
+          <wp:docPr id="2" name="logo" descr="Logo E-VOLUTION XP" title="E-VOLUTION XP"/>
           <wp:cNvGraphicFramePr>
             <a:graphicFrameLocks xmlns:a="http://schemas.openxmlformats.org/drawingml/2006/main" noChangeAspect="1"/>
           </wp:cNvGraphicFramePr>
@@ -16476,7 +15633,7 @@
 <w:numbering xmlns:wpc="http://schemas.microsoft.com/office/word/2010/wordprocessingCanvas" xmlns:mc="http://schemas.openxmlformats.org/markup-compatibility/2006" xmlns:o="urn:schemas-microsoft-com:office:office" xmlns:r="http://schemas.openxmlformats.org/officeDocument/2006/relationships" xmlns:m="http://schemas.openxmlformats.org/officeDocument/2006/math" xmlns:v="urn:schemas-microsoft-com:vml" xmlns:wp14="http://schemas.microsoft.com/office/word/2010/wordprocessingDrawing" xmlns:wp="http://schemas.openxmlformats.org/drawingml/2006/wordprocessingDrawing" xmlns:w10="urn:schemas-microsoft-com:office:word" xmlns:w="http://schemas.openxmlformats.org/wordprocessingml/2006/main" xmlns:w14="http://schemas.microsoft.com/office/word/2010/wordml" xmlns:w15="http://schemas.microsoft.com/office/word/2012/wordml" xmlns:wpg="http://schemas.microsoft.com/office/word/2010/wordprocessingGroup" xmlns:wpi="http://schemas.microsoft.com/office/word/2010/wordprocessingInk" xmlns:wne="http://schemas.microsoft.com/office/word/2006/wordml" xmlns:wps="http://schemas.microsoft.com/office/word/2010/wordprocessingShape" mc:Ignorable="w14 w15 wp14">
   <w:abstractNum w:abstractNumId="1" w15:restartNumberingAfterBreak="0">
     <w:multiLevelType w:val="hybridMultilevel"/>
-    <w:lvl w:ilvl="0" w15:tentative="1">
+    <w:lvl w:ilvl="0" w:tentative="1">
       <w:start w:val="1"/>
       <w:numFmt w:val="bullet"/>
       <w:lvlText w:val="●"/>
@@ -16485,7 +15642,7 @@
         <w:ind w:left="720" w:hanging="360"/>
       </w:pPr>
     </w:lvl>
-    <w:lvl w:ilvl="1" w15:tentative="1">
+    <w:lvl w:ilvl="1" w:tentative="1">
       <w:start w:val="1"/>
       <w:numFmt w:val="bullet"/>
       <w:lvlText w:val="○"/>
@@ -16494,7 +15651,7 @@
         <w:ind w:left="1440" w:hanging="360"/>
       </w:pPr>
     </w:lvl>
-    <w:lvl w:ilvl="2" w15:tentative="1">
+    <w:lvl w:ilvl="2" w:tentative="1">
       <w:start w:val="1"/>
       <w:numFmt w:val="bullet"/>
       <w:lvlText w:val="■"/>
@@ -16503,7 +15660,7 @@
         <w:ind w:left="2160" w:hanging="360"/>
       </w:pPr>
     </w:lvl>
-    <w:lvl w:ilvl="3" w15:tentative="1">
+    <w:lvl w:ilvl="3" w:tentative="1">
       <w:start w:val="1"/>
       <w:numFmt w:val="bullet"/>
       <w:lvlText w:val="●"/>
@@ -16512,7 +15669,7 @@
         <w:ind w:left="2880" w:hanging="360"/>
       </w:pPr>
     </w:lvl>
-    <w:lvl w:ilvl="4" w15:tentative="1">
+    <w:lvl w:ilvl="4" w:tentative="1">
       <w:start w:val="1"/>
       <w:numFmt w:val="bullet"/>
       <w:lvlText w:val="○"/>
@@ -16521,7 +15678,7 @@
         <w:ind w:left="3600" w:hanging="360"/>
       </w:pPr>
     </w:lvl>
-    <w:lvl w:ilvl="5" w15:tentative="1">
+    <w:lvl w:ilvl="5" w:tentative="1">
       <w:start w:val="1"/>
       <w:numFmt w:val="bullet"/>
       <w:lvlText w:val="■"/>
@@ -16530,7 +15687,7 @@
         <w:ind w:left="4320" w:hanging="360"/>
       </w:pPr>
     </w:lvl>
-    <w:lvl w:ilvl="6" w15:tentative="1">
+    <w:lvl w:ilvl="6" w:tentative="1">
       <w:start w:val="1"/>
       <w:numFmt w:val="bullet"/>
       <w:lvlText w:val="●"/>
@@ -16539,7 +15696,7 @@
         <w:ind w:left="5040" w:hanging="360"/>
       </w:pPr>
     </w:lvl>
-    <w:lvl w:ilvl="7" w15:tentative="1">
+    <w:lvl w:ilvl="7" w:tentative="1">
       <w:start w:val="1"/>
       <w:numFmt w:val="bullet"/>
       <w:lvlText w:val="●"/>
@@ -16548,7 +15705,7 @@
         <w:ind w:left="5760" w:hanging="360"/>
       </w:pPr>
     </w:lvl>
-    <w:lvl w:ilvl="8" w15:tentative="1">
+    <w:lvl w:ilvl="8" w:tentative="1">
       <w:start w:val="1"/>
       <w:numFmt w:val="bullet"/>
       <w:lvlText w:val="●"/>
@@ -16560,7 +15717,7 @@
   </w:abstractNum>
   <w:abstractNum w:abstractNumId="2" w15:restartNumberingAfterBreak="0">
     <w:multiLevelType w:val="hybridMultilevel"/>
-    <w:lvl w:ilvl="0" w15:tentative="1">
+    <w:lvl w:ilvl="0" w:tentative="1">
       <w:start w:val="1"/>
       <w:numFmt w:val="bullet"/>
       <w:lvlText w:val="•"/>
@@ -16597,6 +15754,10 @@
     </w:rPrDefault>
     <w:pPrDefault/>
   </w:docDefaults>
+  <w:style w:type="paragraph" w:styleId="Normal" w:default="1">
+    <w:name w:val="Normal"/>
+    <w:qFormat/>
+  </w:style>
   <w:style w:type="paragraph" w:styleId="Title">
     <w:name w:val="Title"/>
     <w:basedOn w:val="Normal"/>
@@ -16605,39 +15766,6 @@
     <w:rPr>
       <w:sz w:val="56"/>
       <w:szCs w:val="56"/>
-    </w:rPr>
-  </w:style>
-  <w:style w:type="paragraph" w:styleId="Heading1">
-    <w:name w:val="Heading 1"/>
-    <w:basedOn w:val="Normal"/>
-    <w:next w:val="Normal"/>
-    <w:qFormat/>
-    <w:rPr>
-      <w:color w:val="2E74B5"/>
-      <w:sz w:val="32"/>
-      <w:szCs w:val="32"/>
-    </w:rPr>
-  </w:style>
-  <w:style w:type="paragraph" w:styleId="Heading2">
-    <w:name w:val="Heading 2"/>
-    <w:basedOn w:val="Normal"/>
-    <w:next w:val="Normal"/>
-    <w:qFormat/>
-    <w:rPr>
-      <w:color w:val="2E74B5"/>
-      <w:sz w:val="26"/>
-      <w:szCs w:val="26"/>
-    </w:rPr>
-  </w:style>
-  <w:style w:type="paragraph" w:styleId="Heading3">
-    <w:name w:val="Heading 3"/>
-    <w:basedOn w:val="Normal"/>
-    <w:next w:val="Normal"/>
-    <w:qFormat/>
-    <w:rPr>
-      <w:color w:val="1F4D78"/>
-      <w:sz w:val="24"/>
-      <w:szCs w:val="24"/>
     </w:rPr>
   </w:style>
   <w:style w:type="paragraph" w:styleId="Heading4">
@@ -16823,4 +15951,294 @@
     </w:rPr>
   </w:style>
 </w:styles>
+</file>
+
+<file path=word/theme/theme1.xml><?xml version="1.0" encoding="utf-8"?>
+<a:theme xmlns:a="http://schemas.openxmlformats.org/drawingml/2006/main" name="Office Theme">
+  <a:themeElements>
+    <a:clrScheme name="Office">
+      <a:dk1>
+        <a:sysClr val="windowText" lastClr="000000"/>
+      </a:dk1>
+      <a:lt1>
+        <a:sysClr val="window" lastClr="FFFFFF"/>
+      </a:lt1>
+      <a:dk2>
+        <a:srgbClr val="44546A"/>
+      </a:dk2>
+      <a:lt2>
+        <a:srgbClr val="E7E6E6"/>
+      </a:lt2>
+      <a:accent1>
+        <a:srgbClr val="4472C4"/>
+      </a:accent1>
+      <a:accent2>
+        <a:srgbClr val="ED7D31"/>
+      </a:accent2>
+      <a:accent3>
+        <a:srgbClr val="A5A5A5"/>
+      </a:accent3>
+      <a:accent4>
+        <a:srgbClr val="FFC000"/>
+      </a:accent4>
+      <a:accent5>
+        <a:srgbClr val="5B9BD5"/>
+      </a:accent5>
+      <a:accent6>
+        <a:srgbClr val="70AD47"/>
+      </a:accent6>
+      <a:hlink>
+        <a:srgbClr val="0563C1"/>
+      </a:hlink>
+      <a:folHlink>
+        <a:srgbClr val="954F72"/>
+      </a:folHlink>
+    </a:clrScheme>
+    <a:fontScheme name="Office">
+      <a:majorFont>
+        <a:latin typeface="Calibri Light" panose="020F0302020204030204"/>
+        <a:ea typeface=""/>
+        <a:cs typeface=""/>
+        <a:font script="Jpan" typeface="游ゴシック Light"/>
+        <a:font script="Hang" typeface="맑은 고딕"/>
+        <a:font script="Hans" typeface="等线 Light"/>
+        <a:font script="Hant" typeface="新細明體"/>
+        <a:font script="Arab" typeface="Times New Roman"/>
+        <a:font script="Hebr" typeface="Times New Roman"/>
+        <a:font script="Thai" typeface="Angsana New"/>
+        <a:font script="Ethi" typeface="Nyala"/>
+        <a:font script="Beng" typeface="Vrinda"/>
+        <a:font script="Gujr" typeface="Shruti"/>
+        <a:font script="Khmr" typeface="MoolBoran"/>
+        <a:font script="Knda" typeface="Tunga"/>
+        <a:font script="Guru" typeface="Raavi"/>
+        <a:font script="Cans" typeface="Euphemia"/>
+        <a:font script="Cher" typeface="Plantagenet Cherokee"/>
+        <a:font script="Yiii" typeface="Microsoft Yi Baiti"/>
+        <a:font script="Tibt" typeface="Microsoft Himalaya"/>
+        <a:font script="Thaa" typeface="MV Boli"/>
+        <a:font script="Deva" typeface="Mangal"/>
+        <a:font script="Telu" typeface="Gautami"/>
+        <a:font script="Taml" typeface="Latha"/>
+        <a:font script="Syrc" typeface="Estrangelo Edessa"/>
+        <a:font script="Orya" typeface="Kalinga"/>
+        <a:font script="Mlym" typeface="Kartika"/>
+        <a:font script="Laoo" typeface="DokChampa"/>
+        <a:font script="Sinh" typeface="Iskoola Pota"/>
+        <a:font script="Mong" typeface="Mongolian Baiti"/>
+        <a:font script="Viet" typeface="Times New Roman"/>
+        <a:font script="Uigh" typeface="Microsoft Uighur"/>
+        <a:font script="Geor" typeface="Sylfaen"/>
+        <a:font script="Armn" typeface="Arial"/>
+        <a:font script="Bugi" typeface="Leelawadee UI"/>
+        <a:font script="Bopo" typeface="Microsoft JhengHei"/>
+        <a:font script="Java" typeface="Javanese Text"/>
+        <a:font script="Lisu" typeface="Segoe UI"/>
+        <a:font script="Mymr" typeface="Myanmar Text"/>
+        <a:font script="Nkoo" typeface="Ebrima"/>
+        <a:font script="Olck" typeface="Nirmala UI"/>
+        <a:font script="Osma" typeface="Ebrima"/>
+        <a:font script="Phag" typeface="Phagspa"/>
+        <a:font script="Syrn" typeface="Estrangelo Edessa"/>
+        <a:font script="Syrj" typeface="Estrangelo Edessa"/>
+        <a:font script="Syre" typeface="Estrangelo Edessa"/>
+        <a:font script="Sora" typeface="Nirmala UI"/>
+        <a:font script="Tale" typeface="Microsoft Tai Le"/>
+        <a:font script="Talu" typeface="Microsoft New Tai Lue"/>
+        <a:font script="Tfng" typeface="Ebrima"/>
+      </a:majorFont>
+      <a:minorFont>
+        <a:latin typeface="Calibri" panose="020F0502020204030204"/>
+        <a:ea typeface=""/>
+        <a:cs typeface=""/>
+        <a:font script="Jpan" typeface="游明朝"/>
+        <a:font script="Hang" typeface="맑은 고딕"/>
+        <a:font script="Hans" typeface="等线"/>
+        <a:font script="Hant" typeface="新細明體"/>
+        <a:font script="Arab" typeface="Arial"/>
+        <a:font script="Hebr" typeface="Arial"/>
+        <a:font script="Thai" typeface="Cordia New"/>
+        <a:font script="Ethi" typeface="Nyala"/>
+        <a:font script="Beng" typeface="Vrinda"/>
+        <a:font script="Gujr" typeface="Shruti"/>
+        <a:font script="Khmr" typeface="DaunPenh"/>
+        <a:font script="Knda" typeface="Tunga"/>
+        <a:font script="Guru" typeface="Raavi"/>
+        <a:font script="Cans" typeface="Euphemia"/>
+        <a:font script="Cher" typeface="Plantagenet Cherokee"/>
+        <a:font script="Yiii" typeface="Microsoft Yi Baiti"/>
+        <a:font script="Tibt" typeface="Microsoft Himalaya"/>
+        <a:font script="Thaa" typeface="MV Boli"/>
+        <a:font script="Deva" typeface="Mangal"/>
+        <a:font script="Telu" typeface="Gautami"/>
+        <a:font script="Taml" typeface="Latha"/>
+        <a:font script="Syrc" typeface="Estrangelo Edessa"/>
+        <a:font script="Orya" typeface="Kalinga"/>
+        <a:font script="Mlym" typeface="Kartika"/>
+        <a:font script="Laoo" typeface="DokChampa"/>
+        <a:font script="Sinh" typeface="Iskoola Pota"/>
+        <a:font script="Mong" typeface="Mongolian Baiti"/>
+        <a:font script="Viet" typeface="Arial"/>
+        <a:font script="Uigh" typeface="Microsoft Uighur"/>
+        <a:font script="Geor" typeface="Sylfaen"/>
+        <a:font script="Armn" typeface="Arial"/>
+        <a:font script="Bugi" typeface="Leelawadee UI"/>
+        <a:font script="Bopo" typeface="Microsoft JhengHei"/>
+        <a:font script="Java" typeface="Javanese Text"/>
+        <a:font script="Lisu" typeface="Segoe UI"/>
+        <a:font script="Mymr" typeface="Myanmar Text"/>
+        <a:font script="Nkoo" typeface="Ebrima"/>
+        <a:font script="Olck" typeface="Nirmala UI"/>
+        <a:font script="Osma" typeface="Ebrima"/>
+        <a:font script="Phag" typeface="Phagspa"/>
+        <a:font script="Syrn" typeface="Estrangelo Edessa"/>
+        <a:font script="Syrj" typeface="Estrangelo Edessa"/>
+        <a:font script="Syre" typeface="Estrangelo Edessa"/>
+        <a:font script="Sora" typeface="Nirmala UI"/>
+        <a:font script="Tale" typeface="Microsoft Tai Le"/>
+        <a:font script="Talu" typeface="Microsoft New Tai Lue"/>
+        <a:font script="Tfng" typeface="Ebrima"/>
+      </a:minorFont>
+    </a:fontScheme>
+    <a:fmtScheme name="Office">
+      <a:fillStyleLst>
+        <a:solidFill>
+          <a:schemeClr val="phClr"/>
+        </a:solidFill>
+        <a:gradFill rotWithShape="true">
+          <a:gsLst>
+            <a:gs pos="0">
+              <a:schemeClr val="phClr">
+                <a:lumMod val="110000"/>
+                <a:satMod val="105000"/>
+                <a:tint val="67000"/>
+              </a:schemeClr>
+            </a:gs>
+            <a:gs pos="50000">
+              <a:schemeClr val="phClr">
+                <a:lumMod val="105000"/>
+                <a:satMod val="103000"/>
+                <a:tint val="73000"/>
+              </a:schemeClr>
+            </a:gs>
+            <a:gs pos="100000">
+              <a:schemeClr val="phClr">
+                <a:lumMod val="105000"/>
+                <a:satMod val="109000"/>
+                <a:tint val="81000"/>
+              </a:schemeClr>
+            </a:gs>
+          </a:gsLst>
+          <a:lin ang="5400000" scaled="false"/>
+        </a:gradFill>
+        <a:gradFill rotWithShape="true">
+          <a:gsLst>
+            <a:gs pos="0">
+              <a:schemeClr val="phClr">
+                <a:satMod val="103000"/>
+                <a:lumMod val="102000"/>
+                <a:tint val="94000"/>
+              </a:schemeClr>
+            </a:gs>
+            <a:gs pos="50000">
+              <a:schemeClr val="phClr">
+                <a:satMod val="110000"/>
+                <a:lumMod val="100000"/>
+                <a:shade val="100000"/>
+              </a:schemeClr>
+            </a:gs>
+            <a:gs pos="100000">
+              <a:schemeClr val="phClr">
+                <a:lumMod val="99000"/>
+                <a:satMod val="120000"/>
+                <a:shade val="78000"/>
+              </a:schemeClr>
+            </a:gs>
+          </a:gsLst>
+          <a:lin ang="5400000" scaled="false"/>
+        </a:gradFill>
+      </a:fillStyleLst>
+      <a:lnStyleLst>
+        <a:ln w="6350" cap="flat" cmpd="sng" algn="ctr">
+          <a:solidFill>
+            <a:schemeClr val="phClr"/>
+          </a:solidFill>
+          <a:prstDash val="solid"/>
+          <a:miter lim="800000"/>
+        </a:ln>
+        <a:ln w="12700" cap="flat" cmpd="sng" algn="ctr">
+          <a:solidFill>
+            <a:schemeClr val="phClr"/>
+          </a:solidFill>
+          <a:prstDash val="solid"/>
+          <a:miter lim="800000"/>
+        </a:ln>
+        <a:ln w="19050" cap="flat" cmpd="sng" algn="ctr">
+          <a:solidFill>
+            <a:schemeClr val="phClr"/>
+          </a:solidFill>
+          <a:prstDash val="solid"/>
+          <a:miter lim="800000"/>
+        </a:ln>
+      </a:lnStyleLst>
+      <a:effectStyleLst>
+        <a:effectStyle>
+          <a:effectLst/>
+        </a:effectStyle>
+        <a:effectStyle>
+          <a:effectLst/>
+        </a:effectStyle>
+        <a:effectStyle>
+          <a:effectLst>
+            <a:outerShdw blurRad="57150" dist="19050" dir="5400000" algn="ctr" rotWithShape="false">
+              <a:srgbClr val="000000">
+                <a:alpha val="63000"/>
+              </a:srgbClr>
+            </a:outerShdw>
+          </a:effectLst>
+        </a:effectStyle>
+      </a:effectStyleLst>
+      <a:bgFillStyleLst>
+        <a:solidFill>
+          <a:schemeClr val="phClr"/>
+        </a:solidFill>
+        <a:solidFill>
+          <a:schemeClr val="phClr">
+            <a:tint val="95000"/>
+            <a:satMod val="170000"/>
+          </a:schemeClr>
+        </a:solidFill>
+        <a:gradFill rotWithShape="true">
+          <a:gsLst>
+            <a:gs pos="0">
+              <a:schemeClr val="phClr">
+                <a:tint val="93000"/>
+                <a:satMod val="150000"/>
+                <a:shade val="98000"/>
+                <a:lumMod val="102000"/>
+              </a:schemeClr>
+            </a:gs>
+            <a:gs pos="50000">
+              <a:schemeClr val="phClr">
+                <a:tint val="98000"/>
+                <a:satMod val="130000"/>
+                <a:shade val="90000"/>
+                <a:lumMod val="103000"/>
+              </a:schemeClr>
+            </a:gs>
+            <a:gs pos="100000">
+              <a:schemeClr val="phClr">
+                <a:shade val="63000"/>
+                <a:satMod val="120000"/>
+              </a:schemeClr>
+            </a:gs>
+          </a:gsLst>
+          <a:lin ang="5400000" scaled="false"/>
+        </a:gradFill>
+      </a:bgFillStyleLst>
+    </a:fmtScheme>
+  </a:themeElements>
+  <a:objectDefaults/>
+  <a:extraClrSchemeLst/>
+</a:theme>
 </file>
</xml_diff>

<commit_message>
Validité de l'offre révisée fixée à 30 jours, jusqu'au 29 octobre 2026
Co-Authored-By: Claude Fable 5.1 <noreply@anthropic.com>
Claude-Session: https://claude.ai/code/session_015yYNiyH8hjzTq5nD22kCrg
</commit_message>
<xml_diff>
--- a/docs/offre/Offre_technique_financiere_EGUITRA.docx
+++ b/docs/offre/Offre_technique_financiere_EGUITRA.docx
@@ -154,7 +154,7 @@
           <w:sz w:val="20"/>
           <w:szCs w:val="20"/>
         </w:rPr>
-        <w:t xml:space="preserve">Révision 1 du 29 septembre 2026, offre valable 60 jours</w:t>
+        <w:t xml:space="preserve">Révision 1 du 29 septembre 2026, offre valable 30 jours</w:t>
       </w:r>
     </w:p>
     <w:p>
@@ -969,7 +969,7 @@
           <w:sz w:val="22"/>
           <w:szCs w:val="22"/>
         </w:rPr>
-        <w:t xml:space="preserve">Validité de l'offre : 60 jours à compter du 29 septembre 2026, soit jusqu'au 28 novembre 2026. Tous les montants sont exprimés en francs guinéens, hors taxes.</w:t>
+        <w:t xml:space="preserve">Validité de l'offre : 30 jours à compter du 29 septembre 2026, soit jusqu'au 29 octobre 2026. Tous les montants sont exprimés en francs guinéens, hors taxes.</w:t>
       </w:r>
     </w:p>
     <w:p>
@@ -1266,7 +1266,7 @@
                 <w:sz w:val="19"/>
                 <w:szCs w:val="19"/>
               </w:rPr>
-              <w:t xml:space="preserve">La durée applicable est de 60 jours. La mention de 30 jours en synthèse de l'offre initiale était une erreur matérielle. La présente révision indique 60 jours à compter du 29 septembre 2026 en page de garde, en synthèse et dans les engagements contractuels.</w:t>
+              <w:t xml:space="preserve">La durée applicable est de 30 jours. Les mentions de 60 jours en page de garde et au chapitre 8.6 de l'offre initiale étaient une erreur matérielle. La présente révision indique 30 jours à compter du 29 septembre 2026, soit jusqu'au 29 octobre 2026, en page de garde, en synthèse et dans les engagements contractuels.</w:t>
             </w:r>
           </w:p>
         </w:tc>
@@ -13231,7 +13231,7 @@
           <w:sz w:val="22"/>
           <w:szCs w:val="22"/>
         </w:rPr>
-        <w:t xml:space="preserve">Validité de l'offre : 60 jours à compter du 29 septembre 2026, soit jusqu'au 28 novembre 2026. La présente révision remplace l'offre OTF-EGUITRA-2026-36 du 15 septembre 2026.</w:t>
+        <w:t xml:space="preserve">Validité de l'offre : 30 jours à compter du 29 septembre 2026, soit jusqu'au 29 octobre 2026. La présente révision remplace l'offre OTF-EGUITRA-2026-36 du 15 septembre 2026.</w:t>
       </w:r>
     </w:p>
     <w:p>

</xml_diff>

<commit_message>
Offre révisée présentée comme une offre complète et autonome
Le chapitre de réponse aux observations est retiré, les clauses sont
rédigées sans renvoi au courrier du client, les chapitres sont renumérotés
et les postes sont rechiffrés pour totaliser directement 50 000 000 GNF HT.
Le courrier d'accompagnement est raccourci en conséquence.

Co-Authored-By: Claude Fable 5.1 <noreply@anthropic.com>
Claude-Session: https://claude.ai/code/session_015yYNiyH8hjzTq5nD22kCrg
</commit_message>
<xml_diff>
--- a/docs/offre/Offre_technique_financiere_EGUITRA.docx
+++ b/docs/offre/Offre_technique_financiere_EGUITRA.docx
@@ -168,20 +168,6 @@
           <w:sz w:val="20"/>
           <w:szCs w:val="20"/>
         </w:rPr>
-        <w:t xml:space="preserve">Remplace l'offre OTF-EGUITRA-2026-36 du 15 septembre 2026</w:t>
-      </w:r>
-    </w:p>
-    <w:p>
-      <w:pPr>
-        <w:spacing w:after="40" w:before="0"/>
-      </w:pPr>
-      <w:r>
-        <w:rPr>
-          <w:rFonts w:ascii="Calibri" w:cs="Calibri" w:eastAsia="Calibri" w:hAnsi="Calibri"/>
-          <w:color w:val="666666"/>
-          <w:sz w:val="20"/>
-          <w:szCs w:val="20"/>
-        </w:rPr>
         <w:t xml:space="preserve">E-VOLUTION XP, Transformation Numérique. Contact : +224 628 86 22 55 / emkouyate@e-volutionxp.com</w:t>
       </w:r>
     </w:p>
@@ -260,7 +246,7 @@
           <w:sz w:val="32"/>
           <w:szCs w:val="32"/>
         </w:rPr>
-        <w:t xml:space="preserve">1. Synthèse de l'offre révisée</w:t>
+        <w:t xml:space="preserve">1. Synthèse de l'offre</w:t>
       </w:r>
     </w:p>
     <w:p>
@@ -273,20 +259,7 @@
           <w:sz w:val="22"/>
           <w:szCs w:val="22"/>
         </w:rPr>
-        <w:t xml:space="preserve">Par courrier reçu à la suite de notre offre OTF-EGUITRA-2026-36 du 15 septembre 2026, EGUITRA GROUP SARLU et MB AxisPro Consulting ont retenu la proposition 1, plateforme intégrée sur noyau de gestion, et nous ont demandé de clarifier ou de réviser six points : la validité de l'offre, la durée de la garantie corrective, la fréquence des sauvegardes, une clause de pénalité de retard, la définition des évolutions incluses dans la maintenance, et le montant de l'investissement.</w:t>
-      </w:r>
-    </w:p>
-    <w:p>
-      <w:pPr>
-        <w:spacing w:after="140" w:before="0"/>
-      </w:pPr>
-      <w:r>
-        <w:rPr>
-          <w:rFonts w:ascii="Calibri" w:cs="Calibri" w:eastAsia="Calibri" w:hAnsi="Calibri"/>
-          <w:sz w:val="22"/>
-          <w:szCs w:val="22"/>
-        </w:rPr>
-        <w:t xml:space="preserve">La présente révision remplace l'offre du 15 septembre 2026. Elle porte sur la seule proposition 1, pour un périmètre fonctionnel strictement inchangé, et répond à chacun des six points. Le chapitre 2 en donne la synthèse, les chapitres suivants le détail.</w:t>
+        <w:t xml:space="preserve">EGUITRA GROUP SARLU et MB AxisPro Consulting partagent une direction générale, des locaux et deux projets de digitalisation : le département Finance d'une part, l'accompagnement des porteurs de projets d'autre part. E-VOLUTION XP propose une plateforme unique qui répond à ces deux projets : un noyau de gestion open source éprouvé, invisible pour les utilisateurs, et deux applications à votre image, EGUITRA Finance et AxisPro Suite, mises en production en 4 semaines sur un hébergement dédié au groupe.</w:t>
       </w:r>
     </w:p>
     <w:tbl>
@@ -375,7 +348,7 @@
                 <w:sz w:val="19"/>
                 <w:szCs w:val="19"/>
               </w:rPr>
-              <w:t xml:space="preserve">Offre révisée</w:t>
+              <w:t xml:space="preserve">Offre</w:t>
             </w:r>
           </w:p>
         </w:tc>
@@ -581,7 +554,7 @@
                 <w:sz w:val="19"/>
                 <w:szCs w:val="19"/>
               </w:rPr>
-              <w:t xml:space="preserve">4 semaines, avec pénalités de retard</w:t>
+              <w:t xml:space="preserve">4 semaines à compter du démarrage, avec pénalités de retard</w:t>
             </w:r>
           </w:p>
         </w:tc>
@@ -928,6 +901,74 @@
                 <w:szCs w:val="19"/>
               </w:rPr>
               <w:t xml:space="preserve">15 minutes</w:t>
+            </w:r>
+          </w:p>
+        </w:tc>
+      </w:tr>
+      <w:tr>
+        <w:tc>
+          <w:tcPr>
+            <w:tcW w:type="dxa" w:w="3600"/>
+            <w:tcBorders>
+              <w:top w:val="single" w:color="C9CFD8" w:sz="4"/>
+              <w:left w:val="single" w:color="C9CFD8" w:sz="4"/>
+              <w:bottom w:val="single" w:color="C9CFD8" w:sz="4"/>
+              <w:right w:val="single" w:color="C9CFD8" w:sz="4"/>
+            </w:tcBorders>
+            <w:tcMar>
+              <w:top w:type="dxa" w:w="60"/>
+              <w:left w:type="dxa" w:w="100"/>
+              <w:bottom w:type="dxa" w:w="60"/>
+              <w:right w:type="dxa" w:w="100"/>
+            </w:tcMar>
+            <w:vAlign w:val="center"/>
+          </w:tcPr>
+          <w:p>
+            <w:pPr>
+              <w:spacing w:after="0"/>
+            </w:pPr>
+            <w:r>
+              <w:rPr>
+                <w:rFonts w:ascii="Calibri" w:cs="Calibri" w:eastAsia="Calibri" w:hAnsi="Calibri"/>
+                <w:b w:val="false"/>
+                <w:bCs w:val="false"/>
+                <w:sz w:val="19"/>
+                <w:szCs w:val="19"/>
+              </w:rPr>
+              <w:t xml:space="preserve">Disponibilité cible</w:t>
+            </w:r>
+          </w:p>
+        </w:tc>
+        <w:tc>
+          <w:tcPr>
+            <w:tcW w:type="dxa" w:w="6038"/>
+            <w:tcBorders>
+              <w:top w:val="single" w:color="C9CFD8" w:sz="4"/>
+              <w:left w:val="single" w:color="C9CFD8" w:sz="4"/>
+              <w:bottom w:val="single" w:color="C9CFD8" w:sz="4"/>
+              <w:right w:val="single" w:color="C9CFD8" w:sz="4"/>
+            </w:tcBorders>
+            <w:tcMar>
+              <w:top w:type="dxa" w:w="60"/>
+              <w:left w:type="dxa" w:w="100"/>
+              <w:bottom w:type="dxa" w:w="60"/>
+              <w:right w:type="dxa" w:w="100"/>
+            </w:tcMar>
+            <w:vAlign w:val="center"/>
+          </w:tcPr>
+          <w:p>
+            <w:pPr>
+              <w:spacing w:after="0"/>
+            </w:pPr>
+            <w:r>
+              <w:rPr>
+                <w:rFonts w:ascii="Calibri" w:cs="Calibri" w:eastAsia="Calibri" w:hAnsi="Calibri"/>
+                <w:b w:val="false"/>
+                <w:bCs w:val="false"/>
+                <w:sz w:val="19"/>
+                <w:szCs w:val="19"/>
+              </w:rPr>
+              <w:t xml:space="preserve">99,5 % par mois</w:t>
             </w:r>
           </w:p>
         </w:tc>
@@ -956,7 +997,7 @@
           <w:sz w:val="21"/>
           <w:szCs w:val="21"/>
         </w:rPr>
-        <w:t xml:space="preserve">Le montant de 50 000 000 GNF HT résulte d'un effort commercial de 42 000 000 GNF sur la valeur des prestations, que nous consentons pour accompagner le groupe dans un projet structurant et inscrire notre relation dans la durée. Le périmètre, le planning et les engagements de service ne sont pas réduits.</w:t>
+        <w:t xml:space="preserve">Pour 50 000 000 GNF HT, le groupe obtient un noyau comptable utilisé par des dizaines de milliers d'entreprises, le multi-sociétés, le rapprochement bancaire, les circuits d'approbation à plusieurs niveaux, une évolutivité sans nouveau développement, et deux applications conçues pour ses équipes. Aucune licence, aucune limite de nombre d'utilisateurs.</w:t>
       </w:r>
     </w:p>
     <w:p>
@@ -991,1040 +1032,7 @@
           <w:sz w:val="32"/>
           <w:szCs w:val="32"/>
         </w:rPr>
-        <w:t xml:space="preserve">2. Suite donnée à vos observations</w:t>
-      </w:r>
-    </w:p>
-    <w:p>
-      <w:pPr>
-        <w:spacing w:after="140" w:before="0"/>
-      </w:pPr>
-      <w:r>
-        <w:rPr>
-          <w:rFonts w:ascii="Calibri" w:cs="Calibri" w:eastAsia="Calibri" w:hAnsi="Calibri"/>
-          <w:sz w:val="22"/>
-          <w:szCs w:val="22"/>
-        </w:rPr>
-        <w:t xml:space="preserve">Le tableau reprend, dans l'ordre de votre courrier, chaque point soulevé et la réponse apportée dans cette révision.</w:t>
-      </w:r>
-    </w:p>
-    <w:tbl>
-      <w:tblPr>
-        <w:tblW w:type="dxa" w:w="9638"/>
-        <w:tblBorders>
-          <w:top w:val="single" w:color="auto" w:sz="4"/>
-          <w:left w:val="single" w:color="auto" w:sz="4"/>
-          <w:bottom w:val="single" w:color="auto" w:sz="4"/>
-          <w:right w:val="single" w:color="auto" w:sz="4"/>
-          <w:insideH w:val="single" w:color="auto" w:sz="4"/>
-          <w:insideV w:val="single" w:color="auto" w:sz="4"/>
-        </w:tblBorders>
-      </w:tblPr>
-      <w:tblGrid>
-        <w:gridCol w:w="1700"/>
-        <w:gridCol w:w="2500"/>
-        <w:gridCol w:w="4238"/>
-        <w:gridCol w:w="1200"/>
-      </w:tblGrid>
-      <w:tr>
-        <w:trPr>
-          <w:tblHeader/>
-        </w:trPr>
-        <w:tc>
-          <w:tcPr>
-            <w:tcW w:type="dxa" w:w="1700"/>
-            <w:tcBorders>
-              <w:top w:val="single" w:color="C9CFD8" w:sz="4"/>
-              <w:left w:val="single" w:color="C9CFD8" w:sz="4"/>
-              <w:bottom w:val="single" w:color="C9CFD8" w:sz="4"/>
-              <w:right w:val="single" w:color="C9CFD8" w:sz="4"/>
-            </w:tcBorders>
-            <w:shd w:fill="1C1E6B" w:color="auto" w:val="clear"/>
-            <w:tcMar>
-              <w:top w:type="dxa" w:w="60"/>
-              <w:left w:type="dxa" w:w="100"/>
-              <w:bottom w:type="dxa" w:w="60"/>
-              <w:right w:type="dxa" w:w="100"/>
-            </w:tcMar>
-            <w:vAlign w:val="center"/>
-          </w:tcPr>
-          <w:p>
-            <w:pPr>
-              <w:spacing w:after="0"/>
-            </w:pPr>
-            <w:r>
-              <w:rPr>
-                <w:rFonts w:ascii="Calibri" w:cs="Calibri" w:eastAsia="Calibri" w:hAnsi="Calibri"/>
-                <w:b/>
-                <w:bCs/>
-                <w:color w:val="FFFFFF"/>
-                <w:sz w:val="19"/>
-                <w:szCs w:val="19"/>
-              </w:rPr>
-              <w:t xml:space="preserve">Point</w:t>
-            </w:r>
-          </w:p>
-        </w:tc>
-        <w:tc>
-          <w:tcPr>
-            <w:tcW w:type="dxa" w:w="2500"/>
-            <w:tcBorders>
-              <w:top w:val="single" w:color="C9CFD8" w:sz="4"/>
-              <w:left w:val="single" w:color="C9CFD8" w:sz="4"/>
-              <w:bottom w:val="single" w:color="C9CFD8" w:sz="4"/>
-              <w:right w:val="single" w:color="C9CFD8" w:sz="4"/>
-            </w:tcBorders>
-            <w:shd w:fill="1C1E6B" w:color="auto" w:val="clear"/>
-            <w:tcMar>
-              <w:top w:type="dxa" w:w="60"/>
-              <w:left w:type="dxa" w:w="100"/>
-              <w:bottom w:type="dxa" w:w="60"/>
-              <w:right w:type="dxa" w:w="100"/>
-            </w:tcMar>
-            <w:vAlign w:val="center"/>
-          </w:tcPr>
-          <w:p>
-            <w:pPr>
-              <w:spacing w:after="0"/>
-            </w:pPr>
-            <w:r>
-              <w:rPr>
-                <w:rFonts w:ascii="Calibri" w:cs="Calibri" w:eastAsia="Calibri" w:hAnsi="Calibri"/>
-                <w:b/>
-                <w:bCs/>
-                <w:color w:val="FFFFFF"/>
-                <w:sz w:val="19"/>
-                <w:szCs w:val="19"/>
-              </w:rPr>
-              <w:t xml:space="preserve">Votre demande</w:t>
-            </w:r>
-          </w:p>
-        </w:tc>
-        <w:tc>
-          <w:tcPr>
-            <w:tcW w:type="dxa" w:w="4238"/>
-            <w:tcBorders>
-              <w:top w:val="single" w:color="C9CFD8" w:sz="4"/>
-              <w:left w:val="single" w:color="C9CFD8" w:sz="4"/>
-              <w:bottom w:val="single" w:color="C9CFD8" w:sz="4"/>
-              <w:right w:val="single" w:color="C9CFD8" w:sz="4"/>
-            </w:tcBorders>
-            <w:shd w:fill="1C1E6B" w:color="auto" w:val="clear"/>
-            <w:tcMar>
-              <w:top w:type="dxa" w:w="60"/>
-              <w:left w:type="dxa" w:w="100"/>
-              <w:bottom w:type="dxa" w:w="60"/>
-              <w:right w:type="dxa" w:w="100"/>
-            </w:tcMar>
-            <w:vAlign w:val="center"/>
-          </w:tcPr>
-          <w:p>
-            <w:pPr>
-              <w:spacing w:after="0"/>
-            </w:pPr>
-            <w:r>
-              <w:rPr>
-                <w:rFonts w:ascii="Calibri" w:cs="Calibri" w:eastAsia="Calibri" w:hAnsi="Calibri"/>
-                <w:b/>
-                <w:bCs/>
-                <w:color w:val="FFFFFF"/>
-                <w:sz w:val="19"/>
-                <w:szCs w:val="19"/>
-              </w:rPr>
-              <w:t xml:space="preserve">Notre réponse</w:t>
-            </w:r>
-          </w:p>
-        </w:tc>
-        <w:tc>
-          <w:tcPr>
-            <w:tcW w:type="dxa" w:w="1200"/>
-            <w:tcBorders>
-              <w:top w:val="single" w:color="C9CFD8" w:sz="4"/>
-              <w:left w:val="single" w:color="C9CFD8" w:sz="4"/>
-              <w:bottom w:val="single" w:color="C9CFD8" w:sz="4"/>
-              <w:right w:val="single" w:color="C9CFD8" w:sz="4"/>
-            </w:tcBorders>
-            <w:shd w:fill="1C1E6B" w:color="auto" w:val="clear"/>
-            <w:tcMar>
-              <w:top w:type="dxa" w:w="60"/>
-              <w:left w:type="dxa" w:w="100"/>
-              <w:bottom w:type="dxa" w:w="60"/>
-              <w:right w:type="dxa" w:w="100"/>
-            </w:tcMar>
-            <w:vAlign w:val="center"/>
-          </w:tcPr>
-          <w:p>
-            <w:pPr>
-              <w:spacing w:after="0"/>
-            </w:pPr>
-            <w:r>
-              <w:rPr>
-                <w:rFonts w:ascii="Calibri" w:cs="Calibri" w:eastAsia="Calibri" w:hAnsi="Calibri"/>
-                <w:b/>
-                <w:bCs/>
-                <w:color w:val="FFFFFF"/>
-                <w:sz w:val="19"/>
-                <w:szCs w:val="19"/>
-              </w:rPr>
-              <w:t xml:space="preserve">Chapitre</w:t>
-            </w:r>
-          </w:p>
-        </w:tc>
-      </w:tr>
-      <w:tr>
-        <w:tc>
-          <w:tcPr>
-            <w:tcW w:type="dxa" w:w="1700"/>
-            <w:tcBorders>
-              <w:top w:val="single" w:color="C9CFD8" w:sz="4"/>
-              <w:left w:val="single" w:color="C9CFD8" w:sz="4"/>
-              <w:bottom w:val="single" w:color="C9CFD8" w:sz="4"/>
-              <w:right w:val="single" w:color="C9CFD8" w:sz="4"/>
-            </w:tcBorders>
-            <w:tcMar>
-              <w:top w:type="dxa" w:w="60"/>
-              <w:left w:type="dxa" w:w="100"/>
-              <w:bottom w:type="dxa" w:w="60"/>
-              <w:right w:type="dxa" w:w="100"/>
-            </w:tcMar>
-            <w:vAlign w:val="center"/>
-          </w:tcPr>
-          <w:p>
-            <w:pPr>
-              <w:spacing w:after="0"/>
-            </w:pPr>
-            <w:r>
-              <w:rPr>
-                <w:rFonts w:ascii="Calibri" w:cs="Calibri" w:eastAsia="Calibri" w:hAnsi="Calibri"/>
-                <w:b w:val="false"/>
-                <w:bCs w:val="false"/>
-                <w:sz w:val="19"/>
-                <w:szCs w:val="19"/>
-              </w:rPr>
-              <w:t xml:space="preserve">1. Validité de l'offre</w:t>
-            </w:r>
-          </w:p>
-        </w:tc>
-        <w:tc>
-          <w:tcPr>
-            <w:tcW w:type="dxa" w:w="2500"/>
-            <w:tcBorders>
-              <w:top w:val="single" w:color="C9CFD8" w:sz="4"/>
-              <w:left w:val="single" w:color="C9CFD8" w:sz="4"/>
-              <w:bottom w:val="single" w:color="C9CFD8" w:sz="4"/>
-              <w:right w:val="single" w:color="C9CFD8" w:sz="4"/>
-            </w:tcBorders>
-            <w:tcMar>
-              <w:top w:type="dxa" w:w="60"/>
-              <w:left w:type="dxa" w:w="100"/>
-              <w:bottom w:type="dxa" w:w="60"/>
-              <w:right w:type="dxa" w:w="100"/>
-            </w:tcMar>
-            <w:vAlign w:val="center"/>
-          </w:tcPr>
-          <w:p>
-            <w:pPr>
-              <w:spacing w:after="0"/>
-            </w:pPr>
-            <w:r>
-              <w:rPr>
-                <w:rFonts w:ascii="Calibri" w:cs="Calibri" w:eastAsia="Calibri" w:hAnsi="Calibri"/>
-                <w:b w:val="false"/>
-                <w:bCs w:val="false"/>
-                <w:sz w:val="19"/>
-                <w:szCs w:val="19"/>
-              </w:rPr>
-              <w:t xml:space="preserve">Trois durées différentes dans le document ; confirmer la durée applicable.</w:t>
-            </w:r>
-          </w:p>
-        </w:tc>
-        <w:tc>
-          <w:tcPr>
-            <w:tcW w:type="dxa" w:w="4238"/>
-            <w:tcBorders>
-              <w:top w:val="single" w:color="C9CFD8" w:sz="4"/>
-              <w:left w:val="single" w:color="C9CFD8" w:sz="4"/>
-              <w:bottom w:val="single" w:color="C9CFD8" w:sz="4"/>
-              <w:right w:val="single" w:color="C9CFD8" w:sz="4"/>
-            </w:tcBorders>
-            <w:tcMar>
-              <w:top w:type="dxa" w:w="60"/>
-              <w:left w:type="dxa" w:w="100"/>
-              <w:bottom w:type="dxa" w:w="60"/>
-              <w:right w:type="dxa" w:w="100"/>
-            </w:tcMar>
-            <w:vAlign w:val="center"/>
-          </w:tcPr>
-          <w:p>
-            <w:pPr>
-              <w:spacing w:after="0"/>
-            </w:pPr>
-            <w:r>
-              <w:rPr>
-                <w:rFonts w:ascii="Calibri" w:cs="Calibri" w:eastAsia="Calibri" w:hAnsi="Calibri"/>
-                <w:b w:val="false"/>
-                <w:bCs w:val="false"/>
-                <w:sz w:val="19"/>
-                <w:szCs w:val="19"/>
-              </w:rPr>
-              <w:t xml:space="preserve">La durée applicable est de 30 jours. Les mentions de 60 jours en page de garde et au chapitre 8.6 de l'offre initiale étaient une erreur matérielle. La présente révision indique 30 jours à compter du 29 septembre 2026, soit jusqu'au 29 octobre 2026, en page de garde, en synthèse et dans les engagements contractuels.</w:t>
-            </w:r>
-          </w:p>
-        </w:tc>
-        <w:tc>
-          <w:tcPr>
-            <w:tcW w:type="dxa" w:w="1200"/>
-            <w:tcBorders>
-              <w:top w:val="single" w:color="C9CFD8" w:sz="4"/>
-              <w:left w:val="single" w:color="C9CFD8" w:sz="4"/>
-              <w:bottom w:val="single" w:color="C9CFD8" w:sz="4"/>
-              <w:right w:val="single" w:color="C9CFD8" w:sz="4"/>
-            </w:tcBorders>
-            <w:tcMar>
-              <w:top w:type="dxa" w:w="60"/>
-              <w:left w:type="dxa" w:w="100"/>
-              <w:bottom w:type="dxa" w:w="60"/>
-              <w:right w:type="dxa" w:w="100"/>
-            </w:tcMar>
-            <w:vAlign w:val="center"/>
-          </w:tcPr>
-          <w:p>
-            <w:pPr>
-              <w:spacing w:after="0"/>
-            </w:pPr>
-            <w:r>
-              <w:rPr>
-                <w:rFonts w:ascii="Calibri" w:cs="Calibri" w:eastAsia="Calibri" w:hAnsi="Calibri"/>
-                <w:b w:val="false"/>
-                <w:bCs w:val="false"/>
-                <w:sz w:val="19"/>
-                <w:szCs w:val="19"/>
-              </w:rPr>
-              <w:t xml:space="preserve">1, 8.6</w:t>
-            </w:r>
-          </w:p>
-        </w:tc>
-      </w:tr>
-      <w:tr>
-        <w:tc>
-          <w:tcPr>
-            <w:tcW w:type="dxa" w:w="1700"/>
-            <w:tcBorders>
-              <w:top w:val="single" w:color="C9CFD8" w:sz="4"/>
-              <w:left w:val="single" w:color="C9CFD8" w:sz="4"/>
-              <w:bottom w:val="single" w:color="C9CFD8" w:sz="4"/>
-              <w:right w:val="single" w:color="C9CFD8" w:sz="4"/>
-            </w:tcBorders>
-            <w:shd w:fill="F2F4F7" w:color="auto" w:val="clear"/>
-            <w:tcMar>
-              <w:top w:type="dxa" w:w="60"/>
-              <w:left w:type="dxa" w:w="100"/>
-              <w:bottom w:type="dxa" w:w="60"/>
-              <w:right w:type="dxa" w:w="100"/>
-            </w:tcMar>
-            <w:vAlign w:val="center"/>
-          </w:tcPr>
-          <w:p>
-            <w:pPr>
-              <w:spacing w:after="0"/>
-            </w:pPr>
-            <w:r>
-              <w:rPr>
-                <w:rFonts w:ascii="Calibri" w:cs="Calibri" w:eastAsia="Calibri" w:hAnsi="Calibri"/>
-                <w:b w:val="false"/>
-                <w:bCs w:val="false"/>
-                <w:sz w:val="19"/>
-                <w:szCs w:val="19"/>
-              </w:rPr>
-              <w:t xml:space="preserve">3. Garantie corrective</w:t>
-            </w:r>
-          </w:p>
-        </w:tc>
-        <w:tc>
-          <w:tcPr>
-            <w:tcW w:type="dxa" w:w="2500"/>
-            <w:tcBorders>
-              <w:top w:val="single" w:color="C9CFD8" w:sz="4"/>
-              <w:left w:val="single" w:color="C9CFD8" w:sz="4"/>
-              <w:bottom w:val="single" w:color="C9CFD8" w:sz="4"/>
-              <w:right w:val="single" w:color="C9CFD8" w:sz="4"/>
-            </w:tcBorders>
-            <w:shd w:fill="F2F4F7" w:color="auto" w:val="clear"/>
-            <w:tcMar>
-              <w:top w:type="dxa" w:w="60"/>
-              <w:left w:type="dxa" w:w="100"/>
-              <w:bottom w:type="dxa" w:w="60"/>
-              <w:right w:type="dxa" w:w="100"/>
-            </w:tcMar>
-            <w:vAlign w:val="center"/>
-          </w:tcPr>
-          <w:p>
-            <w:pPr>
-              <w:spacing w:after="0"/>
-            </w:pPr>
-            <w:r>
-              <w:rPr>
-                <w:rFonts w:ascii="Calibri" w:cs="Calibri" w:eastAsia="Calibri" w:hAnsi="Calibri"/>
-                <w:b w:val="false"/>
-                <w:bCs w:val="false"/>
-                <w:sz w:val="19"/>
-                <w:szCs w:val="19"/>
-              </w:rPr>
-              <w:t xml:space="preserve">Six mois au minimum, couvrant la première clôture annuelle complète.</w:t>
-            </w:r>
-          </w:p>
-        </w:tc>
-        <w:tc>
-          <w:tcPr>
-            <w:tcW w:type="dxa" w:w="4238"/>
-            <w:tcBorders>
-              <w:top w:val="single" w:color="C9CFD8" w:sz="4"/>
-              <w:left w:val="single" w:color="C9CFD8" w:sz="4"/>
-              <w:bottom w:val="single" w:color="C9CFD8" w:sz="4"/>
-              <w:right w:val="single" w:color="C9CFD8" w:sz="4"/>
-            </w:tcBorders>
-            <w:shd w:fill="F2F4F7" w:color="auto" w:val="clear"/>
-            <w:tcMar>
-              <w:top w:type="dxa" w:w="60"/>
-              <w:left w:type="dxa" w:w="100"/>
-              <w:bottom w:type="dxa" w:w="60"/>
-              <w:right w:type="dxa" w:w="100"/>
-            </w:tcMar>
-            <w:vAlign w:val="center"/>
-          </w:tcPr>
-          <w:p>
-            <w:pPr>
-              <w:spacing w:after="0"/>
-            </w:pPr>
-            <w:r>
-              <w:rPr>
-                <w:rFonts w:ascii="Calibri" w:cs="Calibri" w:eastAsia="Calibri" w:hAnsi="Calibri"/>
-                <w:b w:val="false"/>
-                <w:bCs w:val="false"/>
-                <w:sz w:val="19"/>
-                <w:szCs w:val="19"/>
-              </w:rPr>
-              <w:t xml:space="preserve">Garantie portée de 3 à 6 mois à compter du procès-verbal de mise en production, sans surcoût. Elle couvre expressément les anomalies révélées lors de la clôture de l'exercice et des déclarations de fin d'exercice. Pour une commande passée avant fin octobre 2026, elle court au moins jusqu'en mai 2027, donc au-delà de la clôture 2026 et du dépôt des états financiers annuels.</w:t>
-            </w:r>
-          </w:p>
-        </w:tc>
-        <w:tc>
-          <w:tcPr>
-            <w:tcW w:type="dxa" w:w="1200"/>
-            <w:tcBorders>
-              <w:top w:val="single" w:color="C9CFD8" w:sz="4"/>
-              <w:left w:val="single" w:color="C9CFD8" w:sz="4"/>
-              <w:bottom w:val="single" w:color="C9CFD8" w:sz="4"/>
-              <w:right w:val="single" w:color="C9CFD8" w:sz="4"/>
-            </w:tcBorders>
-            <w:shd w:fill="F2F4F7" w:color="auto" w:val="clear"/>
-            <w:tcMar>
-              <w:top w:type="dxa" w:w="60"/>
-              <w:left w:type="dxa" w:w="100"/>
-              <w:bottom w:type="dxa" w:w="60"/>
-              <w:right w:type="dxa" w:w="100"/>
-            </w:tcMar>
-            <w:vAlign w:val="center"/>
-          </w:tcPr>
-          <w:p>
-            <w:pPr>
-              <w:spacing w:after="0"/>
-            </w:pPr>
-            <w:r>
-              <w:rPr>
-                <w:rFonts w:ascii="Calibri" w:cs="Calibri" w:eastAsia="Calibri" w:hAnsi="Calibri"/>
-                <w:b w:val="false"/>
-                <w:bCs w:val="false"/>
-                <w:sz w:val="19"/>
-                <w:szCs w:val="19"/>
-              </w:rPr>
-              <w:t xml:space="preserve">7.1, 8.6</w:t>
-            </w:r>
-          </w:p>
-        </w:tc>
-      </w:tr>
-      <w:tr>
-        <w:tc>
-          <w:tcPr>
-            <w:tcW w:type="dxa" w:w="1700"/>
-            <w:tcBorders>
-              <w:top w:val="single" w:color="C9CFD8" w:sz="4"/>
-              <w:left w:val="single" w:color="C9CFD8" w:sz="4"/>
-              <w:bottom w:val="single" w:color="C9CFD8" w:sz="4"/>
-              <w:right w:val="single" w:color="C9CFD8" w:sz="4"/>
-            </w:tcBorders>
-            <w:tcMar>
-              <w:top w:type="dxa" w:w="60"/>
-              <w:left w:type="dxa" w:w="100"/>
-              <w:bottom w:type="dxa" w:w="60"/>
-              <w:right w:type="dxa" w:w="100"/>
-            </w:tcMar>
-            <w:vAlign w:val="center"/>
-          </w:tcPr>
-          <w:p>
-            <w:pPr>
-              <w:spacing w:after="0"/>
-            </w:pPr>
-            <w:r>
-              <w:rPr>
-                <w:rFonts w:ascii="Calibri" w:cs="Calibri" w:eastAsia="Calibri" w:hAnsi="Calibri"/>
-                <w:b w:val="false"/>
-                <w:bCs w:val="false"/>
-                <w:sz w:val="19"/>
-                <w:szCs w:val="19"/>
-              </w:rPr>
-              <w:t xml:space="preserve">5. Sauvegardes</w:t>
-            </w:r>
-          </w:p>
-        </w:tc>
-        <w:tc>
-          <w:tcPr>
-            <w:tcW w:type="dxa" w:w="2500"/>
-            <w:tcBorders>
-              <w:top w:val="single" w:color="C9CFD8" w:sz="4"/>
-              <w:left w:val="single" w:color="C9CFD8" w:sz="4"/>
-              <w:bottom w:val="single" w:color="C9CFD8" w:sz="4"/>
-              <w:right w:val="single" w:color="C9CFD8" w:sz="4"/>
-            </w:tcBorders>
-            <w:tcMar>
-              <w:top w:type="dxa" w:w="60"/>
-              <w:left w:type="dxa" w:w="100"/>
-              <w:bottom w:type="dxa" w:w="60"/>
-              <w:right w:type="dxa" w:w="100"/>
-            </w:tcMar>
-            <w:vAlign w:val="center"/>
-          </w:tcPr>
-          <w:p>
-            <w:pPr>
-              <w:spacing w:after="0"/>
-            </w:pPr>
-            <w:r>
-              <w:rPr>
-                <w:rFonts w:ascii="Calibri" w:cs="Calibri" w:eastAsia="Calibri" w:hAnsi="Calibri"/>
-                <w:b w:val="false"/>
-                <w:bCs w:val="false"/>
-                <w:sz w:val="19"/>
-                <w:szCs w:val="19"/>
-              </w:rPr>
-              <w:t xml:space="preserve">Une sauvegarde plus fréquente, au moins pour les modules comptables, et ses conditions.</w:t>
-            </w:r>
-          </w:p>
-        </w:tc>
-        <w:tc>
-          <w:tcPr>
-            <w:tcW w:type="dxa" w:w="4238"/>
-            <w:tcBorders>
-              <w:top w:val="single" w:color="C9CFD8" w:sz="4"/>
-              <w:left w:val="single" w:color="C9CFD8" w:sz="4"/>
-              <w:bottom w:val="single" w:color="C9CFD8" w:sz="4"/>
-              <w:right w:val="single" w:color="C9CFD8" w:sz="4"/>
-            </w:tcBorders>
-            <w:tcMar>
-              <w:top w:type="dxa" w:w="60"/>
-              <w:left w:type="dxa" w:w="100"/>
-              <w:bottom w:type="dxa" w:w="60"/>
-              <w:right w:type="dxa" w:w="100"/>
-            </w:tcMar>
-            <w:vAlign w:val="center"/>
-          </w:tcPr>
-          <w:p>
-            <w:pPr>
-              <w:spacing w:after="0"/>
-            </w:pPr>
-            <w:r>
-              <w:rPr>
-                <w:rFonts w:ascii="Calibri" w:cs="Calibri" w:eastAsia="Calibri" w:hAnsi="Calibri"/>
-                <w:b w:val="false"/>
-                <w:bCs w:val="false"/>
-                <w:sz w:val="19"/>
-                <w:szCs w:val="19"/>
-              </w:rPr>
-              <w:t xml:space="preserve">Journalisation continue des transactions de la base, copiée hors site toutes les 15 minutes, en plus de la sauvegarde complète quotidienne. La perte de données maximale passe de 24 heures à 15 minutes, pour tous les modules puisque la plateforme repose sur une base unique. Incluse sans surcoût, la première année comme dans le forfait annuel.</w:t>
-            </w:r>
-          </w:p>
-        </w:tc>
-        <w:tc>
-          <w:tcPr>
-            <w:tcW w:type="dxa" w:w="1200"/>
-            <w:tcBorders>
-              <w:top w:val="single" w:color="C9CFD8" w:sz="4"/>
-              <w:left w:val="single" w:color="C9CFD8" w:sz="4"/>
-              <w:bottom w:val="single" w:color="C9CFD8" w:sz="4"/>
-              <w:right w:val="single" w:color="C9CFD8" w:sz="4"/>
-            </w:tcBorders>
-            <w:tcMar>
-              <w:top w:type="dxa" w:w="60"/>
-              <w:left w:type="dxa" w:w="100"/>
-              <w:bottom w:type="dxa" w:w="60"/>
-              <w:right w:type="dxa" w:w="100"/>
-            </w:tcMar>
-            <w:vAlign w:val="center"/>
-          </w:tcPr>
-          <w:p>
-            <w:pPr>
-              <w:spacing w:after="0"/>
-            </w:pPr>
-            <w:r>
-              <w:rPr>
-                <w:rFonts w:ascii="Calibri" w:cs="Calibri" w:eastAsia="Calibri" w:hAnsi="Calibri"/>
-                <w:b w:val="false"/>
-                <w:bCs w:val="false"/>
-                <w:sz w:val="19"/>
-                <w:szCs w:val="19"/>
-              </w:rPr>
-              <w:t xml:space="preserve">6.2</w:t>
-            </w:r>
-          </w:p>
-        </w:tc>
-      </w:tr>
-      <w:tr>
-        <w:tc>
-          <w:tcPr>
-            <w:tcW w:type="dxa" w:w="1700"/>
-            <w:tcBorders>
-              <w:top w:val="single" w:color="C9CFD8" w:sz="4"/>
-              <w:left w:val="single" w:color="C9CFD8" w:sz="4"/>
-              <w:bottom w:val="single" w:color="C9CFD8" w:sz="4"/>
-              <w:right w:val="single" w:color="C9CFD8" w:sz="4"/>
-            </w:tcBorders>
-            <w:shd w:fill="F2F4F7" w:color="auto" w:val="clear"/>
-            <w:tcMar>
-              <w:top w:type="dxa" w:w="60"/>
-              <w:left w:type="dxa" w:w="100"/>
-              <w:bottom w:type="dxa" w:w="60"/>
-              <w:right w:type="dxa" w:w="100"/>
-            </w:tcMar>
-            <w:vAlign w:val="center"/>
-          </w:tcPr>
-          <w:p>
-            <w:pPr>
-              <w:spacing w:after="0"/>
-            </w:pPr>
-            <w:r>
-              <w:rPr>
-                <w:rFonts w:ascii="Calibri" w:cs="Calibri" w:eastAsia="Calibri" w:hAnsi="Calibri"/>
-                <w:b w:val="false"/>
-                <w:bCs w:val="false"/>
-                <w:sz w:val="19"/>
-                <w:szCs w:val="19"/>
-              </w:rPr>
-              <w:t xml:space="preserve">6. Calendrier</w:t>
-            </w:r>
-          </w:p>
-        </w:tc>
-        <w:tc>
-          <w:tcPr>
-            <w:tcW w:type="dxa" w:w="2500"/>
-            <w:tcBorders>
-              <w:top w:val="single" w:color="C9CFD8" w:sz="4"/>
-              <w:left w:val="single" w:color="C9CFD8" w:sz="4"/>
-              <w:bottom w:val="single" w:color="C9CFD8" w:sz="4"/>
-              <w:right w:val="single" w:color="C9CFD8" w:sz="4"/>
-            </w:tcBorders>
-            <w:shd w:fill="F2F4F7" w:color="auto" w:val="clear"/>
-            <w:tcMar>
-              <w:top w:type="dxa" w:w="60"/>
-              <w:left w:type="dxa" w:w="100"/>
-              <w:bottom w:type="dxa" w:w="60"/>
-              <w:right w:type="dxa" w:w="100"/>
-            </w:tcMar>
-            <w:vAlign w:val="center"/>
-          </w:tcPr>
-          <w:p>
-            <w:pPr>
-              <w:spacing w:after="0"/>
-            </w:pPr>
-            <w:r>
-              <w:rPr>
-                <w:rFonts w:ascii="Calibri" w:cs="Calibri" w:eastAsia="Calibri" w:hAnsi="Calibri"/>
-                <w:b w:val="false"/>
-                <w:bCs w:val="false"/>
-                <w:sz w:val="19"/>
-                <w:szCs w:val="19"/>
-              </w:rPr>
-              <w:t xml:space="preserve">Insertion d'une clause de pénalité de retard imputable au prestataire.</w:t>
-            </w:r>
-          </w:p>
-        </w:tc>
-        <w:tc>
-          <w:tcPr>
-            <w:tcW w:type="dxa" w:w="4238"/>
-            <w:tcBorders>
-              <w:top w:val="single" w:color="C9CFD8" w:sz="4"/>
-              <w:left w:val="single" w:color="C9CFD8" w:sz="4"/>
-              <w:bottom w:val="single" w:color="C9CFD8" w:sz="4"/>
-              <w:right w:val="single" w:color="C9CFD8" w:sz="4"/>
-            </w:tcBorders>
-            <w:shd w:fill="F2F4F7" w:color="auto" w:val="clear"/>
-            <w:tcMar>
-              <w:top w:type="dxa" w:w="60"/>
-              <w:left w:type="dxa" w:w="100"/>
-              <w:bottom w:type="dxa" w:w="60"/>
-              <w:right w:type="dxa" w:w="100"/>
-            </w:tcMar>
-            <w:vAlign w:val="center"/>
-          </w:tcPr>
-          <w:p>
-            <w:pPr>
-              <w:spacing w:after="0"/>
-            </w:pPr>
-            <w:r>
-              <w:rPr>
-                <w:rFonts w:ascii="Calibri" w:cs="Calibri" w:eastAsia="Calibri" w:hAnsi="Calibri"/>
-                <w:b w:val="false"/>
-                <w:bCs w:val="false"/>
-                <w:sz w:val="19"/>
-                <w:szCs w:val="19"/>
-              </w:rPr>
-              <w:t xml:space="preserve">Clause insérée : 0,1 % du montant HT de la commande par jour calendaire de retard imputable à E-VOLUTION XP, plafonnée à 5 %, avec une date contractuelle de mise en production fixée au démarrage et des règles de neutralisation des retards non imputables.</w:t>
-            </w:r>
-          </w:p>
-        </w:tc>
-        <w:tc>
-          <w:tcPr>
-            <w:tcW w:type="dxa" w:w="1200"/>
-            <w:tcBorders>
-              <w:top w:val="single" w:color="C9CFD8" w:sz="4"/>
-              <w:left w:val="single" w:color="C9CFD8" w:sz="4"/>
-              <w:bottom w:val="single" w:color="C9CFD8" w:sz="4"/>
-              <w:right w:val="single" w:color="C9CFD8" w:sz="4"/>
-            </w:tcBorders>
-            <w:shd w:fill="F2F4F7" w:color="auto" w:val="clear"/>
-            <w:tcMar>
-              <w:top w:type="dxa" w:w="60"/>
-              <w:left w:type="dxa" w:w="100"/>
-              <w:bottom w:type="dxa" w:w="60"/>
-              <w:right w:type="dxa" w:w="100"/>
-            </w:tcMar>
-            <w:vAlign w:val="center"/>
-          </w:tcPr>
-          <w:p>
-            <w:pPr>
-              <w:spacing w:after="0"/>
-            </w:pPr>
-            <w:r>
-              <w:rPr>
-                <w:rFonts w:ascii="Calibri" w:cs="Calibri" w:eastAsia="Calibri" w:hAnsi="Calibri"/>
-                <w:b w:val="false"/>
-                <w:bCs w:val="false"/>
-                <w:sz w:val="19"/>
-                <w:szCs w:val="19"/>
-              </w:rPr>
-              <w:t xml:space="preserve">7.6, 8.6</w:t>
-            </w:r>
-          </w:p>
-        </w:tc>
-      </w:tr>
-      <w:tr>
-        <w:tc>
-          <w:tcPr>
-            <w:tcW w:type="dxa" w:w="1700"/>
-            <w:tcBorders>
-              <w:top w:val="single" w:color="C9CFD8" w:sz="4"/>
-              <w:left w:val="single" w:color="C9CFD8" w:sz="4"/>
-              <w:bottom w:val="single" w:color="C9CFD8" w:sz="4"/>
-              <w:right w:val="single" w:color="C9CFD8" w:sz="4"/>
-            </w:tcBorders>
-            <w:tcMar>
-              <w:top w:type="dxa" w:w="60"/>
-              <w:left w:type="dxa" w:w="100"/>
-              <w:bottom w:type="dxa" w:w="60"/>
-              <w:right w:type="dxa" w:w="100"/>
-            </w:tcMar>
-            <w:vAlign w:val="center"/>
-          </w:tcPr>
-          <w:p>
-            <w:pPr>
-              <w:spacing w:after="0"/>
-            </w:pPr>
-            <w:r>
-              <w:rPr>
-                <w:rFonts w:ascii="Calibri" w:cs="Calibri" w:eastAsia="Calibri" w:hAnsi="Calibri"/>
-                <w:b w:val="false"/>
-                <w:bCs w:val="false"/>
-                <w:sz w:val="19"/>
-                <w:szCs w:val="19"/>
-              </w:rPr>
-              <w:t xml:space="preserve">7. Maintenance évolutive</w:t>
-            </w:r>
-          </w:p>
-        </w:tc>
-        <w:tc>
-          <w:tcPr>
-            <w:tcW w:type="dxa" w:w="2500"/>
-            <w:tcBorders>
-              <w:top w:val="single" w:color="C9CFD8" w:sz="4"/>
-              <w:left w:val="single" w:color="C9CFD8" w:sz="4"/>
-              <w:bottom w:val="single" w:color="C9CFD8" w:sz="4"/>
-              <w:right w:val="single" w:color="C9CFD8" w:sz="4"/>
-            </w:tcBorders>
-            <w:tcMar>
-              <w:top w:type="dxa" w:w="60"/>
-              <w:left w:type="dxa" w:w="100"/>
-              <w:bottom w:type="dxa" w:w="60"/>
-              <w:right w:type="dxa" w:w="100"/>
-            </w:tcMar>
-            <w:vAlign w:val="center"/>
-          </w:tcPr>
-          <w:p>
-            <w:pPr>
-              <w:spacing w:after="0"/>
-            </w:pPr>
-            <w:r>
-              <w:rPr>
-                <w:rFonts w:ascii="Calibri" w:cs="Calibri" w:eastAsia="Calibri" w:hAnsi="Calibri"/>
-                <w:b w:val="false"/>
-                <w:bCs w:val="false"/>
-                <w:sz w:val="19"/>
-                <w:szCs w:val="19"/>
-              </w:rPr>
-              <w:t xml:space="preserve">Critères permettant de qualifier une évolution comme incluse ou facturable.</w:t>
-            </w:r>
-          </w:p>
-        </w:tc>
-        <w:tc>
-          <w:tcPr>
-            <w:tcW w:type="dxa" w:w="4238"/>
-            <w:tcBorders>
-              <w:top w:val="single" w:color="C9CFD8" w:sz="4"/>
-              <w:left w:val="single" w:color="C9CFD8" w:sz="4"/>
-              <w:bottom w:val="single" w:color="C9CFD8" w:sz="4"/>
-              <w:right w:val="single" w:color="C9CFD8" w:sz="4"/>
-            </w:tcBorders>
-            <w:tcMar>
-              <w:top w:type="dxa" w:w="60"/>
-              <w:left w:type="dxa" w:w="100"/>
-              <w:bottom w:type="dxa" w:w="60"/>
-              <w:right w:type="dxa" w:w="100"/>
-            </w:tcMar>
-            <w:vAlign w:val="center"/>
-          </w:tcPr>
-          <w:p>
-            <w:pPr>
-              <w:spacing w:after="0"/>
-            </w:pPr>
-            <w:r>
-              <w:rPr>
-                <w:rFonts w:ascii="Calibri" w:cs="Calibri" w:eastAsia="Calibri" w:hAnsi="Calibri"/>
-                <w:b w:val="false"/>
-                <w:bCs w:val="false"/>
-                <w:sz w:val="19"/>
-                <w:szCs w:val="19"/>
-              </w:rPr>
-              <w:t xml:space="preserve">Définition précise d'une évolution incluse (charge au plus égale à 2 jours, sans nouveau module ni interface externe), liste d'exemples inclus et facturables, procédure de qualification écrite sous 2 jours ouvrés, décompte trimestriel et tarif journalier des évolutions facturables.</w:t>
-            </w:r>
-          </w:p>
-        </w:tc>
-        <w:tc>
-          <w:tcPr>
-            <w:tcW w:type="dxa" w:w="1200"/>
-            <w:tcBorders>
-              <w:top w:val="single" w:color="C9CFD8" w:sz="4"/>
-              <w:left w:val="single" w:color="C9CFD8" w:sz="4"/>
-              <w:bottom w:val="single" w:color="C9CFD8" w:sz="4"/>
-              <w:right w:val="single" w:color="C9CFD8" w:sz="4"/>
-            </w:tcBorders>
-            <w:tcMar>
-              <w:top w:type="dxa" w:w="60"/>
-              <w:left w:type="dxa" w:w="100"/>
-              <w:bottom w:type="dxa" w:w="60"/>
-              <w:right w:type="dxa" w:w="100"/>
-            </w:tcMar>
-            <w:vAlign w:val="center"/>
-          </w:tcPr>
-          <w:p>
-            <w:pPr>
-              <w:spacing w:after="0"/>
-            </w:pPr>
-            <w:r>
-              <w:rPr>
-                <w:rFonts w:ascii="Calibri" w:cs="Calibri" w:eastAsia="Calibri" w:hAnsi="Calibri"/>
-                <w:b w:val="false"/>
-                <w:bCs w:val="false"/>
-                <w:sz w:val="19"/>
-                <w:szCs w:val="19"/>
-              </w:rPr>
-              <w:t xml:space="preserve">8.4</w:t>
-            </w:r>
-          </w:p>
-        </w:tc>
-      </w:tr>
-      <w:tr>
-        <w:tc>
-          <w:tcPr>
-            <w:tcW w:type="dxa" w:w="1700"/>
-            <w:tcBorders>
-              <w:top w:val="single" w:color="C9CFD8" w:sz="4"/>
-              <w:left w:val="single" w:color="C9CFD8" w:sz="4"/>
-              <w:bottom w:val="single" w:color="C9CFD8" w:sz="4"/>
-              <w:right w:val="single" w:color="C9CFD8" w:sz="4"/>
-            </w:tcBorders>
-            <w:shd w:fill="F2F4F7" w:color="auto" w:val="clear"/>
-            <w:tcMar>
-              <w:top w:type="dxa" w:w="60"/>
-              <w:left w:type="dxa" w:w="100"/>
-              <w:bottom w:type="dxa" w:w="60"/>
-              <w:right w:type="dxa" w:w="100"/>
-            </w:tcMar>
-            <w:vAlign w:val="center"/>
-          </w:tcPr>
-          <w:p>
-            <w:pPr>
-              <w:spacing w:after="0"/>
-            </w:pPr>
-            <w:r>
-              <w:rPr>
-                <w:rFonts w:ascii="Calibri" w:cs="Calibri" w:eastAsia="Calibri" w:hAnsi="Calibri"/>
-                <w:b w:val="false"/>
-                <w:bCs w:val="false"/>
-                <w:sz w:val="19"/>
-                <w:szCs w:val="19"/>
-              </w:rPr>
-              <w:t xml:space="preserve">8. Conditions financières</w:t>
-            </w:r>
-          </w:p>
-        </w:tc>
-        <w:tc>
-          <w:tcPr>
-            <w:tcW w:type="dxa" w:w="2500"/>
-            <w:tcBorders>
-              <w:top w:val="single" w:color="C9CFD8" w:sz="4"/>
-              <w:left w:val="single" w:color="C9CFD8" w:sz="4"/>
-              <w:bottom w:val="single" w:color="C9CFD8" w:sz="4"/>
-              <w:right w:val="single" w:color="C9CFD8" w:sz="4"/>
-            </w:tcBorders>
-            <w:shd w:fill="F2F4F7" w:color="auto" w:val="clear"/>
-            <w:tcMar>
-              <w:top w:type="dxa" w:w="60"/>
-              <w:left w:type="dxa" w:w="100"/>
-              <w:bottom w:type="dxa" w:w="60"/>
-              <w:right w:type="dxa" w:w="100"/>
-            </w:tcMar>
-            <w:vAlign w:val="center"/>
-          </w:tcPr>
-          <w:p>
-            <w:pPr>
-              <w:spacing w:after="0"/>
-            </w:pPr>
-            <w:r>
-              <w:rPr>
-                <w:rFonts w:ascii="Calibri" w:cs="Calibri" w:eastAsia="Calibri" w:hAnsi="Calibri"/>
-                <w:b w:val="false"/>
-                <w:bCs w:val="false"/>
-                <w:sz w:val="19"/>
-                <w:szCs w:val="19"/>
-              </w:rPr>
-              <w:t xml:space="preserve">Offre à 40 000 000 GNF HT pour un périmètre inchangé.</w:t>
-            </w:r>
-          </w:p>
-        </w:tc>
-        <w:tc>
-          <w:tcPr>
-            <w:tcW w:type="dxa" w:w="4238"/>
-            <w:tcBorders>
-              <w:top w:val="single" w:color="C9CFD8" w:sz="4"/>
-              <w:left w:val="single" w:color="C9CFD8" w:sz="4"/>
-              <w:bottom w:val="single" w:color="C9CFD8" w:sz="4"/>
-              <w:right w:val="single" w:color="C9CFD8" w:sz="4"/>
-            </w:tcBorders>
-            <w:shd w:fill="F2F4F7" w:color="auto" w:val="clear"/>
-            <w:tcMar>
-              <w:top w:type="dxa" w:w="60"/>
-              <w:left w:type="dxa" w:w="100"/>
-              <w:bottom w:type="dxa" w:w="60"/>
-              <w:right w:type="dxa" w:w="100"/>
-            </w:tcMar>
-            <w:vAlign w:val="center"/>
-          </w:tcPr>
-          <w:p>
-            <w:pPr>
-              <w:spacing w:after="0"/>
-            </w:pPr>
-            <w:r>
-              <w:rPr>
-                <w:rFonts w:ascii="Calibri" w:cs="Calibri" w:eastAsia="Calibri" w:hAnsi="Calibri"/>
-                <w:b w:val="false"/>
-                <w:bCs w:val="false"/>
-                <w:sz w:val="19"/>
-                <w:szCs w:val="19"/>
-              </w:rPr>
-              <w:t xml:space="preserve">Le périmètre est maintenu dans son intégralité. La valeur des prestations, détaillée au chapitre 8.2, s'établit à 92 000 000 GNF HT. Nous consentons un effort commercial de 42 000 000 GNF qui ramène l'investissement à 50 000 000 GNF HT, hébergement de la première année compris. Ce montant constitue notre meilleure offre pour le périmètre complet ; en dessous, nous devrions réduire le périmètre ou le niveau d'engagement, ce que nous ne recommandons pas pour un outil comptable de groupe.</w:t>
-            </w:r>
-          </w:p>
-        </w:tc>
-        <w:tc>
-          <w:tcPr>
-            <w:tcW w:type="dxa" w:w="1200"/>
-            <w:tcBorders>
-              <w:top w:val="single" w:color="C9CFD8" w:sz="4"/>
-              <w:left w:val="single" w:color="C9CFD8" w:sz="4"/>
-              <w:bottom w:val="single" w:color="C9CFD8" w:sz="4"/>
-              <w:right w:val="single" w:color="C9CFD8" w:sz="4"/>
-            </w:tcBorders>
-            <w:shd w:fill="F2F4F7" w:color="auto" w:val="clear"/>
-            <w:tcMar>
-              <w:top w:type="dxa" w:w="60"/>
-              <w:left w:type="dxa" w:w="100"/>
-              <w:bottom w:type="dxa" w:w="60"/>
-              <w:right w:type="dxa" w:w="100"/>
-            </w:tcMar>
-            <w:vAlign w:val="center"/>
-          </w:tcPr>
-          <w:p>
-            <w:pPr>
-              <w:spacing w:after="0"/>
-            </w:pPr>
-            <w:r>
-              <w:rPr>
-                <w:rFonts w:ascii="Calibri" w:cs="Calibri" w:eastAsia="Calibri" w:hAnsi="Calibri"/>
-                <w:b w:val="false"/>
-                <w:bCs w:val="false"/>
-                <w:sz w:val="19"/>
-                <w:szCs w:val="19"/>
-              </w:rPr>
-              <w:t xml:space="preserve">8.2</w:t>
-            </w:r>
-          </w:p>
-        </w:tc>
-      </w:tr>
-    </w:tbl>
-    <w:p>
-      <w:pPr>
-        <w:spacing w:after="160"/>
-      </w:pPr>
-    </w:p>
-    <w:p>
-      <w:pPr>
-        <w:spacing w:after="140" w:before="0"/>
-      </w:pPr>
-      <w:r>
-        <w:rPr>
-          <w:rFonts w:ascii="Calibri" w:cs="Calibri" w:eastAsia="Calibri" w:hAnsi="Calibri"/>
-          <w:sz w:val="22"/>
-          <w:szCs w:val="22"/>
-        </w:rPr>
-        <w:t xml:space="preserve">La proposition 2, deux applications indépendantes, n'est pas reprise dans cette révision, votre analyse portant sur la proposition 1. Elle reste disponible sur demande.</w:t>
-      </w:r>
-    </w:p>
-    <w:p>
-      <w:r>
-        <w:br w:type="page"/>
-      </w:r>
-    </w:p>
-    <w:p>
-      <w:pPr>
-        <w:pStyle w:val="Heading1"/>
-        <w:spacing w:after="200" w:before="240"/>
-      </w:pPr>
-      <w:r>
-        <w:rPr>
-          <w:rFonts w:ascii="Calibri" w:cs="Calibri" w:eastAsia="Calibri" w:hAnsi="Calibri"/>
-          <w:b/>
-          <w:bCs/>
-          <w:color w:val="1C1E6B"/>
-          <w:sz w:val="32"/>
-          <w:szCs w:val="32"/>
-        </w:rPr>
-        <w:t xml:space="preserve">3. Notre compréhension de votre besoin</w:t>
+        <w:t xml:space="preserve">2. Notre compréhension de votre besoin</w:t>
       </w:r>
     </w:p>
     <w:p>
@@ -2041,7 +1049,7 @@
           <w:sz w:val="26"/>
           <w:szCs w:val="26"/>
         </w:rPr>
-        <w:t xml:space="preserve">3.1 Le groupe et ses activités</w:t>
+        <w:t xml:space="preserve">2.1 Le groupe et ses activités</w:t>
       </w:r>
     </w:p>
     <w:p>
@@ -2733,7 +1741,7 @@
           <w:sz w:val="26"/>
           <w:szCs w:val="26"/>
         </w:rPr>
-        <w:t xml:space="preserve">3.2 Les deux projets</w:t>
+        <w:t xml:space="preserve">2.2 Les deux projets</w:t>
       </w:r>
     </w:p>
     <w:p>
@@ -2746,7 +1754,7 @@
           <w:sz w:val="22"/>
           <w:szCs w:val="22"/>
         </w:rPr>
-        <w:t xml:space="preserve">Projet 1 : la digitalisation du département Finance. Le courrier du responsable financier liste vingt attentes, de la comptabilité SYSCOHADA révisée à la rentabilité par trajet, en passant par la consolidation groupe, les workflows d'approbation, la piste d'audit et la disponibilité garantie. Le tableau du chapitre 5 répond point par point.</w:t>
+        <w:t xml:space="preserve">Projet 1 : la digitalisation du département Finance. Le courrier du responsable financier liste vingt attentes, de la comptabilité SYSCOHADA révisée à la rentabilité par trajet, en passant par la consolidation groupe, les workflows d'approbation, la piste d'audit et la disponibilité garantie. Le tableau du chapitre 4 répond point par point.</w:t>
       </w:r>
     </w:p>
     <w:p>
@@ -2776,7 +1784,7 @@
           <w:sz w:val="26"/>
           <w:szCs w:val="26"/>
         </w:rPr>
-        <w:t xml:space="preserve">3.3 Ce que nous retenons des prototypes existants</w:t>
+        <w:t xml:space="preserve">2.3 Ce que nous retenons des prototypes existants</w:t>
       </w:r>
     </w:p>
     <w:p>
@@ -2896,7 +1904,7 @@
           <w:sz w:val="32"/>
           <w:szCs w:val="32"/>
         </w:rPr>
-        <w:t xml:space="preserve">4. La solution : plateforme intégrée sur noyau de gestion</w:t>
+        <w:t xml:space="preserve">3. La solution : plateforme intégrée sur noyau de gestion</w:t>
       </w:r>
     </w:p>
     <w:p>
@@ -2913,7 +1921,7 @@
           <w:sz w:val="26"/>
           <w:szCs w:val="26"/>
         </w:rPr>
-        <w:t xml:space="preserve">4.1 Principe : un noyau invisible, des applications à votre image</w:t>
+        <w:t xml:space="preserve">3.1 Principe : un noyau invisible, des applications à votre image</w:t>
       </w:r>
     </w:p>
     <w:p>
@@ -2990,7 +1998,7 @@
           <w:sz w:val="26"/>
           <w:szCs w:val="26"/>
         </w:rPr>
-        <w:t xml:space="preserve">4.2 Architecture</w:t>
+        <w:t xml:space="preserve">3.2 Architecture</w:t>
       </w:r>
     </w:p>
     <w:tbl>
@@ -3651,7 +2659,7 @@
           <w:sz w:val="26"/>
           <w:szCs w:val="26"/>
         </w:rPr>
-        <w:t xml:space="preserve">4.3 EGUITRA Finance : les écrans</w:t>
+        <w:t xml:space="preserve">3.3 EGUITRA Finance : les écrans</w:t>
       </w:r>
     </w:p>
     <w:tbl>
@@ -5020,7 +4028,7 @@
           <w:sz w:val="26"/>
           <w:szCs w:val="26"/>
         </w:rPr>
-        <w:t xml:space="preserve">4.4 Transport pétrolier : la rotation comme source unique</w:t>
+        <w:t xml:space="preserve">3.4 Transport pétrolier : la rotation comme source unique</w:t>
       </w:r>
     </w:p>
     <w:p>
@@ -5050,7 +4058,7 @@
           <w:sz w:val="26"/>
           <w:szCs w:val="26"/>
         </w:rPr>
-        <w:t xml:space="preserve">4.5 AxisPro Suite</w:t>
+        <w:t xml:space="preserve">3.5 AxisPro Suite</w:t>
       </w:r>
     </w:p>
     <w:p>
@@ -5880,7 +4888,7 @@
           <w:sz w:val="26"/>
           <w:szCs w:val="26"/>
         </w:rPr>
-        <w:t xml:space="preserve">4.6 Modules communautaires retenus</w:t>
+        <w:t xml:space="preserve">3.6 Modules communautaires retenus</w:t>
       </w:r>
     </w:p>
     <w:tbl>
@@ -6632,7 +5640,7 @@
           <w:sz w:val="32"/>
           <w:szCs w:val="32"/>
         </w:rPr>
-        <w:t xml:space="preserve">5. Couverture des attentes du département Finance</w:t>
+        <w:t xml:space="preserve">4. Couverture des attentes du département Finance</w:t>
       </w:r>
     </w:p>
     <w:p>
@@ -6645,7 +5653,7 @@
           <w:sz w:val="22"/>
           <w:szCs w:val="22"/>
         </w:rPr>
-        <w:t xml:space="preserve">Les vingt attentes du courrier du responsable financier sont couvertes. Le tableau précise, pour chacune, le mécanisme retenu.</w:t>
+        <w:t xml:space="preserve">Les vingt attentes exprimées dans le courrier du responsable financier sont couvertes. Le tableau précise, pour chacune, le mécanisme retenu.</w:t>
       </w:r>
     </w:p>
     <w:tbl>
@@ -8144,7 +7152,7 @@
           <w:sz w:val="32"/>
           <w:szCs w:val="32"/>
         </w:rPr>
-        <w:t xml:space="preserve">6. Hébergement, sécurité et exploitation</w:t>
+        <w:t xml:space="preserve">5. Hébergement, sécurité et exploitation</w:t>
       </w:r>
     </w:p>
     <w:p>
@@ -8161,7 +7169,7 @@
           <w:sz w:val="26"/>
           <w:szCs w:val="26"/>
         </w:rPr>
-        <w:t xml:space="preserve">6.1 Infrastructure</w:t>
+        <w:t xml:space="preserve">5.1 Infrastructure</w:t>
       </w:r>
     </w:p>
     <w:p>
@@ -8250,7 +7258,7 @@
           <w:sz w:val="26"/>
           <w:szCs w:val="26"/>
         </w:rPr>
-        <w:t xml:space="preserve">6.2 Sauvegardes et continuité</w:t>
+        <w:t xml:space="preserve">5.2 Sauvegardes et continuité</w:t>
       </w:r>
     </w:p>
     <w:p>
@@ -8263,7 +7271,7 @@
           <w:sz w:val="22"/>
           <w:szCs w:val="22"/>
         </w:rPr>
-        <w:t xml:space="preserve">En réponse à votre point 5, le dispositif de sauvegarde est renforcé. La base de données est unique pour l'ensemble des modules : le renforcement s'applique donc à la comptabilité comme aux modules métier et à AxisPro Suite, sans distinction. Il est inclus sans surcoût, la première année comme dans le forfait annuel.</w:t>
+        <w:t xml:space="preserve">La base de données est unique pour l'ensemble des modules : le dispositif de sauvegarde s'applique à la comptabilité comme aux modules métier et à AxisPro Suite, sans distinction. Il est inclus dans le montant de l'offre la première année, puis dans le forfait annuel.</w:t>
       </w:r>
     </w:p>
     <w:tbl>
@@ -8696,7 +7704,7 @@
                 <w:sz w:val="19"/>
                 <w:szCs w:val="19"/>
               </w:rPr>
-              <w:t xml:space="preserve">15 minutes (24 heures dans l'offre initiale)</w:t>
+              <w:t xml:space="preserve">15 minutes</w:t>
             </w:r>
           </w:p>
         </w:tc>
@@ -8929,7 +7937,7 @@
           <w:sz w:val="26"/>
           <w:szCs w:val="26"/>
         </w:rPr>
-        <w:t xml:space="preserve">6.3 Sécurité</w:t>
+        <w:t xml:space="preserve">5.3 Sécurité</w:t>
       </w:r>
     </w:p>
     <w:p>
@@ -9054,7 +8062,7 @@
           <w:sz w:val="26"/>
           <w:szCs w:val="26"/>
         </w:rPr>
-        <w:t xml:space="preserve">6.4 Réversibilité</w:t>
+        <w:t xml:space="preserve">5.4 Réversibilité</w:t>
       </w:r>
     </w:p>
     <w:p>
@@ -9089,7 +8097,7 @@
           <w:sz w:val="32"/>
           <w:szCs w:val="32"/>
         </w:rPr>
-        <w:t xml:space="preserve">7. Démarche et planning en quatre semaines</w:t>
+        <w:t xml:space="preserve">6. Démarche et planning en quatre semaines</w:t>
       </w:r>
     </w:p>
     <w:p>
@@ -9106,7 +8114,7 @@
           <w:sz w:val="26"/>
           <w:szCs w:val="26"/>
         </w:rPr>
-        <w:t xml:space="preserve">7.1 Planning</w:t>
+        <w:t xml:space="preserve">6.1 Planning</w:t>
       </w:r>
     </w:p>
     <w:p>
@@ -9119,7 +8127,7 @@
           <w:sz w:val="22"/>
           <w:szCs w:val="22"/>
         </w:rPr>
-        <w:t xml:space="preserve">La plateforme est mise en production en 4 semaines à compter du démarrage, par une équipe dédiée à temps plein. Le démarrage, noté T0, est la date à laquelle l'acompte de commande est encaissé et les prérequis du chapitre 7.5 sont remis ; la date contractuelle de mise en production est T0 plus 4 semaines. Ce délai repose sur trois conditions : les prototypes de la direction servent de spécification, les composants d'interface déjà développés par E-VOLUTION XP sont réutilisés, et les référents du client sont disponibles chaque semaine.</w:t>
+        <w:t xml:space="preserve">La plateforme est mise en production en 4 semaines à compter du démarrage, par une équipe dédiée à temps plein. Le démarrage, noté T0, est la date à laquelle l'acompte de commande est encaissé et les prérequis du chapitre 6.5 sont remis ; la date contractuelle de mise en production est T0 plus 4 semaines. Ce délai repose sur trois conditions : les prototypes de la direction servent de spécification, les composants d'interface déjà développés par E-VOLUTION XP sont réutilisés, et les référents du client sont disponibles chaque semaine.</w:t>
       </w:r>
     </w:p>
     <w:tbl>
@@ -9845,7 +8853,7 @@
           <w:sz w:val="22"/>
           <w:szCs w:val="22"/>
         </w:rPr>
-        <w:t xml:space="preserve">À l'issue de la semaine 4, E-VOLUTION XP assure quatre semaines d'accompagnement renforcé sur site et à distance, puis la garantie corrective de 6 mois décrite au chapitre 8.6.</w:t>
+        <w:t xml:space="preserve">À l'issue de la semaine 4, E-VOLUTION XP assure quatre semaines d'accompagnement renforcé sur site et à distance, puis la garantie corrective de 6 mois décrite au chapitre 7.6.</w:t>
       </w:r>
     </w:p>
     <w:p>
@@ -9862,7 +8870,7 @@
           <w:sz w:val="26"/>
           <w:szCs w:val="26"/>
         </w:rPr>
-        <w:t xml:space="preserve">7.2 Reprise des données</w:t>
+        <w:t xml:space="preserve">6.2 Reprise des données</w:t>
       </w:r>
     </w:p>
     <w:p>
@@ -9892,7 +8900,7 @@
           <w:sz w:val="26"/>
           <w:szCs w:val="26"/>
         </w:rPr>
-        <w:t xml:space="preserve">7.3 Recette et formation</w:t>
+        <w:t xml:space="preserve">6.3 Recette et formation</w:t>
       </w:r>
     </w:p>
     <w:p>
@@ -9963,7 +8971,7 @@
           <w:sz w:val="26"/>
           <w:szCs w:val="26"/>
         </w:rPr>
-        <w:t xml:space="preserve">7.4 Gouvernance</w:t>
+        <w:t xml:space="preserve">6.4 Gouvernance</w:t>
       </w:r>
     </w:p>
     <w:p>
@@ -10034,7 +9042,7 @@
           <w:sz w:val="26"/>
           <w:szCs w:val="26"/>
         </w:rPr>
-        <w:t xml:space="preserve">7.5 Prérequis côté client</w:t>
+        <w:t xml:space="preserve">6.5 Prérequis côté client</w:t>
       </w:r>
     </w:p>
     <w:p>
@@ -10123,7 +9131,7 @@
           <w:sz w:val="26"/>
           <w:szCs w:val="26"/>
         </w:rPr>
-        <w:t xml:space="preserve">7.6 Respect du délai et pénalités de retard</w:t>
+        <w:t xml:space="preserve">6.6 Respect du délai et pénalités de retard</w:t>
       </w:r>
     </w:p>
     <w:p>
@@ -10136,7 +9144,7 @@
           <w:sz w:val="22"/>
           <w:szCs w:val="22"/>
         </w:rPr>
-        <w:t xml:space="preserve">En réponse à votre point 6, E-VOLUTION XP s'engage sur la date contractuelle de mise en production selon les règles suivantes :</w:t>
+        <w:t xml:space="preserve">E-VOLUTION XP s'engage sur la date contractuelle de mise en production selon les règles suivantes :</w:t>
       </w:r>
     </w:p>
     <w:p>
@@ -10230,7 +9238,7 @@
           <w:sz w:val="32"/>
           <w:szCs w:val="32"/>
         </w:rPr>
-        <w:t xml:space="preserve">8. Offre financière</w:t>
+        <w:t xml:space="preserve">7. Offre financière</w:t>
       </w:r>
     </w:p>
     <w:p>
@@ -10247,7 +9255,7 @@
           <w:sz w:val="26"/>
           <w:szCs w:val="26"/>
         </w:rPr>
-        <w:t xml:space="preserve">8.1 Hypothèses</w:t>
+        <w:t xml:space="preserve">7.1 Hypothèses</w:t>
       </w:r>
     </w:p>
     <w:p>
@@ -10283,7 +9291,7 @@
           <w:sz w:val="22"/>
           <w:szCs w:val="22"/>
         </w:rPr>
-        <w:t xml:space="preserve">Prix forfaitaire : le montant est ferme pour le périmètre décrit aux chapitres 4 et 5. Toute évolution de périmètre fait l'objet d'un avenant chiffré.</w:t>
+        <w:t xml:space="preserve">Prix forfaitaire : le montant est ferme pour le périmètre décrit aux chapitres 3 et 4. Toute évolution de périmètre fait l'objet d'un avenant chiffré.</w:t>
       </w:r>
     </w:p>
     <w:p>
@@ -10319,7 +9327,7 @@
           <w:sz w:val="22"/>
           <w:szCs w:val="22"/>
         </w:rPr>
-        <w:t xml:space="preserve">L'hébergement de la première année, avec le dispositif de sauvegarde renforcé du chapitre 6.2, est compris dans le montant.</w:t>
+        <w:t xml:space="preserve">L'hébergement de la première année, avec le dispositif de sauvegarde du chapitre 5.2, est compris dans le montant.</w:t>
       </w:r>
     </w:p>
     <w:p>
@@ -10336,7 +9344,7 @@
           <w:sz w:val="26"/>
           <w:szCs w:val="26"/>
         </w:rPr>
-        <w:t xml:space="preserve">8.2 Proposition 1 : Plateforme intégrée EGUITRA Finance et AxisPro Suite sur noyau de gestion</w:t>
+        <w:t xml:space="preserve">7.2 Décomposition du montant</w:t>
       </w:r>
     </w:p>
     <w:p>
@@ -10349,7 +9357,7 @@
           <w:sz w:val="22"/>
           <w:szCs w:val="22"/>
         </w:rPr>
-        <w:t xml:space="preserve">Les postes sont valorisés comme dans l'offre initiale. L'effort commercial demandé au point 8 de votre courrier est appliqué sur le total, pour un périmètre inchangé.</w:t>
+        <w:t xml:space="preserve">Plateforme intégrée EGUITRA Finance et AxisPro Suite sur noyau de gestion. Prix forfaitaire, hébergement de la première année compris.</w:t>
       </w:r>
     </w:p>
     <w:tbl>
@@ -10365,8 +9373,9 @@
         </w:tblBorders>
       </w:tblPr>
       <w:tblGrid>
-        <w:gridCol w:w="7238"/>
-        <w:gridCol w:w="2400"/>
+        <w:gridCol w:w="6238"/>
+        <w:gridCol w:w="2200"/>
+        <w:gridCol w:w="1200"/>
       </w:tblGrid>
       <w:tr>
         <w:trPr>
@@ -10374,7 +9383,7 @@
         </w:trPr>
         <w:tc>
           <w:tcPr>
-            <w:tcW w:type="dxa" w:w="7238"/>
+            <w:tcW w:type="dxa" w:w="6238"/>
             <w:tcBorders>
               <w:top w:val="single" w:color="C9CFD8" w:sz="4"/>
               <w:left w:val="single" w:color="C9CFD8" w:sz="4"/>
@@ -10409,7 +9418,7 @@
         </w:tc>
         <w:tc>
           <w:tcPr>
-            <w:tcW w:type="dxa" w:w="2400"/>
+            <w:tcW w:type="dxa" w:w="2200"/>
             <w:tcBorders>
               <w:top w:val="single" w:color="C9CFD8" w:sz="4"/>
               <w:left w:val="single" w:color="C9CFD8" w:sz="4"/>
@@ -10442,11 +9451,46 @@
             </w:r>
           </w:p>
         </w:tc>
+        <w:tc>
+          <w:tcPr>
+            <w:tcW w:type="dxa" w:w="1200"/>
+            <w:tcBorders>
+              <w:top w:val="single" w:color="C9CFD8" w:sz="4"/>
+              <w:left w:val="single" w:color="C9CFD8" w:sz="4"/>
+              <w:bottom w:val="single" w:color="C9CFD8" w:sz="4"/>
+              <w:right w:val="single" w:color="C9CFD8" w:sz="4"/>
+            </w:tcBorders>
+            <w:shd w:fill="1C1E6B" w:color="auto" w:val="clear"/>
+            <w:tcMar>
+              <w:top w:type="dxa" w:w="60"/>
+              <w:left w:type="dxa" w:w="100"/>
+              <w:bottom w:type="dxa" w:w="60"/>
+              <w:right w:type="dxa" w:w="100"/>
+            </w:tcMar>
+            <w:vAlign w:val="center"/>
+          </w:tcPr>
+          <w:p>
+            <w:pPr>
+              <w:spacing w:after="0"/>
+            </w:pPr>
+            <w:r>
+              <w:rPr>
+                <w:rFonts w:ascii="Calibri" w:cs="Calibri" w:eastAsia="Calibri" w:hAnsi="Calibri"/>
+                <w:b/>
+                <w:bCs/>
+                <w:color w:val="FFFFFF"/>
+                <w:sz w:val="19"/>
+                <w:szCs w:val="19"/>
+              </w:rPr>
+              <w:t xml:space="preserve">Part</w:t>
+            </w:r>
+          </w:p>
+        </w:tc>
       </w:tr>
       <w:tr>
         <w:tc>
           <w:tcPr>
-            <w:tcW w:type="dxa" w:w="7238"/>
+            <w:tcW w:type="dxa" w:w="6238"/>
             <w:tcBorders>
               <w:top w:val="single" w:color="C9CFD8" w:sz="4"/>
               <w:left w:val="single" w:color="C9CFD8" w:sz="4"/>
@@ -10479,34 +9523,67 @@
         </w:tc>
         <w:tc>
           <w:tcPr>
-            <w:tcW w:type="dxa" w:w="2400"/>
-            <w:tcBorders>
-              <w:top w:val="single" w:color="C9CFD8" w:sz="4"/>
-              <w:left w:val="single" w:color="C9CFD8" w:sz="4"/>
-              <w:bottom w:val="single" w:color="C9CFD8" w:sz="4"/>
-              <w:right w:val="single" w:color="C9CFD8" w:sz="4"/>
-            </w:tcBorders>
-            <w:tcMar>
-              <w:top w:type="dxa" w:w="60"/>
-              <w:left w:type="dxa" w:w="100"/>
-              <w:bottom w:type="dxa" w:w="60"/>
-              <w:right w:type="dxa" w:w="100"/>
-            </w:tcMar>
-            <w:vAlign w:val="center"/>
-          </w:tcPr>
-          <w:p>
-            <w:pPr>
-              <w:spacing w:after="0"/>
-            </w:pPr>
-            <w:r>
-              <w:rPr>
-                <w:rFonts w:ascii="Calibri" w:cs="Calibri" w:eastAsia="Calibri" w:hAnsi="Calibri"/>
-                <w:b w:val="false"/>
-                <w:bCs w:val="false"/>
-                <w:sz w:val="19"/>
-                <w:szCs w:val="19"/>
-              </w:rPr>
-              <w:t xml:space="preserve">6 000 000 GNF</w:t>
+            <w:tcW w:type="dxa" w:w="2200"/>
+            <w:tcBorders>
+              <w:top w:val="single" w:color="C9CFD8" w:sz="4"/>
+              <w:left w:val="single" w:color="C9CFD8" w:sz="4"/>
+              <w:bottom w:val="single" w:color="C9CFD8" w:sz="4"/>
+              <w:right w:val="single" w:color="C9CFD8" w:sz="4"/>
+            </w:tcBorders>
+            <w:tcMar>
+              <w:top w:type="dxa" w:w="60"/>
+              <w:left w:type="dxa" w:w="100"/>
+              <w:bottom w:type="dxa" w:w="60"/>
+              <w:right w:type="dxa" w:w="100"/>
+            </w:tcMar>
+            <w:vAlign w:val="center"/>
+          </w:tcPr>
+          <w:p>
+            <w:pPr>
+              <w:spacing w:after="0"/>
+            </w:pPr>
+            <w:r>
+              <w:rPr>
+                <w:rFonts w:ascii="Calibri" w:cs="Calibri" w:eastAsia="Calibri" w:hAnsi="Calibri"/>
+                <w:b w:val="false"/>
+                <w:bCs w:val="false"/>
+                <w:sz w:val="19"/>
+                <w:szCs w:val="19"/>
+              </w:rPr>
+              <w:t xml:space="preserve">3 000 000 GNF</w:t>
+            </w:r>
+          </w:p>
+        </w:tc>
+        <w:tc>
+          <w:tcPr>
+            <w:tcW w:type="dxa" w:w="1200"/>
+            <w:tcBorders>
+              <w:top w:val="single" w:color="C9CFD8" w:sz="4"/>
+              <w:left w:val="single" w:color="C9CFD8" w:sz="4"/>
+              <w:bottom w:val="single" w:color="C9CFD8" w:sz="4"/>
+              <w:right w:val="single" w:color="C9CFD8" w:sz="4"/>
+            </w:tcBorders>
+            <w:tcMar>
+              <w:top w:type="dxa" w:w="60"/>
+              <w:left w:type="dxa" w:w="100"/>
+              <w:bottom w:type="dxa" w:w="60"/>
+              <w:right w:type="dxa" w:w="100"/>
+            </w:tcMar>
+            <w:vAlign w:val="center"/>
+          </w:tcPr>
+          <w:p>
+            <w:pPr>
+              <w:spacing w:after="0"/>
+            </w:pPr>
+            <w:r>
+              <w:rPr>
+                <w:rFonts w:ascii="Calibri" w:cs="Calibri" w:eastAsia="Calibri" w:hAnsi="Calibri"/>
+                <w:b w:val="false"/>
+                <w:bCs w:val="false"/>
+                <w:sz w:val="19"/>
+                <w:szCs w:val="19"/>
+              </w:rPr>
+              <w:t xml:space="preserve">6 %</w:t>
             </w:r>
           </w:p>
         </w:tc>
@@ -10514,7 +9591,7 @@
       <w:tr>
         <w:tc>
           <w:tcPr>
-            <w:tcW w:type="dxa" w:w="7238"/>
+            <w:tcW w:type="dxa" w:w="6238"/>
             <w:tcBorders>
               <w:top w:val="single" w:color="C9CFD8" w:sz="4"/>
               <w:left w:val="single" w:color="C9CFD8" w:sz="4"/>
@@ -10548,7 +9625,7 @@
         </w:tc>
         <w:tc>
           <w:tcPr>
-            <w:tcW w:type="dxa" w:w="2400"/>
+            <w:tcW w:type="dxa" w:w="2200"/>
             <w:tcBorders>
               <w:top w:val="single" w:color="C9CFD8" w:sz="4"/>
               <w:left w:val="single" w:color="C9CFD8" w:sz="4"/>
@@ -10576,7 +9653,41 @@
                 <w:sz w:val="19"/>
                 <w:szCs w:val="19"/>
               </w:rPr>
-              <w:t xml:space="preserve">8 000 000 GNF</w:t>
+              <w:t xml:space="preserve">4 000 000 GNF</w:t>
+            </w:r>
+          </w:p>
+        </w:tc>
+        <w:tc>
+          <w:tcPr>
+            <w:tcW w:type="dxa" w:w="1200"/>
+            <w:tcBorders>
+              <w:top w:val="single" w:color="C9CFD8" w:sz="4"/>
+              <w:left w:val="single" w:color="C9CFD8" w:sz="4"/>
+              <w:bottom w:val="single" w:color="C9CFD8" w:sz="4"/>
+              <w:right w:val="single" w:color="C9CFD8" w:sz="4"/>
+            </w:tcBorders>
+            <w:shd w:fill="F2F4F7" w:color="auto" w:val="clear"/>
+            <w:tcMar>
+              <w:top w:type="dxa" w:w="60"/>
+              <w:left w:type="dxa" w:w="100"/>
+              <w:bottom w:type="dxa" w:w="60"/>
+              <w:right w:type="dxa" w:w="100"/>
+            </w:tcMar>
+            <w:vAlign w:val="center"/>
+          </w:tcPr>
+          <w:p>
+            <w:pPr>
+              <w:spacing w:after="0"/>
+            </w:pPr>
+            <w:r>
+              <w:rPr>
+                <w:rFonts w:ascii="Calibri" w:cs="Calibri" w:eastAsia="Calibri" w:hAnsi="Calibri"/>
+                <w:b w:val="false"/>
+                <w:bCs w:val="false"/>
+                <w:sz w:val="19"/>
+                <w:szCs w:val="19"/>
+              </w:rPr>
+              <w:t xml:space="preserve">8 %</w:t>
             </w:r>
           </w:p>
         </w:tc>
@@ -10584,7 +9695,7 @@
       <w:tr>
         <w:tc>
           <w:tcPr>
-            <w:tcW w:type="dxa" w:w="7238"/>
+            <w:tcW w:type="dxa" w:w="6238"/>
             <w:tcBorders>
               <w:top w:val="single" w:color="C9CFD8" w:sz="4"/>
               <w:left w:val="single" w:color="C9CFD8" w:sz="4"/>
@@ -10617,34 +9728,67 @@
         </w:tc>
         <w:tc>
           <w:tcPr>
-            <w:tcW w:type="dxa" w:w="2400"/>
-            <w:tcBorders>
-              <w:top w:val="single" w:color="C9CFD8" w:sz="4"/>
-              <w:left w:val="single" w:color="C9CFD8" w:sz="4"/>
-              <w:bottom w:val="single" w:color="C9CFD8" w:sz="4"/>
-              <w:right w:val="single" w:color="C9CFD8" w:sz="4"/>
-            </w:tcBorders>
-            <w:tcMar>
-              <w:top w:type="dxa" w:w="60"/>
-              <w:left w:type="dxa" w:w="100"/>
-              <w:bottom w:type="dxa" w:w="60"/>
-              <w:right w:type="dxa" w:w="100"/>
-            </w:tcMar>
-            <w:vAlign w:val="center"/>
-          </w:tcPr>
-          <w:p>
-            <w:pPr>
-              <w:spacing w:after="0"/>
-            </w:pPr>
-            <w:r>
-              <w:rPr>
-                <w:rFonts w:ascii="Calibri" w:cs="Calibri" w:eastAsia="Calibri" w:hAnsi="Calibri"/>
-                <w:b w:val="false"/>
-                <w:bCs w:val="false"/>
-                <w:sz w:val="19"/>
-                <w:szCs w:val="19"/>
-              </w:rPr>
-              <w:t xml:space="preserve">32 000 000 GNF</w:t>
+            <w:tcW w:type="dxa" w:w="2200"/>
+            <w:tcBorders>
+              <w:top w:val="single" w:color="C9CFD8" w:sz="4"/>
+              <w:left w:val="single" w:color="C9CFD8" w:sz="4"/>
+              <w:bottom w:val="single" w:color="C9CFD8" w:sz="4"/>
+              <w:right w:val="single" w:color="C9CFD8" w:sz="4"/>
+            </w:tcBorders>
+            <w:tcMar>
+              <w:top w:type="dxa" w:w="60"/>
+              <w:left w:type="dxa" w:w="100"/>
+              <w:bottom w:type="dxa" w:w="60"/>
+              <w:right w:type="dxa" w:w="100"/>
+            </w:tcMar>
+            <w:vAlign w:val="center"/>
+          </w:tcPr>
+          <w:p>
+            <w:pPr>
+              <w:spacing w:after="0"/>
+            </w:pPr>
+            <w:r>
+              <w:rPr>
+                <w:rFonts w:ascii="Calibri" w:cs="Calibri" w:eastAsia="Calibri" w:hAnsi="Calibri"/>
+                <w:b w:val="false"/>
+                <w:bCs w:val="false"/>
+                <w:sz w:val="19"/>
+                <w:szCs w:val="19"/>
+              </w:rPr>
+              <w:t xml:space="preserve">17 000 000 GNF</w:t>
+            </w:r>
+          </w:p>
+        </w:tc>
+        <w:tc>
+          <w:tcPr>
+            <w:tcW w:type="dxa" w:w="1200"/>
+            <w:tcBorders>
+              <w:top w:val="single" w:color="C9CFD8" w:sz="4"/>
+              <w:left w:val="single" w:color="C9CFD8" w:sz="4"/>
+              <w:bottom w:val="single" w:color="C9CFD8" w:sz="4"/>
+              <w:right w:val="single" w:color="C9CFD8" w:sz="4"/>
+            </w:tcBorders>
+            <w:tcMar>
+              <w:top w:type="dxa" w:w="60"/>
+              <w:left w:type="dxa" w:w="100"/>
+              <w:bottom w:type="dxa" w:w="60"/>
+              <w:right w:type="dxa" w:w="100"/>
+            </w:tcMar>
+            <w:vAlign w:val="center"/>
+          </w:tcPr>
+          <w:p>
+            <w:pPr>
+              <w:spacing w:after="0"/>
+            </w:pPr>
+            <w:r>
+              <w:rPr>
+                <w:rFonts w:ascii="Calibri" w:cs="Calibri" w:eastAsia="Calibri" w:hAnsi="Calibri"/>
+                <w:b w:val="false"/>
+                <w:bCs w:val="false"/>
+                <w:sz w:val="19"/>
+                <w:szCs w:val="19"/>
+              </w:rPr>
+              <w:t xml:space="preserve">34 %</w:t>
             </w:r>
           </w:p>
         </w:tc>
@@ -10652,7 +9796,7 @@
       <w:tr>
         <w:tc>
           <w:tcPr>
-            <w:tcW w:type="dxa" w:w="7238"/>
+            <w:tcW w:type="dxa" w:w="6238"/>
             <w:tcBorders>
               <w:top w:val="single" w:color="C9CFD8" w:sz="4"/>
               <w:left w:val="single" w:color="C9CFD8" w:sz="4"/>
@@ -10686,7 +9830,7 @@
         </w:tc>
         <w:tc>
           <w:tcPr>
-            <w:tcW w:type="dxa" w:w="2400"/>
+            <w:tcW w:type="dxa" w:w="2200"/>
             <w:tcBorders>
               <w:top w:val="single" w:color="C9CFD8" w:sz="4"/>
               <w:left w:val="single" w:color="C9CFD8" w:sz="4"/>
@@ -10714,7 +9858,41 @@
                 <w:sz w:val="19"/>
                 <w:szCs w:val="19"/>
               </w:rPr>
-              <w:t xml:space="preserve">14 000 000 GNF</w:t>
+              <w:t xml:space="preserve">7 500 000 GNF</w:t>
+            </w:r>
+          </w:p>
+        </w:tc>
+        <w:tc>
+          <w:tcPr>
+            <w:tcW w:type="dxa" w:w="1200"/>
+            <w:tcBorders>
+              <w:top w:val="single" w:color="C9CFD8" w:sz="4"/>
+              <w:left w:val="single" w:color="C9CFD8" w:sz="4"/>
+              <w:bottom w:val="single" w:color="C9CFD8" w:sz="4"/>
+              <w:right w:val="single" w:color="C9CFD8" w:sz="4"/>
+            </w:tcBorders>
+            <w:shd w:fill="F2F4F7" w:color="auto" w:val="clear"/>
+            <w:tcMar>
+              <w:top w:type="dxa" w:w="60"/>
+              <w:left w:type="dxa" w:w="100"/>
+              <w:bottom w:type="dxa" w:w="60"/>
+              <w:right w:type="dxa" w:w="100"/>
+            </w:tcMar>
+            <w:vAlign w:val="center"/>
+          </w:tcPr>
+          <w:p>
+            <w:pPr>
+              <w:spacing w:after="0"/>
+            </w:pPr>
+            <w:r>
+              <w:rPr>
+                <w:rFonts w:ascii="Calibri" w:cs="Calibri" w:eastAsia="Calibri" w:hAnsi="Calibri"/>
+                <w:b w:val="false"/>
+                <w:bCs w:val="false"/>
+                <w:sz w:val="19"/>
+                <w:szCs w:val="19"/>
+              </w:rPr>
+              <w:t xml:space="preserve">15 %</w:t>
             </w:r>
           </w:p>
         </w:tc>
@@ -10722,7 +9900,7 @@
       <w:tr>
         <w:tc>
           <w:tcPr>
-            <w:tcW w:type="dxa" w:w="7238"/>
+            <w:tcW w:type="dxa" w:w="6238"/>
             <w:tcBorders>
               <w:top w:val="single" w:color="C9CFD8" w:sz="4"/>
               <w:left w:val="single" w:color="C9CFD8" w:sz="4"/>
@@ -10755,34 +9933,67 @@
         </w:tc>
         <w:tc>
           <w:tcPr>
-            <w:tcW w:type="dxa" w:w="2400"/>
-            <w:tcBorders>
-              <w:top w:val="single" w:color="C9CFD8" w:sz="4"/>
-              <w:left w:val="single" w:color="C9CFD8" w:sz="4"/>
-              <w:bottom w:val="single" w:color="C9CFD8" w:sz="4"/>
-              <w:right w:val="single" w:color="C9CFD8" w:sz="4"/>
-            </w:tcBorders>
-            <w:tcMar>
-              <w:top w:type="dxa" w:w="60"/>
-              <w:left w:type="dxa" w:w="100"/>
-              <w:bottom w:type="dxa" w:w="60"/>
-              <w:right w:type="dxa" w:w="100"/>
-            </w:tcMar>
-            <w:vAlign w:val="center"/>
-          </w:tcPr>
-          <w:p>
-            <w:pPr>
-              <w:spacing w:after="0"/>
-            </w:pPr>
-            <w:r>
-              <w:rPr>
-                <w:rFonts w:ascii="Calibri" w:cs="Calibri" w:eastAsia="Calibri" w:hAnsi="Calibri"/>
-                <w:b w:val="false"/>
-                <w:bCs w:val="false"/>
-                <w:sz w:val="19"/>
-                <w:szCs w:val="19"/>
-              </w:rPr>
-              <w:t xml:space="preserve">8 000 000 GNF</w:t>
+            <w:tcW w:type="dxa" w:w="2200"/>
+            <w:tcBorders>
+              <w:top w:val="single" w:color="C9CFD8" w:sz="4"/>
+              <w:left w:val="single" w:color="C9CFD8" w:sz="4"/>
+              <w:bottom w:val="single" w:color="C9CFD8" w:sz="4"/>
+              <w:right w:val="single" w:color="C9CFD8" w:sz="4"/>
+            </w:tcBorders>
+            <w:tcMar>
+              <w:top w:type="dxa" w:w="60"/>
+              <w:left w:type="dxa" w:w="100"/>
+              <w:bottom w:type="dxa" w:w="60"/>
+              <w:right w:type="dxa" w:w="100"/>
+            </w:tcMar>
+            <w:vAlign w:val="center"/>
+          </w:tcPr>
+          <w:p>
+            <w:pPr>
+              <w:spacing w:after="0"/>
+            </w:pPr>
+            <w:r>
+              <w:rPr>
+                <w:rFonts w:ascii="Calibri" w:cs="Calibri" w:eastAsia="Calibri" w:hAnsi="Calibri"/>
+                <w:b w:val="false"/>
+                <w:bCs w:val="false"/>
+                <w:sz w:val="19"/>
+                <w:szCs w:val="19"/>
+              </w:rPr>
+              <w:t xml:space="preserve">4 000 000 GNF</w:t>
+            </w:r>
+          </w:p>
+        </w:tc>
+        <w:tc>
+          <w:tcPr>
+            <w:tcW w:type="dxa" w:w="1200"/>
+            <w:tcBorders>
+              <w:top w:val="single" w:color="C9CFD8" w:sz="4"/>
+              <w:left w:val="single" w:color="C9CFD8" w:sz="4"/>
+              <w:bottom w:val="single" w:color="C9CFD8" w:sz="4"/>
+              <w:right w:val="single" w:color="C9CFD8" w:sz="4"/>
+            </w:tcBorders>
+            <w:tcMar>
+              <w:top w:type="dxa" w:w="60"/>
+              <w:left w:type="dxa" w:w="100"/>
+              <w:bottom w:type="dxa" w:w="60"/>
+              <w:right w:type="dxa" w:w="100"/>
+            </w:tcMar>
+            <w:vAlign w:val="center"/>
+          </w:tcPr>
+          <w:p>
+            <w:pPr>
+              <w:spacing w:after="0"/>
+            </w:pPr>
+            <w:r>
+              <w:rPr>
+                <w:rFonts w:ascii="Calibri" w:cs="Calibri" w:eastAsia="Calibri" w:hAnsi="Calibri"/>
+                <w:b w:val="false"/>
+                <w:bCs w:val="false"/>
+                <w:sz w:val="19"/>
+                <w:szCs w:val="19"/>
+              </w:rPr>
+              <w:t xml:space="preserve">8 %</w:t>
             </w:r>
           </w:p>
         </w:tc>
@@ -10790,7 +10001,7 @@
       <w:tr>
         <w:tc>
           <w:tcPr>
-            <w:tcW w:type="dxa" w:w="7238"/>
+            <w:tcW w:type="dxa" w:w="6238"/>
             <w:tcBorders>
               <w:top w:val="single" w:color="C9CFD8" w:sz="4"/>
               <w:left w:val="single" w:color="C9CFD8" w:sz="4"/>
@@ -10824,7 +10035,7 @@
         </w:tc>
         <w:tc>
           <w:tcPr>
-            <w:tcW w:type="dxa" w:w="2400"/>
+            <w:tcW w:type="dxa" w:w="2200"/>
             <w:tcBorders>
               <w:top w:val="single" w:color="C9CFD8" w:sz="4"/>
               <w:left w:val="single" w:color="C9CFD8" w:sz="4"/>
@@ -10852,7 +10063,41 @@
                 <w:sz w:val="19"/>
                 <w:szCs w:val="19"/>
               </w:rPr>
-              <w:t xml:space="preserve">14 000 000 GNF</w:t>
+              <w:t xml:space="preserve">7 500 000 GNF</w:t>
+            </w:r>
+          </w:p>
+        </w:tc>
+        <w:tc>
+          <w:tcPr>
+            <w:tcW w:type="dxa" w:w="1200"/>
+            <w:tcBorders>
+              <w:top w:val="single" w:color="C9CFD8" w:sz="4"/>
+              <w:left w:val="single" w:color="C9CFD8" w:sz="4"/>
+              <w:bottom w:val="single" w:color="C9CFD8" w:sz="4"/>
+              <w:right w:val="single" w:color="C9CFD8" w:sz="4"/>
+            </w:tcBorders>
+            <w:shd w:fill="F2F4F7" w:color="auto" w:val="clear"/>
+            <w:tcMar>
+              <w:top w:type="dxa" w:w="60"/>
+              <w:left w:type="dxa" w:w="100"/>
+              <w:bottom w:type="dxa" w:w="60"/>
+              <w:right w:type="dxa" w:w="100"/>
+            </w:tcMar>
+            <w:vAlign w:val="center"/>
+          </w:tcPr>
+          <w:p>
+            <w:pPr>
+              <w:spacing w:after="0"/>
+            </w:pPr>
+            <w:r>
+              <w:rPr>
+                <w:rFonts w:ascii="Calibri" w:cs="Calibri" w:eastAsia="Calibri" w:hAnsi="Calibri"/>
+                <w:b w:val="false"/>
+                <w:bCs w:val="false"/>
+                <w:sz w:val="19"/>
+                <w:szCs w:val="19"/>
+              </w:rPr>
+              <w:t xml:space="preserve">15 %</w:t>
             </w:r>
           </w:p>
         </w:tc>
@@ -10860,7 +10105,7 @@
       <w:tr>
         <w:tc>
           <w:tcPr>
-            <w:tcW w:type="dxa" w:w="7238"/>
+            <w:tcW w:type="dxa" w:w="6238"/>
             <w:tcBorders>
               <w:top w:val="single" w:color="C9CFD8" w:sz="4"/>
               <w:left w:val="single" w:color="C9CFD8" w:sz="4"/>
@@ -10893,34 +10138,67 @@
         </w:tc>
         <w:tc>
           <w:tcPr>
-            <w:tcW w:type="dxa" w:w="2400"/>
-            <w:tcBorders>
-              <w:top w:val="single" w:color="C9CFD8" w:sz="4"/>
-              <w:left w:val="single" w:color="C9CFD8" w:sz="4"/>
-              <w:bottom w:val="single" w:color="C9CFD8" w:sz="4"/>
-              <w:right w:val="single" w:color="C9CFD8" w:sz="4"/>
-            </w:tcBorders>
-            <w:tcMar>
-              <w:top w:type="dxa" w:w="60"/>
-              <w:left w:type="dxa" w:w="100"/>
-              <w:bottom w:type="dxa" w:w="60"/>
-              <w:right w:type="dxa" w:w="100"/>
-            </w:tcMar>
-            <w:vAlign w:val="center"/>
-          </w:tcPr>
-          <w:p>
-            <w:pPr>
-              <w:spacing w:after="0"/>
-            </w:pPr>
-            <w:r>
-              <w:rPr>
-                <w:rFonts w:ascii="Calibri" w:cs="Calibri" w:eastAsia="Calibri" w:hAnsi="Calibri"/>
-                <w:b w:val="false"/>
-                <w:bCs w:val="false"/>
-                <w:sz w:val="19"/>
-                <w:szCs w:val="19"/>
-              </w:rPr>
-              <w:t xml:space="preserve">6 000 000 GNF</w:t>
+            <w:tcW w:type="dxa" w:w="2200"/>
+            <w:tcBorders>
+              <w:top w:val="single" w:color="C9CFD8" w:sz="4"/>
+              <w:left w:val="single" w:color="C9CFD8" w:sz="4"/>
+              <w:bottom w:val="single" w:color="C9CFD8" w:sz="4"/>
+              <w:right w:val="single" w:color="C9CFD8" w:sz="4"/>
+            </w:tcBorders>
+            <w:tcMar>
+              <w:top w:type="dxa" w:w="60"/>
+              <w:left w:type="dxa" w:w="100"/>
+              <w:bottom w:type="dxa" w:w="60"/>
+              <w:right w:type="dxa" w:w="100"/>
+            </w:tcMar>
+            <w:vAlign w:val="center"/>
+          </w:tcPr>
+          <w:p>
+            <w:pPr>
+              <w:spacing w:after="0"/>
+            </w:pPr>
+            <w:r>
+              <w:rPr>
+                <w:rFonts w:ascii="Calibri" w:cs="Calibri" w:eastAsia="Calibri" w:hAnsi="Calibri"/>
+                <w:b w:val="false"/>
+                <w:bCs w:val="false"/>
+                <w:sz w:val="19"/>
+                <w:szCs w:val="19"/>
+              </w:rPr>
+              <w:t xml:space="preserve">3 000 000 GNF</w:t>
+            </w:r>
+          </w:p>
+        </w:tc>
+        <w:tc>
+          <w:tcPr>
+            <w:tcW w:type="dxa" w:w="1200"/>
+            <w:tcBorders>
+              <w:top w:val="single" w:color="C9CFD8" w:sz="4"/>
+              <w:left w:val="single" w:color="C9CFD8" w:sz="4"/>
+              <w:bottom w:val="single" w:color="C9CFD8" w:sz="4"/>
+              <w:right w:val="single" w:color="C9CFD8" w:sz="4"/>
+            </w:tcBorders>
+            <w:tcMar>
+              <w:top w:type="dxa" w:w="60"/>
+              <w:left w:type="dxa" w:w="100"/>
+              <w:bottom w:type="dxa" w:w="60"/>
+              <w:right w:type="dxa" w:w="100"/>
+            </w:tcMar>
+            <w:vAlign w:val="center"/>
+          </w:tcPr>
+          <w:p>
+            <w:pPr>
+              <w:spacing w:after="0"/>
+            </w:pPr>
+            <w:r>
+              <w:rPr>
+                <w:rFonts w:ascii="Calibri" w:cs="Calibri" w:eastAsia="Calibri" w:hAnsi="Calibri"/>
+                <w:b w:val="false"/>
+                <w:bCs w:val="false"/>
+                <w:sz w:val="19"/>
+                <w:szCs w:val="19"/>
+              </w:rPr>
+              <w:t xml:space="preserve">6 %</w:t>
             </w:r>
           </w:p>
         </w:tc>
@@ -10928,7 +10206,7 @@
       <w:tr>
         <w:tc>
           <w:tcPr>
-            <w:tcW w:type="dxa" w:w="7238"/>
+            <w:tcW w:type="dxa" w:w="6238"/>
             <w:tcBorders>
               <w:top w:val="single" w:color="C9CFD8" w:sz="4"/>
               <w:left w:val="single" w:color="C9CFD8" w:sz="4"/>
@@ -10962,7 +10240,7 @@
         </w:tc>
         <w:tc>
           <w:tcPr>
-            <w:tcW w:type="dxa" w:w="2400"/>
+            <w:tcW w:type="dxa" w:w="2200"/>
             <w:tcBorders>
               <w:top w:val="single" w:color="C9CFD8" w:sz="4"/>
               <w:left w:val="single" w:color="C9CFD8" w:sz="4"/>
@@ -10991,6 +10269,40 @@
                 <w:szCs w:val="19"/>
               </w:rPr>
               <w:t xml:space="preserve">4 000 000 GNF</w:t>
+            </w:r>
+          </w:p>
+        </w:tc>
+        <w:tc>
+          <w:tcPr>
+            <w:tcW w:type="dxa" w:w="1200"/>
+            <w:tcBorders>
+              <w:top w:val="single" w:color="C9CFD8" w:sz="4"/>
+              <w:left w:val="single" w:color="C9CFD8" w:sz="4"/>
+              <w:bottom w:val="single" w:color="C9CFD8" w:sz="4"/>
+              <w:right w:val="single" w:color="C9CFD8" w:sz="4"/>
+            </w:tcBorders>
+            <w:shd w:fill="F2F4F7" w:color="auto" w:val="clear"/>
+            <w:tcMar>
+              <w:top w:type="dxa" w:w="60"/>
+              <w:left w:type="dxa" w:w="100"/>
+              <w:bottom w:type="dxa" w:w="60"/>
+              <w:right w:type="dxa" w:w="100"/>
+            </w:tcMar>
+            <w:vAlign w:val="center"/>
+          </w:tcPr>
+          <w:p>
+            <w:pPr>
+              <w:spacing w:after="0"/>
+            </w:pPr>
+            <w:r>
+              <w:rPr>
+                <w:rFonts w:ascii="Calibri" w:cs="Calibri" w:eastAsia="Calibri" w:hAnsi="Calibri"/>
+                <w:b w:val="false"/>
+                <w:bCs w:val="false"/>
+                <w:sz w:val="19"/>
+                <w:szCs w:val="19"/>
+              </w:rPr>
+              <w:t xml:space="preserve">8 %</w:t>
             </w:r>
           </w:p>
         </w:tc>
@@ -10998,7 +10310,7 @@
       <w:tr>
         <w:tc>
           <w:tcPr>
-            <w:tcW w:type="dxa" w:w="7238"/>
+            <w:tcW w:type="dxa" w:w="6238"/>
             <w:tcBorders>
               <w:top w:val="single" w:color="C9CFD8" w:sz="4"/>
               <w:left w:val="single" w:color="C9CFD8" w:sz="4"/>
@@ -11026,13 +10338,13 @@
                 <w:sz w:val="19"/>
                 <w:szCs w:val="19"/>
               </w:rPr>
-              <w:t xml:space="preserve">Valeur des prestations</w:t>
-            </w:r>
-          </w:p>
-        </w:tc>
-        <w:tc>
-          <w:tcPr>
-            <w:tcW w:type="dxa" w:w="2400"/>
+              <w:t xml:space="preserve">Total, hébergement de la première année compris</w:t>
+            </w:r>
+          </w:p>
+        </w:tc>
+        <w:tc>
+          <w:tcPr>
+            <w:tcW w:type="dxa" w:w="2200"/>
             <w:tcBorders>
               <w:top w:val="single" w:color="C9CFD8" w:sz="4"/>
               <w:left w:val="single" w:color="C9CFD8" w:sz="4"/>
@@ -11060,85 +10372,13 @@
                 <w:sz w:val="19"/>
                 <w:szCs w:val="19"/>
               </w:rPr>
-              <w:t xml:space="preserve">92 000 000 GNF</w:t>
-            </w:r>
-          </w:p>
-        </w:tc>
-      </w:tr>
-      <w:tr>
-        <w:tc>
-          <w:tcPr>
-            <w:tcW w:type="dxa" w:w="7238"/>
-            <w:tcBorders>
-              <w:top w:val="single" w:color="C9CFD8" w:sz="4"/>
-              <w:left w:val="single" w:color="C9CFD8" w:sz="4"/>
-              <w:bottom w:val="single" w:color="C9CFD8" w:sz="4"/>
-              <w:right w:val="single" w:color="C9CFD8" w:sz="4"/>
-            </w:tcBorders>
-            <w:shd w:fill="F2F4F7" w:color="auto" w:val="clear"/>
-            <w:tcMar>
-              <w:top w:type="dxa" w:w="60"/>
-              <w:left w:type="dxa" w:w="100"/>
-              <w:bottom w:type="dxa" w:w="60"/>
-              <w:right w:type="dxa" w:w="100"/>
-            </w:tcMar>
-            <w:vAlign w:val="center"/>
-          </w:tcPr>
-          <w:p>
-            <w:pPr>
-              <w:spacing w:after="0"/>
-            </w:pPr>
-            <w:r>
-              <w:rPr>
-                <w:rFonts w:ascii="Calibri" w:cs="Calibri" w:eastAsia="Calibri" w:hAnsi="Calibri"/>
-                <w:b w:val="false"/>
-                <w:bCs w:val="false"/>
-                <w:sz w:val="19"/>
-                <w:szCs w:val="19"/>
-              </w:rPr>
-              <w:t xml:space="preserve">Effort commercial consenti dans le cadre de la présente révision</w:t>
-            </w:r>
-          </w:p>
-        </w:tc>
-        <w:tc>
-          <w:tcPr>
-            <w:tcW w:type="dxa" w:w="2400"/>
-            <w:tcBorders>
-              <w:top w:val="single" w:color="C9CFD8" w:sz="4"/>
-              <w:left w:val="single" w:color="C9CFD8" w:sz="4"/>
-              <w:bottom w:val="single" w:color="C9CFD8" w:sz="4"/>
-              <w:right w:val="single" w:color="C9CFD8" w:sz="4"/>
-            </w:tcBorders>
-            <w:shd w:fill="F2F4F7" w:color="auto" w:val="clear"/>
-            <w:tcMar>
-              <w:top w:type="dxa" w:w="60"/>
-              <w:left w:type="dxa" w:w="100"/>
-              <w:bottom w:type="dxa" w:w="60"/>
-              <w:right w:type="dxa" w:w="100"/>
-            </w:tcMar>
-            <w:vAlign w:val="center"/>
-          </w:tcPr>
-          <w:p>
-            <w:pPr>
-              <w:spacing w:after="0"/>
-            </w:pPr>
-            <w:r>
-              <w:rPr>
-                <w:rFonts w:ascii="Calibri" w:cs="Calibri" w:eastAsia="Calibri" w:hAnsi="Calibri"/>
-                <w:b w:val="false"/>
-                <w:bCs w:val="false"/>
-                <w:sz w:val="19"/>
-                <w:szCs w:val="19"/>
-              </w:rPr>
-              <w:t xml:space="preserve">− 42 000 000 GNF</w:t>
-            </w:r>
-          </w:p>
-        </w:tc>
-      </w:tr>
-      <w:tr>
-        <w:tc>
-          <w:tcPr>
-            <w:tcW w:type="dxa" w:w="7238"/>
+              <w:t xml:space="preserve">50 000 000 GNF HT</w:t>
+            </w:r>
+          </w:p>
+        </w:tc>
+        <w:tc>
+          <w:tcPr>
+            <w:tcW w:type="dxa" w:w="1200"/>
             <w:tcBorders>
               <w:top w:val="single" w:color="C9CFD8" w:sz="4"/>
               <w:left w:val="single" w:color="C9CFD8" w:sz="4"/>
@@ -11166,41 +10406,7 @@
                 <w:sz w:val="19"/>
                 <w:szCs w:val="19"/>
               </w:rPr>
-              <w:t xml:space="preserve">Total proposition 1, hébergement de la première année compris</w:t>
-            </w:r>
-          </w:p>
-        </w:tc>
-        <w:tc>
-          <w:tcPr>
-            <w:tcW w:type="dxa" w:w="2400"/>
-            <w:tcBorders>
-              <w:top w:val="single" w:color="C9CFD8" w:sz="4"/>
-              <w:left w:val="single" w:color="C9CFD8" w:sz="4"/>
-              <w:bottom w:val="single" w:color="C9CFD8" w:sz="4"/>
-              <w:right w:val="single" w:color="C9CFD8" w:sz="4"/>
-            </w:tcBorders>
-            <w:shd w:fill="E6F4F4" w:color="auto" w:val="clear"/>
-            <w:tcMar>
-              <w:top w:type="dxa" w:w="60"/>
-              <w:left w:type="dxa" w:w="100"/>
-              <w:bottom w:type="dxa" w:w="60"/>
-              <w:right w:type="dxa" w:w="100"/>
-            </w:tcMar>
-            <w:vAlign w:val="center"/>
-          </w:tcPr>
-          <w:p>
-            <w:pPr>
-              <w:spacing w:after="0"/>
-            </w:pPr>
-            <w:r>
-              <w:rPr>
-                <w:rFonts w:ascii="Calibri" w:cs="Calibri" w:eastAsia="Calibri" w:hAnsi="Calibri"/>
-                <w:b/>
-                <w:bCs/>
-                <w:sz w:val="19"/>
-                <w:szCs w:val="19"/>
-              </w:rPr>
-              <w:t xml:space="preserve">50 000 000 GNF HT</w:t>
+              <w:t xml:space="preserve">100 %</w:t>
             </w:r>
           </w:p>
         </w:tc>
@@ -11225,7 +10431,7 @@
           <w:sz w:val="26"/>
           <w:szCs w:val="26"/>
         </w:rPr>
-        <w:t xml:space="preserve">8.3 Hébergement, maintenance et support à partir de la deuxième année</w:t>
+        <w:t xml:space="preserve">7.3 Hébergement, maintenance et support à partir de la deuxième année</w:t>
       </w:r>
     </w:p>
     <w:p>
@@ -11671,7 +10877,7 @@
                 <w:sz w:val="19"/>
                 <w:szCs w:val="19"/>
               </w:rPr>
-              <w:t xml:space="preserve">2 jours par mois d'évolutions incluses, cumulables sur le trimestre (6 jours par trimestre), selon les règles du chapitre 8.4</w:t>
+              <w:t xml:space="preserve">2 jours par mois d'évolutions incluses, cumulables sur le trimestre (6 jours par trimestre), selon les règles du chapitre 7.4</w:t>
             </w:r>
           </w:p>
         </w:tc>
@@ -12354,7 +11560,7 @@
           <w:sz w:val="26"/>
           <w:szCs w:val="26"/>
         </w:rPr>
-        <w:t xml:space="preserve">8.4 Qualification des évolutions : incluses ou facturables</w:t>
+        <w:t xml:space="preserve">7.4 Maintenance évolutive : évolutions incluses et facturables</w:t>
       </w:r>
     </w:p>
     <w:p>
@@ -12367,7 +11573,7 @@
           <w:sz w:val="22"/>
           <w:szCs w:val="22"/>
         </w:rPr>
-        <w:t xml:space="preserve">En réponse à votre point 7, une évolution est une demande de modification ou d'ajout qui ne corrige pas une anomalie. Les anomalies relèvent de la maintenance corrective et sont traitées sans limite. Une évolution est incluse dans le forfait annuel lorsqu'elle remplit les trois critères suivants :</w:t>
+        <w:t xml:space="preserve">Une évolution est une demande de modification ou d'ajout qui ne corrige pas une anomalie. Les anomalies relèvent de la maintenance corrective et sont traitées sans limite. Une évolution est incluse dans le forfait annuel lorsqu'elle remplit les trois critères suivants :</w:t>
       </w:r>
     </w:p>
     <w:p>
@@ -13052,7 +12258,7 @@
           <w:sz w:val="26"/>
           <w:szCs w:val="26"/>
         </w:rPr>
-        <w:t xml:space="preserve">8.5 Conditions de paiement</w:t>
+        <w:t xml:space="preserve">7.5 Conditions de paiement</w:t>
       </w:r>
     </w:p>
     <w:p>
@@ -13123,7 +12329,7 @@
           <w:sz w:val="26"/>
           <w:szCs w:val="26"/>
         </w:rPr>
-        <w:t xml:space="preserve">8.6 Engagements contractuels</w:t>
+        <w:t xml:space="preserve">7.6 Engagements contractuels</w:t>
       </w:r>
     </w:p>
     <w:p>
@@ -13141,7 +12347,7 @@
           <w:sz w:val="22"/>
           <w:szCs w:val="22"/>
         </w:rPr>
-        <w:t xml:space="preserve">Garantie corrective de 6 mois à compter du procès-verbal de mise en production, incluse dans le prix. Elle couvre la correction, sans frais et dans les délais d'intervention du chapitre 8.3, de toute anomalie de la plateforme par rapport au périmètre recetté, y compris les anomalies révélées lors de la clôture de l'exercice, de l'établissement des états financiers annuels et des déclarations fiscales de fin d'exercice. Elle ne couvre pas les évolutions de périmètre ni les erreurs de saisie, qui relèvent respectivement du chapitre 8.4 et du support.</w:t>
+        <w:t xml:space="preserve">Garantie corrective de 6 mois à compter du procès-verbal de mise en production, incluse dans le prix. Elle couvre la correction, sans frais et dans les délais d'intervention du chapitre 7.3, de toute anomalie de la plateforme par rapport au périmètre recetté, y compris les anomalies révélées lors de la clôture de l'exercice, de l'établissement des états financiers annuels et des déclarations fiscales de fin d'exercice. Elle ne couvre pas les évolutions de périmètre ni les erreurs de saisie, qui relèvent respectivement du chapitre 7.4 et du support.</w:t>
       </w:r>
     </w:p>
     <w:p>
@@ -13159,7 +12365,7 @@
           <w:sz w:val="22"/>
           <w:szCs w:val="22"/>
         </w:rPr>
-        <w:t xml:space="preserve">Pénalités de retard imputable à E-VOLUTION XP selon le chapitre 7.6 : 0,1 % du montant HT par jour calendaire, plafonnées à 5 %.</w:t>
+        <w:t xml:space="preserve">Pénalités de retard imputable à E-VOLUTION XP selon le chapitre 6.6 : 0,1 % du montant HT par jour calendaire, plafonnées à 5 %.</w:t>
       </w:r>
     </w:p>
     <w:p>
@@ -13195,7 +12401,7 @@
           <w:sz w:val="22"/>
           <w:szCs w:val="22"/>
         </w:rPr>
-        <w:t xml:space="preserve">Réversibilité complète sur demande, sans frais, dans les formats ouverts décrits au chapitre 6.4.</w:t>
+        <w:t xml:space="preserve">Réversibilité complète sur demande, sans frais, dans les formats ouverts décrits au chapitre 5.4.</w:t>
       </w:r>
     </w:p>
     <w:p>
@@ -13253,7 +12459,7 @@
           <w:sz w:val="32"/>
           <w:szCs w:val="32"/>
         </w:rPr>
-        <w:t xml:space="preserve">9. Annexes</w:t>
+        <w:t xml:space="preserve">8. Annexes</w:t>
       </w:r>
     </w:p>
     <w:p>
@@ -13270,7 +12476,7 @@
           <w:sz w:val="26"/>
           <w:szCs w:val="26"/>
         </w:rPr>
-        <w:t xml:space="preserve">9.1 Glossaire</w:t>
+        <w:t xml:space="preserve">8.1 Glossaire</w:t>
       </w:r>
     </w:p>
     <w:tbl>
@@ -13936,7 +13142,7 @@
           <w:sz w:val="26"/>
           <w:szCs w:val="26"/>
         </w:rPr>
-        <w:t xml:space="preserve">9.2 Signature</w:t>
+        <w:t xml:space="preserve">8.2 Signature</w:t>
       </w:r>
     </w:p>
     <w:p>
@@ -14027,7 +13233,7 @@
           <w:sz w:val="22"/>
           <w:szCs w:val="22"/>
         </w:rPr>
-        <w:t xml:space="preserve">Bon pour accord sur l'offre OTF-EGUITRA-2026-36-R1, Proposition 1, d'un montant de 50 000 000 GNF HT</w:t>
+        <w:t xml:space="preserve">Bon pour accord sur l'offre OTF-EGUITRA-2026-36-R1, d'un montant de 50 000 000 GNF HT</w:t>
       </w:r>
     </w:p>
     <w:p>

</xml_diff>

<commit_message>
Offre unique et complète sur la proposition 1, sans mention de révision
La proposition retrouve son identité « Proposition 1 » dans la synthèse,
le chapitre 3, la décomposition du montant et la signature. Référence
OTF-EGUITRA-2026-36 datée du 29 septembre 2026, qui annule et remplace
l'offre du 15 septembre. Courrier d'accompagnement simplifié.

Co-Authored-By: Claude Fable 5.1 <noreply@anthropic.com>
Claude-Session: https://claude.ai/code/session_015yYNiyH8hjzTq5nD22kCrg
</commit_message>
<xml_diff>
--- a/docs/offre/Offre_technique_financiere_EGUITRA.docx
+++ b/docs/offre/Offre_technique_financiere_EGUITRA.docx
@@ -140,7 +140,7 @@
           <w:sz w:val="20"/>
           <w:szCs w:val="20"/>
         </w:rPr>
-        <w:t xml:space="preserve">Référence OTF-EGUITRA-2026-36-R1</w:t>
+        <w:t xml:space="preserve">Référence OTF-EGUITRA-2026-36</w:t>
       </w:r>
     </w:p>
     <w:p>
@@ -154,7 +154,7 @@
           <w:sz w:val="20"/>
           <w:szCs w:val="20"/>
         </w:rPr>
-        <w:t xml:space="preserve">Révision 1 du 29 septembre 2026, offre valable 30 jours</w:t>
+        <w:t xml:space="preserve">29 septembre 2026, offre valable 30 jours</w:t>
       </w:r>
     </w:p>
     <w:p>
@@ -259,7 +259,7 @@
           <w:sz w:val="22"/>
           <w:szCs w:val="22"/>
         </w:rPr>
-        <w:t xml:space="preserve">EGUITRA GROUP SARLU et MB AxisPro Consulting partagent une direction générale, des locaux et deux projets de digitalisation : le département Finance d'une part, l'accompagnement des porteurs de projets d'autre part. E-VOLUTION XP propose une plateforme unique qui répond à ces deux projets : un noyau de gestion open source éprouvé, invisible pour les utilisateurs, et deux applications à votre image, EGUITRA Finance et AxisPro Suite, mises en production en 4 semaines sur un hébergement dédié au groupe.</w:t>
+        <w:t xml:space="preserve">EGUITRA GROUP SARLU et MB AxisPro Consulting partagent une direction générale, des locaux et deux projets de digitalisation : le département Finance d'une part, l'accompagnement des porteurs de projets d'autre part. E-VOLUTION XP propose une plateforme unique qui répond à ces deux projets : un noyau de gestion open source éprouvé, invisible pour les utilisateurs, et deux applications à votre image, EGUITRA Finance et AxisPro Suite, mises en production en 4 semaines sur un hébergement dédié au groupe. C'est la proposition 1 de notre offre du 15 septembre 2026, que la direction a retenue ; la présente offre la reprend seule et en précise les conditions.</w:t>
       </w:r>
     </w:p>
     <w:tbl>
@@ -348,7 +348,7 @@
                 <w:sz w:val="19"/>
                 <w:szCs w:val="19"/>
               </w:rPr>
-              <w:t xml:space="preserve">Offre</w:t>
+              <w:t xml:space="preserve">Proposition 1</w:t>
             </w:r>
           </w:p>
         </w:tc>
@@ -1904,7 +1904,7 @@
           <w:sz w:val="32"/>
           <w:szCs w:val="32"/>
         </w:rPr>
-        <w:t xml:space="preserve">3. La solution : plateforme intégrée sur noyau de gestion</w:t>
+        <w:t xml:space="preserve">3. Proposition 1 : plateforme intégrée sur noyau de gestion</w:t>
       </w:r>
     </w:p>
     <w:p>
@@ -9344,7 +9344,7 @@
           <w:sz w:val="26"/>
           <w:szCs w:val="26"/>
         </w:rPr>
-        <w:t xml:space="preserve">7.2 Décomposition du montant</w:t>
+        <w:t xml:space="preserve">7.2 Proposition 1 : Plateforme intégrée EGUITRA Finance et AxisPro Suite sur noyau de gestion</w:t>
       </w:r>
     </w:p>
     <w:p>
@@ -9357,7 +9357,7 @@
           <w:sz w:val="22"/>
           <w:szCs w:val="22"/>
         </w:rPr>
-        <w:t xml:space="preserve">Plateforme intégrée EGUITRA Finance et AxisPro Suite sur noyau de gestion. Prix forfaitaire, hébergement de la première année compris.</w:t>
+        <w:t xml:space="preserve">Prix forfaitaire, hébergement de la première année compris.</w:t>
       </w:r>
     </w:p>
     <w:tbl>
@@ -10338,7 +10338,7 @@
                 <w:sz w:val="19"/>
                 <w:szCs w:val="19"/>
               </w:rPr>
-              <w:t xml:space="preserve">Total, hébergement de la première année compris</w:t>
+              <w:t xml:space="preserve">Total proposition 1, hébergement de la première année compris</w:t>
             </w:r>
           </w:p>
         </w:tc>
@@ -12437,7 +12437,7 @@
           <w:sz w:val="22"/>
           <w:szCs w:val="22"/>
         </w:rPr>
-        <w:t xml:space="preserve">Validité de l'offre : 30 jours à compter du 29 septembre 2026, soit jusqu'au 29 octobre 2026. La présente révision remplace l'offre OTF-EGUITRA-2026-36 du 15 septembre 2026.</w:t>
+        <w:t xml:space="preserve">Validité de l'offre : 30 jours à compter du 29 septembre 2026, soit jusqu'au 29 octobre 2026. La présente offre annule et remplace notre offre du 15 septembre 2026.</w:t>
       </w:r>
     </w:p>
     <w:p>
@@ -13233,7 +13233,7 @@
           <w:sz w:val="22"/>
           <w:szCs w:val="22"/>
         </w:rPr>
-        <w:t xml:space="preserve">Bon pour accord sur l'offre OTF-EGUITRA-2026-36-R1, d'un montant de 50 000 000 GNF HT</w:t>
+        <w:t xml:space="preserve">Bon pour accord sur la proposition 1, offre OTF-EGUITRA-2026-36 du 29 septembre 2026, d'un montant de 50 000 000 GNF HT</w:t>
       </w:r>
     </w:p>
     <w:p>
@@ -13350,7 +13350,7 @@
         <w:sz w:val="16"/>
         <w:szCs w:val="16"/>
       </w:rPr>
-      <w:t xml:space="preserve">E-VOLUTION XP, Transformation Numérique. Réf. OTF-EGUITRA-2026-36-R1, confidentiel. Page </w:t>
+      <w:t xml:space="preserve">E-VOLUTION XP, Transformation Numérique. Réf. OTF-EGUITRA-2026-36, confidentiel. Page </w:t>
     </w:r>
     <w:r>
       <w:rPr>

</xml_diff>

<commit_message>
Ajoute l'offre révisée R1 en réponse aux observations du client
- Proposition 1 seule, montant révisé à 50 000 000 GNF HT, périmètre inchangé
- Validité unique de 30 jours, garantie corrective de 6 mois couvrant la
  première clôture annuelle, sauvegardes renforcées (archivage continu,
  perte maximale 15 minutes), clause de pénalités de retard, critères de
  la maintenance évolutive incluse ou facturable
- Chapitre de réponse point par point au courrier du client
- Coordonnées et signataire repris de la version envoyée
- Moteur de rendu extrait dans rendu.js, partagé par les deux versions
- Mail de réponse accompagnant l'offre révisée

Co-Authored-By: Claude Fable 5.1 <noreply@anthropic.com>
Claude-Session: https://claude.ai/code/session_0179U1EgeN6zS3U2LunpEbFp
</commit_message>
<xml_diff>
--- a/docs/offre/Offre_technique_financiere_EGUITRA.docx
+++ b/docs/offre/Offre_technique_financiere_EGUITRA.docx
@@ -760,7 +760,7 @@
                 <w:sz w:val="19"/>
                 <w:szCs w:val="19"/>
               </w:rPr>
-              <w:t xml:space="preserve">92 000 000 GNF HT</w:t>
+              <w:t xml:space="preserve">92 000 000 GNF HT</w:t>
             </w:r>
           </w:p>
         </w:tc>
@@ -794,7 +794,7 @@
                 <w:sz w:val="19"/>
                 <w:szCs w:val="19"/>
               </w:rPr>
-              <w:t xml:space="preserve">80 000 000 GNF HT</w:t>
+              <w:t xml:space="preserve">80 000 000 GNF HT</w:t>
             </w:r>
           </w:p>
         </w:tc>
@@ -862,7 +862,7 @@
                 <w:sz w:val="19"/>
                 <w:szCs w:val="19"/>
               </w:rPr>
-              <w:t xml:space="preserve">18 000 000 GNF HT par an</w:t>
+              <w:t xml:space="preserve">18 000 000 GNF HT par an</w:t>
             </w:r>
           </w:p>
         </w:tc>
@@ -895,7 +895,7 @@
                 <w:sz w:val="19"/>
                 <w:szCs w:val="19"/>
               </w:rPr>
-              <w:t xml:space="preserve">15 000 000 GNF HT par an</w:t>
+              <w:t xml:space="preserve">15 000 000 GNF HT par an</w:t>
             </w:r>
           </w:p>
         </w:tc>
@@ -1129,7 +1129,7 @@
           <w:sz w:val="21"/>
           <w:szCs w:val="21"/>
         </w:rPr>
-        <w:t xml:space="preserve">Notre recommandation est la proposition 1. Pour 12 000 000 GNF de plus, le groupe obtient un noyau comptable utilisé par des dizaines de milliers d'entreprises, le multi-sociétés, le rapprochement bancaire, les circuits d'approbation à plusieurs niveaux et une évolutivité sans nouveau développement. Les deux propositions sont détaillées et chiffrées ; le choix appartient à la direction.</w:t>
+        <w:t xml:space="preserve">Notre recommandation est la proposition 1. Pour 12 000 000 GNF de plus, le groupe obtient un noyau comptable utilisé par des dizaines de milliers d'entreprises, le multi-sociétés, le rapprochement bancaire, les circuits d'approbation à plusieurs niveaux et une évolutivité sans nouveau développement. Les deux propositions sont détaillées et chiffrées ; le choix appartient à la direction.</w:t>
       </w:r>
     </w:p>
     <w:p>
@@ -1848,7 +1848,7 @@
                 <w:sz w:val="19"/>
                 <w:szCs w:val="19"/>
               </w:rPr>
-              <w:t xml:space="preserve">Environ 20,6 milliards GNF, dont 70 % en transport d'hydrocarbures</w:t>
+              <w:t xml:space="preserve">Environ 20,6 milliards GNF, dont 70 % en transport d'hydrocarbures</w:t>
             </w:r>
           </w:p>
         </w:tc>
@@ -8594,7 +8594,7 @@
                 <w:sz w:val="19"/>
                 <w:szCs w:val="19"/>
               </w:rPr>
-              <w:t xml:space="preserve">92 000 000 GNF HT</w:t>
+              <w:t xml:space="preserve">92 000 000 GNF HT</w:t>
             </w:r>
           </w:p>
         </w:tc>
@@ -8627,7 +8627,7 @@
                 <w:sz w:val="19"/>
                 <w:szCs w:val="19"/>
               </w:rPr>
-              <w:t xml:space="preserve">80 000 000 GNF HT</w:t>
+              <w:t xml:space="preserve">80 000 000 GNF HT</w:t>
             </w:r>
           </w:p>
         </w:tc>
@@ -8697,7 +8697,7 @@
                 <w:sz w:val="19"/>
                 <w:szCs w:val="19"/>
               </w:rPr>
-              <w:t xml:space="preserve">18 000 000 GNF HT</w:t>
+              <w:t xml:space="preserve">18 000 000 GNF HT</w:t>
             </w:r>
           </w:p>
         </w:tc>
@@ -8731,7 +8731,7 @@
                 <w:sz w:val="19"/>
                 <w:szCs w:val="19"/>
               </w:rPr>
-              <w:t xml:space="preserve">15 000 000 GNF HT</w:t>
+              <w:t xml:space="preserve">15 000 000 GNF HT</w:t>
             </w:r>
           </w:p>
         </w:tc>
@@ -9384,7 +9384,7 @@
           <w:sz w:val="22"/>
           <w:szCs w:val="22"/>
         </w:rPr>
-        <w:t xml:space="preserve">Nous recommandons la proposition 1. L'écart de 12 000 000 GNF finance un noyau comptable dont la fiabilité n'a plus à être démontrée, et évite au groupe de payer, dans deux ans, le développement de fonctions que le noyau apporte déjà. La proposition 2 reste pertinente si la direction privilégie un outil minimal et un budget plus serré ; elle est présentée avec ses limites pour que la décision soit prise en connaissance de cause.</w:t>
+        <w:t xml:space="preserve">Nous recommandons la proposition 1. L'écart de 12 000 000 GNF finance un noyau comptable dont la fiabilité n'a plus à être démontrée, et évite au groupe de payer, dans deux ans, le développement de fonctions que le noyau apporte déjà. La proposition 2 reste pertinente si la direction privilégie un outil minimal et un budget plus serré ; elle est présentée avec ses limites pour que la décision soit prise en connaissance de cause.</w:t>
       </w:r>
     </w:p>
     <w:p>
@@ -12009,7 +12009,7 @@
                 <w:sz w:val="19"/>
                 <w:szCs w:val="19"/>
               </w:rPr>
-              <w:t xml:space="preserve">6 000 000 GNF</w:t>
+              <w:t xml:space="preserve">6 000 000 GNF</w:t>
             </w:r>
           </w:p>
         </w:tc>
@@ -12042,7 +12042,7 @@
                 <w:sz w:val="19"/>
                 <w:szCs w:val="19"/>
               </w:rPr>
-              <w:t xml:space="preserve">7 %</w:t>
+              <w:t xml:space="preserve">7 %</w:t>
             </w:r>
           </w:p>
         </w:tc>
@@ -12112,7 +12112,7 @@
                 <w:sz w:val="19"/>
                 <w:szCs w:val="19"/>
               </w:rPr>
-              <w:t xml:space="preserve">8 000 000 GNF</w:t>
+              <w:t xml:space="preserve">8 000 000 GNF</w:t>
             </w:r>
           </w:p>
         </w:tc>
@@ -12146,7 +12146,7 @@
                 <w:sz w:val="19"/>
                 <w:szCs w:val="19"/>
               </w:rPr>
-              <w:t xml:space="preserve">9 %</w:t>
+              <w:t xml:space="preserve">9 %</w:t>
             </w:r>
           </w:p>
         </w:tc>
@@ -12214,7 +12214,7 @@
                 <w:sz w:val="19"/>
                 <w:szCs w:val="19"/>
               </w:rPr>
-              <w:t xml:space="preserve">32 000 000 GNF</w:t>
+              <w:t xml:space="preserve">32 000 000 GNF</w:t>
             </w:r>
           </w:p>
         </w:tc>
@@ -12247,7 +12247,7 @@
                 <w:sz w:val="19"/>
                 <w:szCs w:val="19"/>
               </w:rPr>
-              <w:t xml:space="preserve">35 %</w:t>
+              <w:t xml:space="preserve">35 %</w:t>
             </w:r>
           </w:p>
         </w:tc>
@@ -12317,7 +12317,7 @@
                 <w:sz w:val="19"/>
                 <w:szCs w:val="19"/>
               </w:rPr>
-              <w:t xml:space="preserve">14 000 000 GNF</w:t>
+              <w:t xml:space="preserve">14 000 000 GNF</w:t>
             </w:r>
           </w:p>
         </w:tc>
@@ -12351,7 +12351,7 @@
                 <w:sz w:val="19"/>
                 <w:szCs w:val="19"/>
               </w:rPr>
-              <w:t xml:space="preserve">15 %</w:t>
+              <w:t xml:space="preserve">15 %</w:t>
             </w:r>
           </w:p>
         </w:tc>
@@ -12419,7 +12419,7 @@
                 <w:sz w:val="19"/>
                 <w:szCs w:val="19"/>
               </w:rPr>
-              <w:t xml:space="preserve">8 000 000 GNF</w:t>
+              <w:t xml:space="preserve">8 000 000 GNF</w:t>
             </w:r>
           </w:p>
         </w:tc>
@@ -12452,7 +12452,7 @@
                 <w:sz w:val="19"/>
                 <w:szCs w:val="19"/>
               </w:rPr>
-              <w:t xml:space="preserve">9 %</w:t>
+              <w:t xml:space="preserve">9 %</w:t>
             </w:r>
           </w:p>
         </w:tc>
@@ -12522,7 +12522,7 @@
                 <w:sz w:val="19"/>
                 <w:szCs w:val="19"/>
               </w:rPr>
-              <w:t xml:space="preserve">14 000 000 GNF</w:t>
+              <w:t xml:space="preserve">14 000 000 GNF</w:t>
             </w:r>
           </w:p>
         </w:tc>
@@ -12556,7 +12556,7 @@
                 <w:sz w:val="19"/>
                 <w:szCs w:val="19"/>
               </w:rPr>
-              <w:t xml:space="preserve">15 %</w:t>
+              <w:t xml:space="preserve">15 %</w:t>
             </w:r>
           </w:p>
         </w:tc>
@@ -12624,7 +12624,7 @@
                 <w:sz w:val="19"/>
                 <w:szCs w:val="19"/>
               </w:rPr>
-              <w:t xml:space="preserve">6 000 000 GNF</w:t>
+              <w:t xml:space="preserve">6 000 000 GNF</w:t>
             </w:r>
           </w:p>
         </w:tc>
@@ -12657,7 +12657,7 @@
                 <w:sz w:val="19"/>
                 <w:szCs w:val="19"/>
               </w:rPr>
-              <w:t xml:space="preserve">7 %</w:t>
+              <w:t xml:space="preserve">7 %</w:t>
             </w:r>
           </w:p>
         </w:tc>
@@ -12727,7 +12727,7 @@
                 <w:sz w:val="19"/>
                 <w:szCs w:val="19"/>
               </w:rPr>
-              <w:t xml:space="preserve">4 000 000 GNF</w:t>
+              <w:t xml:space="preserve">4 000 000 GNF</w:t>
             </w:r>
           </w:p>
         </w:tc>
@@ -12761,7 +12761,7 @@
                 <w:sz w:val="19"/>
                 <w:szCs w:val="19"/>
               </w:rPr>
-              <w:t xml:space="preserve">4 %</w:t>
+              <w:t xml:space="preserve">4 %</w:t>
             </w:r>
           </w:p>
         </w:tc>
@@ -12831,7 +12831,7 @@
                 <w:sz w:val="19"/>
                 <w:szCs w:val="19"/>
               </w:rPr>
-              <w:t xml:space="preserve">92 000 000 GNF</w:t>
+              <w:t xml:space="preserve">92 000 000 GNF</w:t>
             </w:r>
           </w:p>
         </w:tc>
@@ -12865,7 +12865,7 @@
                 <w:sz w:val="19"/>
                 <w:szCs w:val="19"/>
               </w:rPr>
-              <w:t xml:space="preserve">100 %</w:t>
+              <w:t xml:space="preserve">100 %</w:t>
             </w:r>
           </w:p>
         </w:tc>
@@ -13083,7 +13083,7 @@
                 <w:sz w:val="19"/>
                 <w:szCs w:val="19"/>
               </w:rPr>
-              <w:t xml:space="preserve">5 000 000 GNF</w:t>
+              <w:t xml:space="preserve">5 000 000 GNF</w:t>
             </w:r>
           </w:p>
         </w:tc>
@@ -13116,7 +13116,7 @@
                 <w:sz w:val="19"/>
                 <w:szCs w:val="19"/>
               </w:rPr>
-              <w:t xml:space="preserve">6 %</w:t>
+              <w:t xml:space="preserve">6 %</w:t>
             </w:r>
           </w:p>
         </w:tc>
@@ -13186,7 +13186,7 @@
                 <w:sz w:val="19"/>
                 <w:szCs w:val="19"/>
               </w:rPr>
-              <w:t xml:space="preserve">7 000 000 GNF</w:t>
+              <w:t xml:space="preserve">7 000 000 GNF</w:t>
             </w:r>
           </w:p>
         </w:tc>
@@ -13220,7 +13220,7 @@
                 <w:sz w:val="19"/>
                 <w:szCs w:val="19"/>
               </w:rPr>
-              <w:t xml:space="preserve">9 %</w:t>
+              <w:t xml:space="preserve">9 %</w:t>
             </w:r>
           </w:p>
         </w:tc>
@@ -13288,7 +13288,7 @@
                 <w:sz w:val="19"/>
                 <w:szCs w:val="19"/>
               </w:rPr>
-              <w:t xml:space="preserve">42 000 000 GNF</w:t>
+              <w:t xml:space="preserve">42 000 000 GNF</w:t>
             </w:r>
           </w:p>
         </w:tc>
@@ -13321,7 +13321,7 @@
                 <w:sz w:val="19"/>
                 <w:szCs w:val="19"/>
               </w:rPr>
-              <w:t xml:space="preserve">53 %</w:t>
+              <w:t xml:space="preserve">53 %</w:t>
             </w:r>
           </w:p>
         </w:tc>
@@ -13391,7 +13391,7 @@
                 <w:sz w:val="19"/>
                 <w:szCs w:val="19"/>
               </w:rPr>
-              <w:t xml:space="preserve">18 000 000 GNF</w:t>
+              <w:t xml:space="preserve">18 000 000 GNF</w:t>
             </w:r>
           </w:p>
         </w:tc>
@@ -13425,7 +13425,7 @@
                 <w:sz w:val="19"/>
                 <w:szCs w:val="19"/>
               </w:rPr>
-              <w:t xml:space="preserve">23 %</w:t>
+              <w:t xml:space="preserve">23 %</w:t>
             </w:r>
           </w:p>
         </w:tc>
@@ -13493,7 +13493,7 @@
                 <w:sz w:val="19"/>
                 <w:szCs w:val="19"/>
               </w:rPr>
-              <w:t xml:space="preserve">4 000 000 GNF</w:t>
+              <w:t xml:space="preserve">4 000 000 GNF</w:t>
             </w:r>
           </w:p>
         </w:tc>
@@ -13526,7 +13526,7 @@
                 <w:sz w:val="19"/>
                 <w:szCs w:val="19"/>
               </w:rPr>
-              <w:t xml:space="preserve">5 %</w:t>
+              <w:t xml:space="preserve">5 %</w:t>
             </w:r>
           </w:p>
         </w:tc>
@@ -13596,7 +13596,7 @@
                 <w:sz w:val="19"/>
                 <w:szCs w:val="19"/>
               </w:rPr>
-              <w:t xml:space="preserve">4 000 000 GNF</w:t>
+              <w:t xml:space="preserve">4 000 000 GNF</w:t>
             </w:r>
           </w:p>
         </w:tc>
@@ -13630,7 +13630,7 @@
                 <w:sz w:val="19"/>
                 <w:szCs w:val="19"/>
               </w:rPr>
-              <w:t xml:space="preserve">5 %</w:t>
+              <w:t xml:space="preserve">5 %</w:t>
             </w:r>
           </w:p>
         </w:tc>
@@ -13700,7 +13700,7 @@
                 <w:sz w:val="19"/>
                 <w:szCs w:val="19"/>
               </w:rPr>
-              <w:t xml:space="preserve">80 000 000 GNF</w:t>
+              <w:t xml:space="preserve">80 000 000 GNF</w:t>
             </w:r>
           </w:p>
         </w:tc>
@@ -13734,7 +13734,7 @@
                 <w:sz w:val="19"/>
                 <w:szCs w:val="19"/>
               </w:rPr>
-              <w:t xml:space="preserve">100 %</w:t>
+              <w:t xml:space="preserve">100 %</w:t>
             </w:r>
           </w:p>
         </w:tc>
@@ -14275,7 +14275,7 @@
                 <w:sz w:val="19"/>
                 <w:szCs w:val="19"/>
               </w:rPr>
-              <w:t xml:space="preserve">18 000 000 GNF HT, facturé par semestre d'avance</w:t>
+              <w:t xml:space="preserve">18 000 000 GNF HT, facturé par semestre d'avance</w:t>
             </w:r>
           </w:p>
         </w:tc>
@@ -14345,7 +14345,7 @@
                 <w:sz w:val="19"/>
                 <w:szCs w:val="19"/>
               </w:rPr>
-              <w:t xml:space="preserve">15 000 000 GNF HT, facturé par semestre d'avance</w:t>
+              <w:t xml:space="preserve">15 000 000 GNF HT, facturé par semestre d'avance</w:t>
             </w:r>
           </w:p>
         </w:tc>
@@ -15153,7 +15153,7 @@
                 <w:sz w:val="19"/>
                 <w:szCs w:val="19"/>
               </w:rPr>
-              <w:t xml:space="preserve">92 000 000 GNF HT</w:t>
+              <w:t xml:space="preserve">92 000 000 GNF HT</w:t>
             </w:r>
           </w:p>
         </w:tc>
@@ -15187,7 +15187,7 @@
                 <w:sz w:val="19"/>
                 <w:szCs w:val="19"/>
               </w:rPr>
-              <w:t xml:space="preserve">80 000 000 GNF HT</w:t>
+              <w:t xml:space="preserve">80 000 000 GNF HT</w:t>
             </w:r>
           </w:p>
         </w:tc>
@@ -15257,7 +15257,7 @@
                 <w:sz w:val="19"/>
                 <w:szCs w:val="19"/>
               </w:rPr>
-              <w:t xml:space="preserve">18 000 000 GNF HT</w:t>
+              <w:t xml:space="preserve">18 000 000 GNF HT</w:t>
             </w:r>
           </w:p>
         </w:tc>
@@ -15291,7 +15291,7 @@
                 <w:sz w:val="19"/>
                 <w:szCs w:val="19"/>
               </w:rPr>
-              <w:t xml:space="preserve">15 000 000 GNF HT</w:t>
+              <w:t xml:space="preserve">15 000 000 GNF HT</w:t>
             </w:r>
           </w:p>
         </w:tc>
@@ -15359,7 +15359,7 @@
                 <w:sz w:val="19"/>
                 <w:szCs w:val="19"/>
               </w:rPr>
-              <w:t xml:space="preserve">128 000 000 GNF HT</w:t>
+              <w:t xml:space="preserve">128 000 000 GNF HT</w:t>
             </w:r>
           </w:p>
         </w:tc>
@@ -15392,7 +15392,7 @@
                 <w:sz w:val="19"/>
                 <w:szCs w:val="19"/>
               </w:rPr>
-              <w:t xml:space="preserve">110 000 000 GNF HT</w:t>
+              <w:t xml:space="preserve">110 000 000 GNF HT</w:t>
             </w:r>
           </w:p>
         </w:tc>

</xml_diff>